<commit_message>
Empresa, vuelta 1 (Viscofan): recomendación y correcciones del análisis real
- Recomendación Comprar/Mantener/Vender con regla (rentabilidad total a 12 m
  y asimetría), niveles de compra y venta, convicción y qué la cambiaría.
- DCF inverso con búsqueda por tramos y control si no tiene solución.
- Crecimiento NTM anualizado (LTM con fecha de cierre) y control de R² en la
  regresión múltiplo-crecimiento.
- Cuentas por naturaleza, gastos financieros, dividendos extraordinarios,
  intereses en financiación, múltiplos históricos con precios de cierre.
- Gobierno más exigente (11 criterios; sin dato no puntúa).
- Tablas: «–» en celdas vacías y columnas vacías eliminadas; sin títulos
  huérfanos. Prompt: nunca cifras de resúmenes de buscador.
- Primer análisis real: informes/viscofan-2026-10-06.

Co-Authored-By: Claude Opus 5.5 <noreply@anthropic.com>
</commit_message>
<xml_diff>
--- a/verticales/empresa/plantilla.docx
+++ b/verticales/empresa/plantilla.docx
@@ -159,7 +159,7 @@
                 <w:sz w:val="15"/>
                 <w:szCs w:val="15"/>
               </w:rPr>
-              <w:t xml:space="preserve">Conclusión</w:t>
+              <w:t xml:space="preserve">Recomendación</w:t>
             </w:r>
           </w:p>
           <w:p>
@@ -175,7 +175,7 @@
                 <w:sz w:val="26"/>
                 <w:szCs w:val="26"/>
               </w:rPr>
-              <w:t xml:space="preserve">{{resumen.conclusion}}</w:t>
+              <w:t xml:space="preserve">{{calc.recomendacion.recomendacion}}</w:t>
             </w:r>
           </w:p>
         </w:tc>
@@ -303,7 +303,7 @@
                 <w:sz w:val="15"/>
                 <w:szCs w:val="15"/>
               </w:rPr>
-              <w:t xml:space="preserve">Potencial</w:t>
+              <w:t xml:space="preserve">Rentabilidad total 12 m</w:t>
             </w:r>
           </w:p>
           <w:p>
@@ -319,7 +319,7 @@
                 <w:sz w:val="26"/>
                 <w:szCs w:val="26"/>
               </w:rPr>
-              <w:t xml:space="preserve">{{calc.sintesis.potencial_pct|+pct}}</w:t>
+              <w:t xml:space="preserve">{{calc.recomendacion.rentabilidad_total_pct|+pct}}</w:t>
             </w:r>
           </w:p>
         </w:tc>
@@ -356,7 +356,7 @@
                 <w:sz w:val="15"/>
                 <w:szCs w:val="15"/>
               </w:rPr>
-              <w:t xml:space="preserve">Capitalización</w:t>
+              <w:t xml:space="preserve">Convicción</w:t>
             </w:r>
           </w:p>
           <w:p>
@@ -372,7 +372,7 @@
                 <w:sz w:val="26"/>
                 <w:szCs w:val="26"/>
               </w:rPr>
-              <w:t xml:space="preserve">{{calc.mercado.capitalizacion|0}} M</w:t>
+              <w:t xml:space="preserve">{{resumen.conviccion}}</w:t>
             </w:r>
           </w:p>
         </w:tc>
@@ -404,7 +404,7 @@
                 <w:sz w:val="15"/>
                 <w:szCs w:val="15"/>
               </w:rPr>
-              <w:t xml:space="preserve">EV/EBITDA próx. 12 m</w:t>
+              <w:t xml:space="preserve">Capitalización</w:t>
             </w:r>
           </w:p>
           <w:p>
@@ -420,7 +420,7 @@
                 <w:sz w:val="26"/>
                 <w:szCs w:val="26"/>
               </w:rPr>
-              <w:t xml:space="preserve">{{calc.clave.ev_ebitda_ntm|x}}</w:t>
+              <w:t xml:space="preserve">{{calc.mercado.capitalizacion|0}} M</w:t>
             </w:r>
           </w:p>
         </w:tc>
@@ -452,7 +452,7 @@
                 <w:sz w:val="15"/>
                 <w:szCs w:val="15"/>
               </w:rPr>
-              <w:t xml:space="preserve">PER próx. 12 m</w:t>
+              <w:t xml:space="preserve">EV/EBITDA próx. 12 m</w:t>
             </w:r>
           </w:p>
           <w:p>
@@ -468,7 +468,7 @@
                 <w:sz w:val="26"/>
                 <w:szCs w:val="26"/>
               </w:rPr>
-              <w:t xml:space="preserve">{{calc.clave.per_ntm|x}}</w:t>
+              <w:t xml:space="preserve">{{calc.clave.ev_ebitda_ntm|x}}</w:t>
             </w:r>
           </w:p>
         </w:tc>
@@ -1879,30 +1879,425 @@
           <w:b/>
           <w:bCs/>
         </w:rPr>
-        <w:t xml:space="preserve">Conclusión:</w:t>
-      </w:r>
-      <w:r>
-        <w:t xml:space="preserve"> {{resumen.conclusion}} · </w:t>
+        <w:t xml:space="preserve">Recomendación: {{calc.recomendacion.recomendacion}}</w:t>
+      </w:r>
+      <w:r>
+        <w:t xml:space="preserve"> · Convicción: {{resumen.conviccion}} · Horizonte: {{resumen.horizonte}} · Valor objetivo: </w:t>
       </w:r>
       <w:r>
         <w:rPr>
           <w:b/>
           <w:bCs/>
         </w:rPr>
-        <w:t xml:space="preserve">Horizonte:</w:t>
-      </w:r>
-      <w:r>
-        <w:t xml:space="preserve"> {{resumen.horizonte}} · </w:t>
-      </w:r>
+        <w:t xml:space="preserve">{{calc.sintesis.valor_objetivo|2}} {{meta.divisa}}</w:t>
+      </w:r>
+      <w:r>
+        <w:t xml:space="preserve"> ({{calc.sintesis.potencial_pct|+pct}} sobre {{identificacion.precio|2}}; rentabilidad total esperada {{calc.recomendacion.rentabilidad_total_pct|+pct}})</w:t>
+      </w:r>
+    </w:p>
+    <w:p>
+      <w:pPr>
+        <w:spacing w:after="100"/>
+      </w:pPr>
+      <w:r>
+        <w:t xml:space="preserve">{{texto:resumen.tesis}}</w:t>
+      </w:r>
+    </w:p>
+    <w:p>
+      <w:pPr>
+        <w:spacing w:after="0" w:before="0"/>
+      </w:pPr>
+      <w:r>
+        <w:rPr>
+          <w:color w:val="8A8984"/>
+          <w:sz w:val="2"/>
+          <w:szCs w:val="2"/>
+        </w:rPr>
+        <w:t xml:space="preserve">{{si:calc.recomendacion.tabla}}</w:t>
+      </w:r>
+    </w:p>
+    <w:p>
+      <w:pPr>
+        <w:pStyle w:val="Heading2"/>
+      </w:pPr>
+      <w:r>
+        <w:t xml:space="preserve">La decisión</w:t>
+      </w:r>
+    </w:p>
+    <w:tbl>
+      <w:tblPr>
+        <w:tblW w:type="dxa" w:w="9638"/>
+        <w:tblBorders>
+          <w:top w:val="single" w:color="auto" w:sz="4"/>
+          <w:left w:val="single" w:color="auto" w:sz="4"/>
+          <w:bottom w:val="single" w:color="auto" w:sz="4"/>
+          <w:right w:val="single" w:color="auto" w:sz="4"/>
+          <w:insideH w:val="single" w:color="auto" w:sz="4"/>
+          <w:insideV w:val="single" w:color="auto" w:sz="4"/>
+        </w:tblBorders>
+      </w:tblPr>
+      <w:tblGrid>
+        <w:gridCol w:w="6425"/>
+        <w:gridCol w:w="3213"/>
+      </w:tblGrid>
+      <w:tr>
+        <w:trPr>
+          <w:cantSplit/>
+          <w:tblHeader/>
+        </w:trPr>
+        <w:tc>
+          <w:tcPr>
+            <w:tcW w:type="dxa" w:w="6425"/>
+            <w:tcBorders>
+              <w:top w:val="none" w:color="FFFFFF" w:sz="0"/>
+              <w:left w:val="none" w:color="FFFFFF" w:sz="0"/>
+              <w:bottom w:val="none" w:color="FFFFFF" w:sz="0"/>
+              <w:right w:val="none" w:color="FFFFFF" w:sz="0"/>
+            </w:tcBorders>
+            <w:shd w:fill="1F3A5F" w:color="auto" w:val="clear"/>
+            <w:tcMar>
+              <w:top w:type="dxa" w:w="50"/>
+              <w:left w:type="dxa" w:w="80"/>
+              <w:bottom w:type="dxa" w:w="50"/>
+              <w:right w:type="dxa" w:w="80"/>
+            </w:tcMar>
+          </w:tcPr>
+          <w:p>
+            <w:pPr>
+              <w:spacing w:after="0" w:before="0"/>
+              <w:jc w:val="left"/>
+            </w:pPr>
+            <w:r>
+              <w:rPr>
+                <w:rFonts w:ascii="Calibri" w:cs="Calibri" w:eastAsia="Calibri" w:hAnsi="Calibri"/>
+                <w:b/>
+                <w:bCs/>
+                <w:color w:val="FFFFFF"/>
+                <w:sz w:val="16"/>
+                <w:szCs w:val="16"/>
+              </w:rPr>
+              <w:t xml:space="preserve">Elemento de la decisión</w:t>
+            </w:r>
+          </w:p>
+        </w:tc>
+        <w:tc>
+          <w:tcPr>
+            <w:tcW w:type="dxa" w:w="3213"/>
+            <w:tcBorders>
+              <w:top w:val="none" w:color="FFFFFF" w:sz="0"/>
+              <w:left w:val="none" w:color="FFFFFF" w:sz="0"/>
+              <w:bottom w:val="none" w:color="FFFFFF" w:sz="0"/>
+              <w:right w:val="none" w:color="FFFFFF" w:sz="0"/>
+            </w:tcBorders>
+            <w:shd w:fill="1F3A5F" w:color="auto" w:val="clear"/>
+            <w:tcMar>
+              <w:top w:type="dxa" w:w="50"/>
+              <w:left w:type="dxa" w:w="80"/>
+              <w:bottom w:type="dxa" w:w="50"/>
+              <w:right w:type="dxa" w:w="80"/>
+            </w:tcMar>
+          </w:tcPr>
+          <w:p>
+            <w:pPr>
+              <w:spacing w:after="0" w:before="0"/>
+              <w:jc w:val="right"/>
+            </w:pPr>
+            <w:r>
+              <w:rPr>
+                <w:rFonts w:ascii="Calibri" w:cs="Calibri" w:eastAsia="Calibri" w:hAnsi="Calibri"/>
+                <w:b/>
+                <w:bCs/>
+                <w:color w:val="FFFFFF"/>
+                <w:sz w:val="16"/>
+                <w:szCs w:val="16"/>
+              </w:rPr>
+              <w:t xml:space="preserve">Valor</w:t>
+            </w:r>
+          </w:p>
+        </w:tc>
+      </w:tr>
+      <w:tr>
+        <w:trPr>
+          <w:cantSplit/>
+        </w:trPr>
+        <w:tc>
+          <w:tcPr>
+            <w:tcW w:type="dxa" w:w="6425"/>
+            <w:tcBorders>
+              <w:top w:val="none" w:color="FFFFFF" w:sz="0"/>
+              <w:left w:val="none" w:color="FFFFFF" w:sz="0"/>
+              <w:bottom w:val="single" w:color="D9D8D3" w:sz="4"/>
+              <w:right w:val="none" w:color="FFFFFF" w:sz="0"/>
+            </w:tcBorders>
+            <w:tcMar>
+              <w:top w:type="dxa" w:w="50"/>
+              <w:left w:type="dxa" w:w="80"/>
+              <w:bottom w:type="dxa" w:w="50"/>
+              <w:right w:type="dxa" w:w="80"/>
+            </w:tcMar>
+          </w:tcPr>
+          <w:p>
+            <w:pPr>
+              <w:spacing w:after="0" w:before="0"/>
+              <w:jc w:val="left"/>
+            </w:pPr>
+            <w:r>
+              <w:rPr>
+                <w:rFonts w:ascii="Calibri" w:cs="Calibri" w:eastAsia="Calibri" w:hAnsi="Calibri"/>
+                <w:b/>
+                <w:bCs/>
+                <w:color w:val="1F2A3C"/>
+                <w:sz w:val="16"/>
+                <w:szCs w:val="16"/>
+              </w:rPr>
+              <w:t xml:space="preserve">{{calc.recomendacion.tabla[].concepto}}</w:t>
+            </w:r>
+          </w:p>
+        </w:tc>
+        <w:tc>
+          <w:tcPr>
+            <w:tcW w:type="dxa" w:w="3213"/>
+            <w:tcBorders>
+              <w:top w:val="none" w:color="FFFFFF" w:sz="0"/>
+              <w:left w:val="none" w:color="FFFFFF" w:sz="0"/>
+              <w:bottom w:val="single" w:color="D9D8D3" w:sz="4"/>
+              <w:right w:val="none" w:color="FFFFFF" w:sz="0"/>
+            </w:tcBorders>
+            <w:tcMar>
+              <w:top w:type="dxa" w:w="50"/>
+              <w:left w:type="dxa" w:w="80"/>
+              <w:bottom w:type="dxa" w:w="50"/>
+              <w:right w:type="dxa" w:w="80"/>
+            </w:tcMar>
+          </w:tcPr>
+          <w:p>
+            <w:pPr>
+              <w:spacing w:after="0" w:before="0"/>
+              <w:jc w:val="right"/>
+            </w:pPr>
+            <w:r>
+              <w:rPr>
+                <w:rFonts w:ascii="Calibri" w:cs="Calibri" w:eastAsia="Calibri" w:hAnsi="Calibri"/>
+                <w:b w:val="false"/>
+                <w:bCs w:val="false"/>
+                <w:color w:val="1F2A3C"/>
+                <w:sz w:val="16"/>
+                <w:szCs w:val="16"/>
+              </w:rPr>
+              <w:t xml:space="preserve">{{calc.recomendacion.tabla[].valor}}</w:t>
+            </w:r>
+          </w:p>
+        </w:tc>
+      </w:tr>
+    </w:tbl>
+    <w:p>
+      <w:pPr>
+        <w:spacing w:after="160" w:before="0"/>
+      </w:pPr>
+    </w:p>
+    <w:p>
+      <w:pPr>
+        <w:pStyle w:val="Nota"/>
+        <w:spacing w:after="100"/>
+      </w:pPr>
+      <w:r>
+        <w:t xml:space="preserve">Regla: Comprar si la rentabilidad total esperada a 12 meses es ≥ 15 % y el alcista gana al menos lo que pierde el bajista; Vender si es ≤ −10 %, o negativa con asimetría &lt; 0,5; Mantener en el resto.</w:t>
+      </w:r>
+    </w:p>
+    <w:tbl>
+      <w:tblPr>
+        <w:tblW w:type="dxa" w:w="9638"/>
+        <w:tblBorders>
+          <w:top w:val="single" w:color="auto" w:sz="4"/>
+          <w:left w:val="single" w:color="auto" w:sz="4"/>
+          <w:bottom w:val="single" w:color="auto" w:sz="4"/>
+          <w:right w:val="single" w:color="auto" w:sz="4"/>
+          <w:insideH w:val="single" w:color="auto" w:sz="4"/>
+          <w:insideV w:val="single" w:color="auto" w:sz="4"/>
+        </w:tblBorders>
+      </w:tblPr>
+      <w:tblGrid>
+        <w:gridCol w:w="1606"/>
+        <w:gridCol w:w="8032"/>
+      </w:tblGrid>
+      <w:tr>
+        <w:trPr>
+          <w:cantSplit/>
+          <w:tblHeader/>
+        </w:trPr>
+        <w:tc>
+          <w:tcPr>
+            <w:tcW w:type="dxa" w:w="1606"/>
+            <w:tcBorders>
+              <w:top w:val="none" w:color="FFFFFF" w:sz="0"/>
+              <w:left w:val="none" w:color="FFFFFF" w:sz="0"/>
+              <w:bottom w:val="none" w:color="FFFFFF" w:sz="0"/>
+              <w:right w:val="none" w:color="FFFFFF" w:sz="0"/>
+            </w:tcBorders>
+            <w:shd w:fill="1F3A5F" w:color="auto" w:val="clear"/>
+            <w:tcMar>
+              <w:top w:type="dxa" w:w="50"/>
+              <w:left w:type="dxa" w:w="80"/>
+              <w:bottom w:type="dxa" w:w="50"/>
+              <w:right w:type="dxa" w:w="80"/>
+            </w:tcMar>
+          </w:tcPr>
+          <w:p>
+            <w:pPr>
+              <w:spacing w:after="0" w:before="0"/>
+              <w:jc w:val="left"/>
+            </w:pPr>
+            <w:r>
+              <w:rPr>
+                <w:rFonts w:ascii="Calibri" w:cs="Calibri" w:eastAsia="Calibri" w:hAnsi="Calibri"/>
+                <w:b/>
+                <w:bCs/>
+                <w:color w:val="FFFFFF"/>
+                <w:sz w:val="16"/>
+                <w:szCs w:val="16"/>
+              </w:rPr>
+              <w:t xml:space="preserve">Acción</w:t>
+            </w:r>
+          </w:p>
+        </w:tc>
+        <w:tc>
+          <w:tcPr>
+            <w:tcW w:type="dxa" w:w="8032"/>
+            <w:tcBorders>
+              <w:top w:val="none" w:color="FFFFFF" w:sz="0"/>
+              <w:left w:val="none" w:color="FFFFFF" w:sz="0"/>
+              <w:bottom w:val="none" w:color="FFFFFF" w:sz="0"/>
+              <w:right w:val="none" w:color="FFFFFF" w:sz="0"/>
+            </w:tcBorders>
+            <w:shd w:fill="1F3A5F" w:color="auto" w:val="clear"/>
+            <w:tcMar>
+              <w:top w:type="dxa" w:w="50"/>
+              <w:left w:type="dxa" w:w="80"/>
+              <w:bottom w:type="dxa" w:w="50"/>
+              <w:right w:type="dxa" w:w="80"/>
+            </w:tcMar>
+          </w:tcPr>
+          <w:p>
+            <w:pPr>
+              <w:spacing w:after="0" w:before="0"/>
+              <w:jc w:val="left"/>
+            </w:pPr>
+            <w:r>
+              <w:rPr>
+                <w:rFonts w:ascii="Calibri" w:cs="Calibri" w:eastAsia="Calibri" w:hAnsi="Calibri"/>
+                <w:b/>
+                <w:bCs/>
+                <w:color w:val="FFFFFF"/>
+                <w:sz w:val="16"/>
+                <w:szCs w:val="16"/>
+              </w:rPr>
+              <w:t xml:space="preserve">A qué precio</w:t>
+            </w:r>
+          </w:p>
+        </w:tc>
+      </w:tr>
+      <w:tr>
+        <w:trPr>
+          <w:cantSplit/>
+        </w:trPr>
+        <w:tc>
+          <w:tcPr>
+            <w:tcW w:type="dxa" w:w="1606"/>
+            <w:tcBorders>
+              <w:top w:val="none" w:color="FFFFFF" w:sz="0"/>
+              <w:left w:val="none" w:color="FFFFFF" w:sz="0"/>
+              <w:bottom w:val="single" w:color="D9D8D3" w:sz="4"/>
+              <w:right w:val="none" w:color="FFFFFF" w:sz="0"/>
+            </w:tcBorders>
+            <w:tcMar>
+              <w:top w:type="dxa" w:w="50"/>
+              <w:left w:type="dxa" w:w="80"/>
+              <w:bottom w:type="dxa" w:w="50"/>
+              <w:right w:type="dxa" w:w="80"/>
+            </w:tcMar>
+          </w:tcPr>
+          <w:p>
+            <w:pPr>
+              <w:spacing w:after="0" w:before="0"/>
+              <w:jc w:val="left"/>
+            </w:pPr>
+            <w:r>
+              <w:rPr>
+                <w:rFonts w:ascii="Calibri" w:cs="Calibri" w:eastAsia="Calibri" w:hAnsi="Calibri"/>
+                <w:b/>
+                <w:bCs/>
+                <w:color w:val="1F2A3C"/>
+                <w:sz w:val="16"/>
+                <w:szCs w:val="16"/>
+              </w:rPr>
+              <w:t xml:space="preserve">{{calc.recomendacion.niveles[].accion}}</w:t>
+            </w:r>
+          </w:p>
+        </w:tc>
+        <w:tc>
+          <w:tcPr>
+            <w:tcW w:type="dxa" w:w="8032"/>
+            <w:tcBorders>
+              <w:top w:val="none" w:color="FFFFFF" w:sz="0"/>
+              <w:left w:val="none" w:color="FFFFFF" w:sz="0"/>
+              <w:bottom w:val="single" w:color="D9D8D3" w:sz="4"/>
+              <w:right w:val="none" w:color="FFFFFF" w:sz="0"/>
+            </w:tcBorders>
+            <w:tcMar>
+              <w:top w:type="dxa" w:w="50"/>
+              <w:left w:type="dxa" w:w="80"/>
+              <w:bottom w:type="dxa" w:w="50"/>
+              <w:right w:type="dxa" w:w="80"/>
+            </w:tcMar>
+          </w:tcPr>
+          <w:p>
+            <w:pPr>
+              <w:spacing w:after="0" w:before="0"/>
+              <w:jc w:val="left"/>
+            </w:pPr>
+            <w:r>
+              <w:rPr>
+                <w:rFonts w:ascii="Calibri" w:cs="Calibri" w:eastAsia="Calibri" w:hAnsi="Calibri"/>
+                <w:b w:val="false"/>
+                <w:bCs w:val="false"/>
+                <w:color w:val="1F2A3C"/>
+                <w:sz w:val="16"/>
+                <w:szCs w:val="16"/>
+              </w:rPr>
+              <w:t xml:space="preserve">{{calc.recomendacion.niveles[].condicion}}</w:t>
+            </w:r>
+          </w:p>
+        </w:tc>
+      </w:tr>
+    </w:tbl>
+    <w:p>
+      <w:pPr>
+        <w:spacing w:after="160" w:before="0"/>
+      </w:pPr>
+    </w:p>
+    <w:p>
+      <w:pPr>
+        <w:spacing w:after="0" w:before="0"/>
+      </w:pPr>
+      <w:r>
+        <w:rPr>
+          <w:color w:val="8A8984"/>
+          <w:sz w:val="2"/>
+          <w:szCs w:val="2"/>
+        </w:rPr>
+        <w:t xml:space="preserve">{{si:resumen.justificacion_recomendacion}}</w:t>
+      </w:r>
+    </w:p>
+    <w:p>
+      <w:pPr>
+        <w:spacing w:after="100"/>
+      </w:pPr>
       <w:r>
         <w:rPr>
           <w:b/>
           <w:bCs/>
         </w:rPr>
-        <w:t xml:space="preserve">Valor objetivo:</w:t>
-      </w:r>
-      <w:r>
-        <w:t xml:space="preserve"> {{calc.sintesis.valor_objetivo|2}} {{meta.divisa}} ({{calc.sintesis.potencial_pct|+pct}} sobre {{identificacion.precio|2}})</w:t>
+        <w:t xml:space="preserve">Por qué la recomendación se aparta de la regla.</w:t>
       </w:r>
     </w:p>
     <w:p>
@@ -1910,7 +2305,80 @@
         <w:spacing w:after="100"/>
       </w:pPr>
       <w:r>
-        <w:t xml:space="preserve">{{texto:resumen.tesis}}</w:t>
+        <w:t xml:space="preserve">{{texto:resumen.justificacion_recomendacion}}</w:t>
+      </w:r>
+    </w:p>
+    <w:p>
+      <w:pPr>
+        <w:spacing w:after="0" w:before="0"/>
+      </w:pPr>
+      <w:r>
+        <w:rPr>
+          <w:color w:val="8A8984"/>
+          <w:sz w:val="2"/>
+          <w:szCs w:val="2"/>
+        </w:rPr>
+        <w:t xml:space="preserve">{{fin:resumen.justificacion_recomendacion}}</w:t>
+      </w:r>
+    </w:p>
+    <w:p>
+      <w:pPr>
+        <w:spacing w:after="0" w:before="0"/>
+      </w:pPr>
+      <w:r>
+        <w:rPr>
+          <w:color w:val="8A8984"/>
+          <w:sz w:val="2"/>
+          <w:szCs w:val="2"/>
+        </w:rPr>
+        <w:t xml:space="preserve">{{fin:calc.recomendacion.tabla}}</w:t>
+      </w:r>
+    </w:p>
+    <w:p>
+      <w:pPr>
+        <w:spacing w:after="0" w:before="0"/>
+      </w:pPr>
+      <w:r>
+        <w:rPr>
+          <w:color w:val="8A8984"/>
+          <w:sz w:val="2"/>
+          <w:szCs w:val="2"/>
+        </w:rPr>
+        <w:t xml:space="preserve">{{si:resumen.cambiaria_recomendacion}}</w:t>
+      </w:r>
+    </w:p>
+    <w:p>
+      <w:pPr>
+        <w:pStyle w:val="Heading2"/>
+      </w:pPr>
+      <w:r>
+        <w:t xml:space="preserve">Qué cambiaría la recomendación</w:t>
+      </w:r>
+    </w:p>
+    <w:p>
+      <w:pPr>
+        <w:pStyle w:val="ListParagraph"/>
+        <w:numPr>
+          <w:ilvl w:val="0"/>
+          <w:numId w:val="2"/>
+        </w:numPr>
+        <w:spacing w:after="60"/>
+      </w:pPr>
+      <w:r>
+        <w:t xml:space="preserve">{{lista:resumen.cambiaria_recomendacion}}</w:t>
+      </w:r>
+    </w:p>
+    <w:p>
+      <w:pPr>
+        <w:spacing w:after="0" w:before="0"/>
+      </w:pPr>
+      <w:r>
+        <w:rPr>
+          <w:color w:val="8A8984"/>
+          <w:sz w:val="2"/>
+          <w:szCs w:val="2"/>
+        </w:rPr>
+        <w:t xml:space="preserve">{{fin:resumen.cambiaria_recomendacion}}</w:t>
       </w:r>
     </w:p>
     <w:p>
@@ -8245,7 +8713,7 @@
                 <w:sz w:val="16"/>
                 <w:szCs w:val="16"/>
               </w:rPr>
-              <w:t xml:space="preserve">M. bruto</w:t>
+              <w:t xml:space="preserve">{{calc.etiquetas.margen_bruto}}</w:t>
             </w:r>
           </w:p>
         </w:tc>
@@ -11040,6 +11508,15 @@
     </w:p>
     <w:p>
       <w:pPr>
+        <w:pStyle w:val="Nota"/>
+        <w:spacing w:after="100"/>
+      </w:pPr>
+      <w:r>
+        <w:t xml:space="preserve">Días de inventario y de pago calculados {{calc.etiquetas.dias_base}}.</w:t>
+      </w:r>
+    </w:p>
+    <w:p>
+      <w:pPr>
         <w:keepNext w:val="false"/>
         <w:spacing w:after="160" w:before="120"/>
         <w:jc w:val="center"/>
@@ -20000,6 +20477,15 @@
       </w:pPr>
       <w:r>
         <w:t xml:space="preserve">Confianza: {{bolsa.confianza}}</w:t>
+      </w:r>
+    </w:p>
+    <w:p>
+      <w:pPr>
+        <w:pStyle w:val="Nota"/>
+        <w:spacing w:after="100"/>
+      </w:pPr>
+      <w:r>
+        <w:t xml:space="preserve">Rentabilidad {{bolsa.tipo_rentabilidad}}.</w:t>
       </w:r>
     </w:p>
     <w:tbl>
@@ -23325,14 +23811,7 @@
         <w:spacing w:after="100"/>
       </w:pPr>
       <w:r>
-        <w:rPr>
-          <w:b/>
-          <w:bCs/>
-        </w:rPr>
-        <w:t xml:space="preserve">Regresión EV/EBITDA NTM sobre crecimiento</w:t>
-      </w:r>
-      <w:r>
-        <w:t xml:space="preserve"> ({{calc.comparables.regresion.n|0}} comparables): múltiplo = {{calc.comparables.regresion.ordenada|1}} + {{calc.comparables.regresion.pendiente|2}} × crecimiento; R² = {{calc.comparables.regresion.r2|2}}. Para el crecimiento de la empresa, el múltiplo ajustado es {{calc.comparables.regresion.multiplo_ajustado|x}} y el valor por acción, {{calc.comparables.regresion.valor_accion|2}}.</w:t>
+        <w:t xml:space="preserve">{{texto:calc.comparables.regresion.texto}}</w:t>
       </w:r>
     </w:p>
     <w:p>
@@ -33249,6 +33728,7 @@
     <w:basedOn w:val="Normal"/>
     <w:next w:val="Normal"/>
     <w:pPr>
+      <w:keepNext/>
       <w:spacing w:after="160" w:before="0"/>
     </w:pPr>
     <w:rPr>

</xml_diff>

<commit_message>
Empresa: página de síntesis y recomendación (resumen.sintesis, una página antes del resumen ejecutivo)
Co-Authored-By: Claude Opus 5.5 <noreply@anthropic.com>
</commit_message>
<xml_diff>
--- a/verticales/empresa/plantilla.docx
+++ b/verticales/empresa/plantilla.docx
@@ -1717,7 +1717,7 @@
           <w:sz w:val="18"/>
           <w:szCs w:val="18"/>
         </w:rPr>
-        <w:t xml:space="preserve">Resumen ejecutivo</w:t>
+        <w:t xml:space="preserve">Síntesis y recomendación (una página)</w:t>
       </w:r>
     </w:p>
     <w:p>
@@ -1734,7 +1734,7 @@
           <w:sz w:val="18"/>
           <w:szCs w:val="18"/>
         </w:rPr>
-        <w:t xml:space="preserve">Parte I — Negocio y sector: 1. Historia · 2. Modelo de negocio · 3. Sector y mercado · 4. Posición competitiva</w:t>
+        <w:t xml:space="preserve">Resumen ejecutivo</w:t>
       </w:r>
     </w:p>
     <w:p>
@@ -1751,7 +1751,7 @@
           <w:sz w:val="18"/>
           <w:szCs w:val="18"/>
         </w:rPr>
-        <w:t xml:space="preserve">Parte II — Finanzas: 5. Cuenta de resultados · 6. Resultados recientes · 7. Balance y circulante · 8. Flujos de caja · 9. Calidad contable · 10. Rentabilidad · 11. Deuda y solvencia · 12. Asignación de capital</w:t>
+        <w:t xml:space="preserve">Parte I — Negocio y sector: 1. Historia · 2. Modelo de negocio · 3. Sector y mercado · 4. Posición competitiva</w:t>
       </w:r>
     </w:p>
     <w:p>
@@ -1768,7 +1768,7 @@
           <w:sz w:val="18"/>
           <w:szCs w:val="18"/>
         </w:rPr>
-        <w:t xml:space="preserve">Parte III — Equipo y gobierno: 13. Equipo directivo · 14. Gobierno corporativo</w:t>
+        <w:t xml:space="preserve">Parte II — Finanzas: 5. Cuenta de resultados · 6. Resultados recientes · 7. Balance y circulante · 8. Flujos de caja · 9. Calidad contable · 10. Rentabilidad · 11. Deuda y solvencia · 12. Asignación de capital</w:t>
       </w:r>
     </w:p>
     <w:p>
@@ -1785,7 +1785,7 @@
           <w:sz w:val="18"/>
           <w:szCs w:val="18"/>
         </w:rPr>
-        <w:t xml:space="preserve">Parte IV — Mercado y valoración: 15. Consenso · 16. Bolsa · 17. Múltiplos históricos · 18. Comparables · 19. Transacciones · 20. DCF · 21. Escenarios · 22. Suma de partes · 23. Síntesis</w:t>
+        <w:t xml:space="preserve">Parte III — Equipo y gobierno: 13. Equipo directivo · 14. Gobierno corporativo</w:t>
       </w:r>
     </w:p>
     <w:p>
@@ -1802,7 +1802,7 @@
           <w:sz w:val="18"/>
           <w:szCs w:val="18"/>
         </w:rPr>
-        <w:t xml:space="preserve">Parte V — Tesis, riesgos y seguimiento: 24. Catalizadores · 25. Riesgos y pre-mortem · 26. ESG · 27. Preguntas abiertas</w:t>
+        <w:t xml:space="preserve">Parte IV — Mercado y valoración: 15. Consenso · 16. Bolsa · 17. Múltiplos históricos · 18. Comparables · 19. Transacciones · 20. DCF · 21. Escenarios · 22. Suma de partes · 23. Síntesis</w:t>
       </w:r>
     </w:p>
     <w:p>
@@ -1819,7 +1819,7 @@
           <w:sz w:val="18"/>
           <w:szCs w:val="18"/>
         </w:rPr>
-        <w:t xml:space="preserve">Anexos: controles de calidad, información no disponible y fuentes</w:t>
+        <w:t xml:space="preserve">Parte V — Tesis, riesgos y seguimiento: 24. Catalizadores · 25. Riesgos y pre-mortem · 26. ESG · 27. Preguntas abiertas</w:t>
       </w:r>
     </w:p>
     <w:p>
@@ -1836,7 +1836,106 @@
           <w:sz w:val="18"/>
           <w:szCs w:val="18"/>
         </w:rPr>
+        <w:t xml:space="preserve">Anexos: controles de calidad, información no disponible y fuentes</w:t>
+      </w:r>
+    </w:p>
+    <w:p>
+      <w:pPr>
+        <w:pStyle w:val="ListParagraph"/>
+        <w:numPr>
+          <w:ilvl w:val="0"/>
+          <w:numId w:val="2"/>
+        </w:numPr>
+        <w:spacing w:after="40"/>
+      </w:pPr>
+      <w:r>
+        <w:rPr>
+          <w:sz w:val="18"/>
+          <w:szCs w:val="18"/>
+        </w:rPr>
         <w:t xml:space="preserve">Las secciones sin información verificable no se imprimen; quedan listadas en el anexo «Información no disponible».</w:t>
+      </w:r>
+    </w:p>
+    <w:p>
+      <w:pPr>
+        <w:spacing w:after="0" w:before="0"/>
+      </w:pPr>
+      <w:r>
+        <w:rPr>
+          <w:color w:val="8A8984"/>
+          <w:sz w:val="2"/>
+          <w:szCs w:val="2"/>
+        </w:rPr>
+        <w:t xml:space="preserve">{{si:resumen.sintesis}}</w:t>
+      </w:r>
+    </w:p>
+    <w:p>
+      <w:r>
+        <w:br w:type="page"/>
+      </w:r>
+    </w:p>
+    <w:p>
+      <w:pPr>
+        <w:pStyle w:val="Heading1"/>
+      </w:pPr>
+      <w:r>
+        <w:t xml:space="preserve">Síntesis y recomendación</w:t>
+      </w:r>
+    </w:p>
+    <w:p>
+      <w:pPr>
+        <w:spacing w:after="100"/>
+      </w:pPr>
+      <w:r>
+        <w:rPr>
+          <w:b/>
+          <w:bCs/>
+        </w:rPr>
+        <w:t xml:space="preserve">{{calc.recomendacion.recomendacion}}</w:t>
+      </w:r>
+      <w:r>
+        <w:t xml:space="preserve"> · Convicción {{resumen.conviccion}} · Valor objetivo </w:t>
+      </w:r>
+      <w:r>
+        <w:rPr>
+          <w:b/>
+          <w:bCs/>
+        </w:rPr>
+        <w:t xml:space="preserve">{{calc.sintesis.valor_objetivo|2}} {{meta.divisa}}{{calc.recomendacion.valor_objetivo_txt}}</w:t>
+      </w:r>
+      <w:r>
+        <w:t xml:space="preserve"> frente a {{identificacion.precio|2}}{{calc.recomendacion.precio_txt}} · Rentabilidad total esperada a 12 meses </w:t>
+      </w:r>
+      <w:r>
+        <w:rPr>
+          <w:b/>
+          <w:bCs/>
+        </w:rPr>
+        <w:t xml:space="preserve">{{calc.recomendacion.rentabilidad_total_pct|+pct}}</w:t>
+      </w:r>
+      <w:r>
+        <w:t xml:space="preserve"> · Alcista / bajista {{calc.recomendacion.alcista_pct|+pct}} / {{calc.recomendacion.bajista_pct|+pct}}</w:t>
+      </w:r>
+    </w:p>
+    <w:p>
+      <w:pPr>
+        <w:spacing w:after="100"/>
+      </w:pPr>
+      <w:r>
+        <w:t xml:space="preserve">{{texto:resumen.sintesis}}</w:t>
+      </w:r>
+    </w:p>
+    <w:p>
+      <w:pPr>
+        <w:spacing w:after="0" w:before="0"/>
+      </w:pPr>
+      <w:r>
+        <w:rPr>
+          <w:color w:val="8A8984"/>
+          <w:sz w:val="2"/>
+          <w:szCs w:val="2"/>
+        </w:rPr>
+        <w:t xml:space="preserve">{{fin:resumen.sintesis}}</w:t>
       </w:r>
     </w:p>
     <w:p>

</xml_diff>

<commit_message>
Empresa, vuelta 4 (Inditex): ejercicio no natural, gobierno con control familiar y arreglos
- meta.etiqueta_ejercicio («inicio» o «fin»): FY2025 de Inditex empieza en 2025; NTM y
  DCF lo respetan y un control avisa si el último ejercicio no cuadra con el corte.
- Filtro «opc» en rellenar: el precio y el valor objetivo ya no salen con «n.d.» pegado
  cuando cotiza en la divisa de las cuentas.
- Gobierno con 13 criterios: presidencia vinculada al accionista de control y voto en
  contra sobre el capital libre.
- Múltiplos históricos con mediana y años excluibles; ROIC incremental solo si el
  capital ha crecido; «La decisión» muestra la rentabilidad implícita frente al WACC;
  control de fragilidad de los comparables al quitar uno.
- integrar: misma URL con títulos distintos no se funde; a-pdf.ps1 no cierra un Word
  con otros documentos abiertos.
- Informe de Inditex (Vender, convicción baja) con la síntesis de una página.

Co-Authored-By: Claude Opus 5.5 <noreply@anthropic.com>
</commit_message>
<xml_diff>
--- a/verticales/empresa/plantilla.docx
+++ b/verticales/empresa/plantilla.docx
@@ -223,7 +223,7 @@
                 <w:sz w:val="26"/>
                 <w:szCs w:val="26"/>
               </w:rPr>
-              <w:t xml:space="preserve">{{identificacion.precio|2}} {{meta.divisa}}{{calc.recomendacion.precio_txt}}</w:t>
+              <w:t xml:space="preserve">{{identificacion.precio|2}} {{meta.divisa}}{{calc.recomendacion.precio_txt|opc}}</w:t>
             </w:r>
           </w:p>
         </w:tc>
@@ -271,7 +271,7 @@
                 <w:sz w:val="26"/>
                 <w:szCs w:val="26"/>
               </w:rPr>
-              <w:t xml:space="preserve">{{calc.sintesis.valor_objetivo|2}} {{meta.divisa}}{{calc.recomendacion.valor_objetivo_txt}}</w:t>
+              <w:t xml:space="preserve">{{calc.sintesis.valor_objetivo|2}} {{meta.divisa}}{{calc.recomendacion.valor_objetivo_txt|opc}}</w:t>
             </w:r>
           </w:p>
         </w:tc>
@@ -1901,10 +1901,10 @@
           <w:b/>
           <w:bCs/>
         </w:rPr>
-        <w:t xml:space="preserve">{{calc.sintesis.valor_objetivo|2}} {{meta.divisa}}{{calc.recomendacion.valor_objetivo_txt}}</w:t>
-      </w:r>
-      <w:r>
-        <w:t xml:space="preserve"> frente a {{identificacion.precio|2}}{{calc.recomendacion.precio_txt}} · Rentabilidad total esperada a 12 meses </w:t>
+        <w:t xml:space="preserve">{{calc.sintesis.valor_objetivo|2}} {{meta.divisa}}{{calc.recomendacion.valor_objetivo_txt|opc}}</w:t>
+      </w:r>
+      <w:r>
+        <w:t xml:space="preserve"> frente a {{identificacion.precio|2}}{{calc.recomendacion.precio_txt|opc}} · Rentabilidad total esperada a 12 meses </w:t>
       </w:r>
       <w:r>
         <w:rPr>
@@ -1988,7 +1988,7 @@
           <w:b/>
           <w:bCs/>
         </w:rPr>
-        <w:t xml:space="preserve">{{calc.sintesis.valor_objetivo|2}} {{meta.divisa}}{{calc.recomendacion.valor_objetivo_txt}}</w:t>
+        <w:t xml:space="preserve">{{calc.sintesis.valor_objetivo|2}} {{meta.divisa}}{{calc.recomendacion.valor_objetivo_txt|opc}}</w:t>
       </w:r>
       <w:r>
         <w:t xml:space="preserve"> ({{calc.sintesis.potencial_pct|+pct}} sobre {{identificacion.precio|2}}; rentabilidad total esperada {{calc.recomendacion.rentabilidad_total_pct|+pct}})</w:t>
@@ -21911,7 +21911,7 @@
                 <w:sz w:val="16"/>
                 <w:szCs w:val="16"/>
               </w:rPr>
-              <w:t xml:space="preserve">Media</w:t>
+              <w:t xml:space="preserve">Mediana</w:t>
             </w:r>
           </w:p>
         </w:tc>

</xml_diff>

<commit_message>
Empresa, vuelta 6 (VAT): escenarios con perfil anual, revisión visual fuera de OneDrive
- escenarios.casos[].perfil: ajuste de años concretos (cíclicas: una caída de un año no
  es una pérdida permanente de nivel).
- DCF inverso: si ningún margen justifica el precio, lo dice en vez de dejar el dato vacío.
- Eje de la síntesis de valoración sin decimales cuando los valores pasan de 100
  (formato de gráfico con {{marcador}}).
- a-pdf.ps1 y pdf-a-png.ps1 escriben en %TEMP%\analisis-inversion (OneDrive dejaba de
  avisar de borrados masivos), con nombre único y -Paginas; ruta de salida como [string]
  (envuelta en PSObject, Word se quedaba colgado en ExportAsFixedFormat).
- Rótulos en negrita unidos a su texto (no quedan al pie de página).
- Lecciones de Suiza, tablas de PDF desordenadas y cíclicas; el comando pide leer el
  calendario financiero antes de lanzar los subagentes.

Co-Authored-By: Claude Opus 5.5 <noreply@anthropic.com>
</commit_message>
<xml_diff>
--- a/verticales/empresa/plantilla.docx
+++ b/verticales/empresa/plantilla.docx
@@ -2516,6 +2516,7 @@
     </w:p>
     <w:p>
       <w:pPr>
+        <w:keepNext/>
         <w:spacing w:after="100"/>
       </w:pPr>
       <w:r>
@@ -2562,6 +2563,7 @@
     </w:p>
     <w:p>
       <w:pPr>
+        <w:keepNext/>
         <w:spacing w:after="100"/>
       </w:pPr>
       <w:r>
@@ -2608,6 +2610,7 @@
     </w:p>
     <w:p>
       <w:pPr>
+        <w:keepNext/>
         <w:spacing w:after="100"/>
       </w:pPr>
       <w:r>
@@ -25477,6 +25480,7 @@
     </w:p>
     <w:p>
       <w:pPr>
+        <w:keepNext/>
         <w:spacing w:after="100"/>
       </w:pPr>
       <w:r>
@@ -25523,6 +25527,7 @@
     </w:p>
     <w:p>
       <w:pPr>
+        <w:keepNext/>
         <w:spacing w:after="100"/>
       </w:pPr>
       <w:r>
@@ -25569,6 +25574,7 @@
     </w:p>
     <w:p>
       <w:pPr>
+        <w:keepNext/>
         <w:spacing w:after="100"/>
       </w:pPr>
       <w:r>
@@ -25615,6 +25621,7 @@
     </w:p>
     <w:p>
       <w:pPr>
+        <w:keepNext/>
         <w:spacing w:after="100"/>
       </w:pPr>
       <w:r>
@@ -25661,6 +25668,7 @@
     </w:p>
     <w:p>
       <w:pPr>
+        <w:keepNext/>
         <w:spacing w:after="100"/>
       </w:pPr>
       <w:r>
@@ -28370,7 +28378,7 @@
                 <w:sz w:val="16"/>
                 <w:szCs w:val="16"/>
               </w:rPr>
-              <w:t xml:space="preserve">{{?calc.dcf.inverso.margen_implicito_pct,calc.dcf.inverso.margen_base_pct}}Margen EBITDA final implícito</w:t>
+              <w:t xml:space="preserve">{{?calc.dcf.inverso.margen_implicito_pct,calc.dcf.inverso.margen_implicito_texto,calc.dcf.inverso.margen_base_pct}}Margen EBITDA final implícito</w:t>
             </w:r>
           </w:p>
         </w:tc>
@@ -28404,7 +28412,7 @@
                 <w:sz w:val="17"/>
                 <w:szCs w:val="17"/>
               </w:rPr>
-              <w:t xml:space="preserve">{{calc.dcf.inverso.margen_implicito_pct|pct}} (base: {{calc.dcf.inverso.margen_base_pct|pct}})</w:t>
+              <w:t xml:space="preserve">{{calc.dcf.inverso.margen_implicito_pct|pct}}{{calc.dcf.inverso.margen_implicito_texto|opc}} (base: {{calc.dcf.inverso.margen_base_pct|pct}})</w:t>
             </w:r>
           </w:p>
         </w:tc>

</xml_diff>

<commit_message>
Reguladas: valoracion.rab y valor empresa sobre la RAB en los datos clave
Co-Authored-By: Claude Opus 5.5 <noreply@anthropic.com>
</commit_message>
<xml_diff>
--- a/verticales/empresa/plantilla.docx
+++ b/verticales/empresa/plantilla.docx
@@ -3743,7 +3743,7 @@
                 <w:sz w:val="16"/>
                 <w:szCs w:val="16"/>
               </w:rPr>
-              <w:t xml:space="preserve">{{?calc.clave.ev_ventas_ltm}}EV/Ventas últimos 12 m</w:t>
+              <w:t xml:space="preserve">{{?calc.clave.ev_rab}}Valor empresa / base de activos regulada (RAB)</w:t>
             </w:r>
           </w:p>
         </w:tc>
@@ -3777,7 +3777,7 @@
                 <w:sz w:val="17"/>
                 <w:szCs w:val="17"/>
               </w:rPr>
-              <w:t xml:space="preserve">{{calc.clave.ev_ventas_ltm|x2}}</w:t>
+              <w:t xml:space="preserve">{{calc.clave.ev_rab|x2}}</w:t>
             </w:r>
           </w:p>
         </w:tc>
@@ -3817,7 +3817,7 @@
                 <w:sz w:val="16"/>
                 <w:szCs w:val="16"/>
               </w:rPr>
-              <w:t xml:space="preserve">{{?calc.clave.fcf_yield_pct}}Rentabilidad por FCF</w:t>
+              <w:t xml:space="preserve">{{?calc.clave.ev_ventas_ltm}}EV/Ventas últimos 12 m</w:t>
             </w:r>
           </w:p>
         </w:tc>
@@ -3851,7 +3851,7 @@
                 <w:sz w:val="17"/>
                 <w:szCs w:val="17"/>
               </w:rPr>
-              <w:t xml:space="preserve">{{calc.clave.fcf_yield_pct|pct}}</w:t>
+              <w:t xml:space="preserve">{{calc.clave.ev_ventas_ltm|x2}}</w:t>
             </w:r>
           </w:p>
         </w:tc>
@@ -3886,7 +3886,7 @@
                 <w:sz w:val="16"/>
                 <w:szCs w:val="16"/>
               </w:rPr>
-              <w:t xml:space="preserve">{{?calc.clave.dividendo_pct}}Rentabilidad por dividendo</w:t>
+              <w:t xml:space="preserve">{{?calc.clave.fcf_yield_pct}}Rentabilidad por FCF</w:t>
             </w:r>
           </w:p>
         </w:tc>
@@ -3920,7 +3920,7 @@
                 <w:sz w:val="17"/>
                 <w:szCs w:val="17"/>
               </w:rPr>
-              <w:t xml:space="preserve">{{calc.clave.dividendo_pct|pct}}</w:t>
+              <w:t xml:space="preserve">{{calc.clave.fcf_yield_pct|pct}}</w:t>
             </w:r>
           </w:p>
         </w:tc>
@@ -3960,7 +3960,7 @@
                 <w:sz w:val="16"/>
                 <w:szCs w:val="16"/>
               </w:rPr>
-              <w:t xml:space="preserve">{{?calc.tcac.ingresos_pct}}Crecimiento anual de ingresos ({{calc.tcac.periodo}})</w:t>
+              <w:t xml:space="preserve">{{?calc.clave.dividendo_pct}}Rentabilidad por dividendo</w:t>
             </w:r>
           </w:p>
         </w:tc>
@@ -3994,7 +3994,7 @@
                 <w:sz w:val="17"/>
                 <w:szCs w:val="17"/>
               </w:rPr>
-              <w:t xml:space="preserve">{{calc.tcac.ingresos_pct|pct}}</w:t>
+              <w:t xml:space="preserve">{{calc.clave.dividendo_pct|pct}}</w:t>
             </w:r>
           </w:p>
         </w:tc>
@@ -4029,7 +4029,7 @@
                 <w:sz w:val="16"/>
                 <w:szCs w:val="16"/>
               </w:rPr>
-              <w:t xml:space="preserve">{{?calc.clave.margen_ebitda_pct}}Margen EBITDA últimos 12 m</w:t>
+              <w:t xml:space="preserve">{{?calc.tcac.ingresos_pct}}Crecimiento anual de ingresos ({{calc.tcac.periodo}})</w:t>
             </w:r>
           </w:p>
         </w:tc>
@@ -4063,7 +4063,7 @@
                 <w:sz w:val="17"/>
                 <w:szCs w:val="17"/>
               </w:rPr>
-              <w:t xml:space="preserve">{{calc.clave.margen_ebitda_pct|pct}}</w:t>
+              <w:t xml:space="preserve">{{calc.tcac.ingresos_pct|pct}}</w:t>
             </w:r>
           </w:p>
         </w:tc>
@@ -4103,7 +4103,7 @@
                 <w:sz w:val="16"/>
                 <w:szCs w:val="16"/>
               </w:rPr>
-              <w:t xml:space="preserve">{{?calc.clave.roic_pct}}ROIC último ejercicio</w:t>
+              <w:t xml:space="preserve">{{?calc.clave.margen_ebitda_pct}}Margen EBITDA últimos 12 m</w:t>
             </w:r>
           </w:p>
         </w:tc>
@@ -4137,7 +4137,7 @@
                 <w:sz w:val="17"/>
                 <w:szCs w:val="17"/>
               </w:rPr>
-              <w:t xml:space="preserve">{{calc.clave.roic_pct|pct}}</w:t>
+              <w:t xml:space="preserve">{{calc.clave.margen_ebitda_pct|pct}}</w:t>
             </w:r>
           </w:p>
         </w:tc>
@@ -4172,7 +4172,7 @@
                 <w:sz w:val="16"/>
                 <w:szCs w:val="16"/>
               </w:rPr>
-              <w:t xml:space="preserve">{{?calc.dcf.wacc}}WACC</w:t>
+              <w:t xml:space="preserve">{{?calc.clave.roic_pct}}ROIC último ejercicio</w:t>
             </w:r>
           </w:p>
         </w:tc>
@@ -4206,7 +4206,7 @@
                 <w:sz w:val="17"/>
                 <w:szCs w:val="17"/>
               </w:rPr>
-              <w:t xml:space="preserve">{{calc.dcf.wacc|pct}}</w:t>
+              <w:t xml:space="preserve">{{calc.clave.roic_pct|pct}}</w:t>
             </w:r>
           </w:p>
         </w:tc>
@@ -4246,7 +4246,7 @@
                 <w:sz w:val="16"/>
                 <w:szCs w:val="16"/>
               </w:rPr>
-              <w:t xml:space="preserve">{{?calc.clave.dn_ebitda,calc.clave.dn_ebitda_ajustada}}Deuda neta / EBITDA (contable · ajustada)</w:t>
+              <w:t xml:space="preserve">{{?calc.dcf.wacc}}WACC</w:t>
             </w:r>
           </w:p>
         </w:tc>
@@ -4280,7 +4280,7 @@
                 <w:sz w:val="17"/>
                 <w:szCs w:val="17"/>
               </w:rPr>
-              <w:t xml:space="preserve">{{calc.clave.dn_ebitda|x}} · {{calc.clave.dn_ebitda_ajustada|x}}</w:t>
+              <w:t xml:space="preserve">{{calc.dcf.wacc|pct}}</w:t>
             </w:r>
           </w:p>
         </w:tc>
@@ -4315,7 +4315,7 @@
                 <w:sz w:val="16"/>
                 <w:szCs w:val="16"/>
               </w:rPr>
-              <w:t xml:space="preserve">{{?calc.gobierno.puntuacion}}Gobierno (criterios cumplidos)</w:t>
+              <w:t xml:space="preserve">{{?calc.clave.dn_ebitda,calc.clave.dn_ebitda_ajustada}}Deuda neta / EBITDA (contable · ajustada)</w:t>
             </w:r>
           </w:p>
         </w:tc>
@@ -4349,8 +4349,129 @@
                 <w:sz w:val="17"/>
                 <w:szCs w:val="17"/>
               </w:rPr>
+              <w:t xml:space="preserve">{{calc.clave.dn_ebitda|x}} · {{calc.clave.dn_ebitda_ajustada|x}}</w:t>
+            </w:r>
+          </w:p>
+        </w:tc>
+      </w:tr>
+      <w:tr>
+        <w:trPr>
+          <w:cantSplit/>
+        </w:trPr>
+        <w:tc>
+          <w:tcPr>
+            <w:tcW w:type="dxa" w:w="2023"/>
+            <w:tcBorders>
+              <w:top w:val="none" w:color="FFFFFF" w:sz="0"/>
+              <w:left w:val="none" w:color="FFFFFF" w:sz="0"/>
+              <w:bottom w:val="single" w:color="D9D8D3" w:sz="4"/>
+              <w:right w:val="none" w:color="FFFFFF" w:sz="0"/>
+            </w:tcBorders>
+            <w:shd w:fill="F3F2EE" w:color="auto" w:val="clear"/>
+            <w:tcMar>
+              <w:top w:type="dxa" w:w="50"/>
+              <w:left w:type="dxa" w:w="80"/>
+              <w:bottom w:type="dxa" w:w="50"/>
+              <w:right w:type="dxa" w:w="80"/>
+            </w:tcMar>
+          </w:tcPr>
+          <w:p>
+            <w:pPr>
+              <w:spacing w:after="0" w:before="0"/>
+              <w:jc w:val="left"/>
+            </w:pPr>
+            <w:r>
+              <w:rPr>
+                <w:rFonts w:ascii="Calibri" w:cs="Calibri" w:eastAsia="Calibri" w:hAnsi="Calibri"/>
+                <w:b w:val="false"/>
+                <w:bCs w:val="false"/>
+                <w:color w:val="52514E"/>
+                <w:sz w:val="16"/>
+                <w:szCs w:val="16"/>
+              </w:rPr>
+              <w:t xml:space="preserve">{{?calc.gobierno.puntuacion}}Gobierno (criterios cumplidos)</w:t>
+            </w:r>
+          </w:p>
+        </w:tc>
+        <w:tc>
+          <w:tcPr>
+            <w:tcW w:type="dxa" w:w="2796"/>
+            <w:tcBorders>
+              <w:top w:val="none" w:color="FFFFFF" w:sz="0"/>
+              <w:left w:val="none" w:color="FFFFFF" w:sz="0"/>
+              <w:bottom w:val="single" w:color="D9D8D3" w:sz="4"/>
+              <w:right w:val="none" w:color="FFFFFF" w:sz="0"/>
+            </w:tcBorders>
+            <w:tcMar>
+              <w:top w:type="dxa" w:w="50"/>
+              <w:left w:type="dxa" w:w="80"/>
+              <w:bottom w:type="dxa" w:w="50"/>
+              <w:right w:type="dxa" w:w="80"/>
+            </w:tcMar>
+          </w:tcPr>
+          <w:p>
+            <w:pPr>
+              <w:spacing w:after="0" w:before="0"/>
+              <w:jc w:val="left"/>
+            </w:pPr>
+            <w:r>
+              <w:rPr>
+                <w:rFonts w:ascii="Calibri" w:cs="Calibri" w:eastAsia="Calibri" w:hAnsi="Calibri"/>
+                <w:b/>
+                <w:bCs/>
+                <w:color w:val="1F2A3C"/>
+                <w:sz w:val="17"/>
+                <w:szCs w:val="17"/>
+              </w:rPr>
               <w:t xml:space="preserve">{{calc.gobierno.puntuacion}}</w:t>
             </w:r>
+          </w:p>
+        </w:tc>
+        <w:tc>
+          <w:tcPr>
+            <w:tcW w:type="dxa" w:w="2023"/>
+            <w:tcBorders>
+              <w:top w:val="none" w:color="FFFFFF" w:sz="0"/>
+              <w:left w:val="none" w:color="FFFFFF" w:sz="0"/>
+              <w:bottom w:val="single" w:color="D9D8D3" w:sz="4"/>
+              <w:right w:val="none" w:color="FFFFFF" w:sz="0"/>
+            </w:tcBorders>
+            <w:shd w:fill="F3F2EE" w:color="auto" w:val="clear"/>
+            <w:tcMar>
+              <w:top w:type="dxa" w:w="50"/>
+              <w:left w:type="dxa" w:w="80"/>
+              <w:bottom w:type="dxa" w:w="50"/>
+              <w:right w:type="dxa" w:w="80"/>
+            </w:tcMar>
+          </w:tcPr>
+          <w:p>
+            <w:pPr>
+              <w:spacing w:after="0" w:before="0"/>
+              <w:jc w:val="left"/>
+            </w:pPr>
+          </w:p>
+        </w:tc>
+        <w:tc>
+          <w:tcPr>
+            <w:tcW w:type="dxa" w:w="2796"/>
+            <w:tcBorders>
+              <w:top w:val="none" w:color="FFFFFF" w:sz="0"/>
+              <w:left w:val="none" w:color="FFFFFF" w:sz="0"/>
+              <w:bottom w:val="single" w:color="D9D8D3" w:sz="4"/>
+              <w:right w:val="none" w:color="FFFFFF" w:sz="0"/>
+            </w:tcBorders>
+            <w:tcMar>
+              <w:top w:type="dxa" w:w="50"/>
+              <w:left w:type="dxa" w:w="80"/>
+              <w:bottom w:type="dxa" w:w="50"/>
+              <w:right w:type="dxa" w:w="80"/>
+            </w:tcMar>
+          </w:tcPr>
+          <w:p>
+            <w:pPr>
+              <w:spacing w:after="0" w:before="0"/>
+              <w:jc w:val="left"/>
+            </w:pPr>
           </w:p>
         </w:tc>
       </w:tr>

</xml_diff>

<commit_message>
Empresa: DCF en tres etapas y regla relativa (prima implícita del mercado)
- dcf.etapa2: etapa de transición de 5-10 años entre la proyección explícita y el
  terminal; crecimiento lineal hasta el terminal, inversión neta escalada con el
  crecimiento; valor con y sin ella; control ROIC ≥ WACC + 5.
- valoracion.referencia_mercado: DCF y escenarios con la prima implícita del
  mercado; regla relativa y absoluta; manda la relativa salvo contradicción;
  niveles de compra y venta con la regla combinada.

Co-Authored-By: Claude Opus 5.5 <noreply@anthropic.com>
</commit_message>
<xml_diff>
--- a/verticales/empresa/plantilla.docx
+++ b/verticales/empresa/plantilla.docx
@@ -1904,7 +1904,7 @@
         <w:t xml:space="preserve">{{calc.sintesis.valor_objetivo|2}} {{meta.divisa}}{{calc.recomendacion.valor_objetivo_txt|opc}}</w:t>
       </w:r>
       <w:r>
-        <w:t xml:space="preserve"> frente a {{identificacion.precio|2}}{{calc.recomendacion.precio_txt|opc}} · Rentabilidad total esperada a 12 meses </w:t>
+        <w:t xml:space="preserve"> frente a {{identificacion.precio|2}}{{calc.recomendacion.precio_txt|opc}}{{calc.recomendacion.objetivo_mercado_txt|opc}} · Rentabilidad total esperada a 12 meses </w:t>
       </w:r>
       <w:r>
         <w:rPr>
@@ -1991,7 +1991,7 @@
         <w:t xml:space="preserve">{{calc.sintesis.valor_objetivo|2}} {{meta.divisa}}{{calc.recomendacion.valor_objetivo_txt|opc}}</w:t>
       </w:r>
       <w:r>
-        <w:t xml:space="preserve"> ({{calc.sintesis.potencial_pct|+pct}} sobre {{identificacion.precio|2}}; rentabilidad total esperada {{calc.recomendacion.rentabilidad_total_pct|+pct}})</w:t>
+        <w:t xml:space="preserve"> ({{calc.sintesis.potencial_pct|+pct}} sobre {{identificacion.precio|2}}; rentabilidad total esperada {{calc.recomendacion.rentabilidad_total_pct|+pct}}){{calc.recomendacion.objetivo_mercado_txt|opc}}</w:t>
       </w:r>
     </w:p>
     <w:p>
@@ -2200,7 +2200,7 @@
         <w:spacing w:after="100"/>
       </w:pPr>
       <w:r>
-        <w:t xml:space="preserve">Regla: Comprar si la rentabilidad total esperada a 12 meses es ≥ 15 % y el alcista gana al menos lo que pierde el bajista; Vender si es ≤ −10 %, o negativa con asimetría &lt; 0,5; Mantener en el resto.</w:t>
+        <w:t xml:space="preserve">Regla: Comprar si la rentabilidad total esperada a 12 meses es ≥ 15 % y el alcista gana al menos lo que pierde el bajista; Vender si es ≤ −10 %, o negativa con asimetría &lt; 0,5; Mantener en el resto. Se aplica dos veces: con el WACC del análisis (regla absoluta: ¿rinde más que su coste de capital?) y con el WACC que resulta de la prima de riesgo implícita del mercado (regla relativa: ¿rinde más que lo que hoy pide el mercado, ajustado por su beta?). Manda la relativa, salvo que las dos se contradigan (una Comprar y otra Vender): entonces, Mantener.</w:t>
       </w:r>
     </w:p>
     <w:tbl>
@@ -26961,6 +26961,695 @@
           <w:szCs w:val="2"/>
         </w:rPr>
         <w:t xml:space="preserve">{{fin:calc.dcf.proyeccion}}</w:t>
+      </w:r>
+    </w:p>
+    <w:p>
+      <w:pPr>
+        <w:spacing w:after="0" w:before="0"/>
+      </w:pPr>
+      <w:r>
+        <w:rPr>
+          <w:color w:val="8A8984"/>
+          <w:sz w:val="2"/>
+          <w:szCs w:val="2"/>
+        </w:rPr>
+        <w:t xml:space="preserve">{{si:calc.dcf.etapa2}}</w:t>
+      </w:r>
+    </w:p>
+    <w:p>
+      <w:pPr>
+        <w:pStyle w:val="Heading2"/>
+      </w:pPr>
+      <w:r>
+        <w:t xml:space="preserve">Etapa de transición (DCF en tres etapas)</w:t>
+      </w:r>
+    </w:p>
+    <w:p>
+      <w:pPr>
+        <w:spacing w:after="100"/>
+      </w:pPr>
+      <w:r>
+        <w:t xml:space="preserve">{{calc.dcf.etapa2_texto}}</w:t>
+      </w:r>
+    </w:p>
+    <w:tbl>
+      <w:tblPr>
+        <w:tblW w:type="dxa" w:w="9638"/>
+        <w:tblBorders>
+          <w:top w:val="single" w:color="auto" w:sz="4"/>
+          <w:left w:val="single" w:color="auto" w:sz="4"/>
+          <w:bottom w:val="single" w:color="auto" w:sz="4"/>
+          <w:right w:val="single" w:color="auto" w:sz="4"/>
+          <w:insideH w:val="single" w:color="auto" w:sz="4"/>
+          <w:insideV w:val="single" w:color="auto" w:sz="4"/>
+        </w:tblBorders>
+      </w:tblPr>
+      <w:tblGrid>
+        <w:gridCol w:w="1101"/>
+        <w:gridCol w:w="1376"/>
+        <w:gridCol w:w="1101"/>
+        <w:gridCol w:w="1239"/>
+        <w:gridCol w:w="1239"/>
+        <w:gridCol w:w="1239"/>
+        <w:gridCol w:w="1101"/>
+        <w:gridCol w:w="1242"/>
+      </w:tblGrid>
+      <w:tr>
+        <w:trPr>
+          <w:cantSplit/>
+          <w:tblHeader/>
+        </w:trPr>
+        <w:tc>
+          <w:tcPr>
+            <w:tcW w:type="dxa" w:w="1101"/>
+            <w:tcBorders>
+              <w:top w:val="none" w:color="FFFFFF" w:sz="0"/>
+              <w:left w:val="none" w:color="FFFFFF" w:sz="0"/>
+              <w:bottom w:val="none" w:color="FFFFFF" w:sz="0"/>
+              <w:right w:val="none" w:color="FFFFFF" w:sz="0"/>
+            </w:tcBorders>
+            <w:shd w:fill="1F3A5F" w:color="auto" w:val="clear"/>
+            <w:tcMar>
+              <w:top w:type="dxa" w:w="50"/>
+              <w:left w:type="dxa" w:w="80"/>
+              <w:bottom w:type="dxa" w:w="50"/>
+              <w:right w:type="dxa" w:w="80"/>
+            </w:tcMar>
+          </w:tcPr>
+          <w:p>
+            <w:pPr>
+              <w:spacing w:after="0" w:before="0"/>
+              <w:jc w:val="left"/>
+            </w:pPr>
+            <w:r>
+              <w:rPr>
+                <w:rFonts w:ascii="Calibri" w:cs="Calibri" w:eastAsia="Calibri" w:hAnsi="Calibri"/>
+                <w:b/>
+                <w:bCs/>
+                <w:color w:val="FFFFFF"/>
+                <w:sz w:val="16"/>
+                <w:szCs w:val="16"/>
+              </w:rPr>
+              <w:t xml:space="preserve">Año</w:t>
+            </w:r>
+          </w:p>
+        </w:tc>
+        <w:tc>
+          <w:tcPr>
+            <w:tcW w:type="dxa" w:w="1376"/>
+            <w:tcBorders>
+              <w:top w:val="none" w:color="FFFFFF" w:sz="0"/>
+              <w:left w:val="none" w:color="FFFFFF" w:sz="0"/>
+              <w:bottom w:val="none" w:color="FFFFFF" w:sz="0"/>
+              <w:right w:val="none" w:color="FFFFFF" w:sz="0"/>
+            </w:tcBorders>
+            <w:shd w:fill="1F3A5F" w:color="auto" w:val="clear"/>
+            <w:tcMar>
+              <w:top w:type="dxa" w:w="50"/>
+              <w:left w:type="dxa" w:w="80"/>
+              <w:bottom w:type="dxa" w:w="50"/>
+              <w:right w:type="dxa" w:w="80"/>
+            </w:tcMar>
+          </w:tcPr>
+          <w:p>
+            <w:pPr>
+              <w:spacing w:after="0" w:before="0"/>
+              <w:jc w:val="right"/>
+            </w:pPr>
+            <w:r>
+              <w:rPr>
+                <w:rFonts w:ascii="Calibri" w:cs="Calibri" w:eastAsia="Calibri" w:hAnsi="Calibri"/>
+                <w:b/>
+                <w:bCs/>
+                <w:color w:val="FFFFFF"/>
+                <w:sz w:val="16"/>
+                <w:szCs w:val="16"/>
+              </w:rPr>
+              <w:t xml:space="preserve">Ingresos</w:t>
+            </w:r>
+          </w:p>
+        </w:tc>
+        <w:tc>
+          <w:tcPr>
+            <w:tcW w:type="dxa" w:w="1101"/>
+            <w:tcBorders>
+              <w:top w:val="none" w:color="FFFFFF" w:sz="0"/>
+              <w:left w:val="none" w:color="FFFFFF" w:sz="0"/>
+              <w:bottom w:val="none" w:color="FFFFFF" w:sz="0"/>
+              <w:right w:val="none" w:color="FFFFFF" w:sz="0"/>
+            </w:tcBorders>
+            <w:shd w:fill="1F3A5F" w:color="auto" w:val="clear"/>
+            <w:tcMar>
+              <w:top w:type="dxa" w:w="50"/>
+              <w:left w:type="dxa" w:w="80"/>
+              <w:bottom w:type="dxa" w:w="50"/>
+              <w:right w:type="dxa" w:w="80"/>
+            </w:tcMar>
+          </w:tcPr>
+          <w:p>
+            <w:pPr>
+              <w:spacing w:after="0" w:before="0"/>
+              <w:jc w:val="right"/>
+            </w:pPr>
+            <w:r>
+              <w:rPr>
+                <w:rFonts w:ascii="Calibri" w:cs="Calibri" w:eastAsia="Calibri" w:hAnsi="Calibri"/>
+                <w:b/>
+                <w:bCs/>
+                <w:color w:val="FFFFFF"/>
+                <w:sz w:val="16"/>
+                <w:szCs w:val="16"/>
+              </w:rPr>
+              <w:t xml:space="preserve">Crec.</w:t>
+            </w:r>
+          </w:p>
+        </w:tc>
+        <w:tc>
+          <w:tcPr>
+            <w:tcW w:type="dxa" w:w="1239"/>
+            <w:tcBorders>
+              <w:top w:val="none" w:color="FFFFFF" w:sz="0"/>
+              <w:left w:val="none" w:color="FFFFFF" w:sz="0"/>
+              <w:bottom w:val="none" w:color="FFFFFF" w:sz="0"/>
+              <w:right w:val="none" w:color="FFFFFF" w:sz="0"/>
+            </w:tcBorders>
+            <w:shd w:fill="1F3A5F" w:color="auto" w:val="clear"/>
+            <w:tcMar>
+              <w:top w:type="dxa" w:w="50"/>
+              <w:left w:type="dxa" w:w="80"/>
+              <w:bottom w:type="dxa" w:w="50"/>
+              <w:right w:type="dxa" w:w="80"/>
+            </w:tcMar>
+          </w:tcPr>
+          <w:p>
+            <w:pPr>
+              <w:spacing w:after="0" w:before="0"/>
+              <w:jc w:val="right"/>
+            </w:pPr>
+            <w:r>
+              <w:rPr>
+                <w:rFonts w:ascii="Calibri" w:cs="Calibri" w:eastAsia="Calibri" w:hAnsi="Calibri"/>
+                <w:b/>
+                <w:bCs/>
+                <w:color w:val="FFFFFF"/>
+                <w:sz w:val="16"/>
+                <w:szCs w:val="16"/>
+              </w:rPr>
+              <w:t xml:space="preserve">M. EBITDA</w:t>
+            </w:r>
+          </w:p>
+        </w:tc>
+        <w:tc>
+          <w:tcPr>
+            <w:tcW w:type="dxa" w:w="1239"/>
+            <w:tcBorders>
+              <w:top w:val="none" w:color="FFFFFF" w:sz="0"/>
+              <w:left w:val="none" w:color="FFFFFF" w:sz="0"/>
+              <w:bottom w:val="none" w:color="FFFFFF" w:sz="0"/>
+              <w:right w:val="none" w:color="FFFFFF" w:sz="0"/>
+            </w:tcBorders>
+            <w:shd w:fill="1F3A5F" w:color="auto" w:val="clear"/>
+            <w:tcMar>
+              <w:top w:type="dxa" w:w="50"/>
+              <w:left w:type="dxa" w:w="80"/>
+              <w:bottom w:type="dxa" w:w="50"/>
+              <w:right w:type="dxa" w:w="80"/>
+            </w:tcMar>
+          </w:tcPr>
+          <w:p>
+            <w:pPr>
+              <w:spacing w:after="0" w:before="0"/>
+              <w:jc w:val="right"/>
+            </w:pPr>
+            <w:r>
+              <w:rPr>
+                <w:rFonts w:ascii="Calibri" w:cs="Calibri" w:eastAsia="Calibri" w:hAnsi="Calibri"/>
+                <w:b/>
+                <w:bCs/>
+                <w:color w:val="FFFFFF"/>
+                <w:sz w:val="16"/>
+                <w:szCs w:val="16"/>
+              </w:rPr>
+              <w:t xml:space="preserve">Capex</w:t>
+            </w:r>
+          </w:p>
+        </w:tc>
+        <w:tc>
+          <w:tcPr>
+            <w:tcW w:type="dxa" w:w="1239"/>
+            <w:tcBorders>
+              <w:top w:val="none" w:color="FFFFFF" w:sz="0"/>
+              <w:left w:val="none" w:color="FFFFFF" w:sz="0"/>
+              <w:bottom w:val="none" w:color="FFFFFF" w:sz="0"/>
+              <w:right w:val="none" w:color="FFFFFF" w:sz="0"/>
+            </w:tcBorders>
+            <w:shd w:fill="1F3A5F" w:color="auto" w:val="clear"/>
+            <w:tcMar>
+              <w:top w:type="dxa" w:w="50"/>
+              <w:left w:type="dxa" w:w="80"/>
+              <w:bottom w:type="dxa" w:w="50"/>
+              <w:right w:type="dxa" w:w="80"/>
+            </w:tcMar>
+          </w:tcPr>
+          <w:p>
+            <w:pPr>
+              <w:spacing w:after="0" w:before="0"/>
+              <w:jc w:val="right"/>
+            </w:pPr>
+            <w:r>
+              <w:rPr>
+                <w:rFonts w:ascii="Calibri" w:cs="Calibri" w:eastAsia="Calibri" w:hAnsi="Calibri"/>
+                <w:b/>
+                <w:bCs/>
+                <w:color w:val="FFFFFF"/>
+                <w:sz w:val="16"/>
+                <w:szCs w:val="16"/>
+              </w:rPr>
+              <w:t xml:space="preserve">FCFF</w:t>
+            </w:r>
+          </w:p>
+        </w:tc>
+        <w:tc>
+          <w:tcPr>
+            <w:tcW w:type="dxa" w:w="1101"/>
+            <w:tcBorders>
+              <w:top w:val="none" w:color="FFFFFF" w:sz="0"/>
+              <w:left w:val="none" w:color="FFFFFF" w:sz="0"/>
+              <w:bottom w:val="none" w:color="FFFFFF" w:sz="0"/>
+              <w:right w:val="none" w:color="FFFFFF" w:sz="0"/>
+            </w:tcBorders>
+            <w:shd w:fill="1F3A5F" w:color="auto" w:val="clear"/>
+            <w:tcMar>
+              <w:top w:type="dxa" w:w="50"/>
+              <w:left w:type="dxa" w:w="80"/>
+              <w:bottom w:type="dxa" w:w="50"/>
+              <w:right w:type="dxa" w:w="80"/>
+            </w:tcMar>
+          </w:tcPr>
+          <w:p>
+            <w:pPr>
+              <w:spacing w:after="0" w:before="0"/>
+              <w:jc w:val="right"/>
+            </w:pPr>
+            <w:r>
+              <w:rPr>
+                <w:rFonts w:ascii="Calibri" w:cs="Calibri" w:eastAsia="Calibri" w:hAnsi="Calibri"/>
+                <w:b/>
+                <w:bCs/>
+                <w:color w:val="FFFFFF"/>
+                <w:sz w:val="16"/>
+                <w:szCs w:val="16"/>
+              </w:rPr>
+              <w:t xml:space="preserve">Factor</w:t>
+            </w:r>
+          </w:p>
+        </w:tc>
+        <w:tc>
+          <w:tcPr>
+            <w:tcW w:type="dxa" w:w="1242"/>
+            <w:tcBorders>
+              <w:top w:val="none" w:color="FFFFFF" w:sz="0"/>
+              <w:left w:val="none" w:color="FFFFFF" w:sz="0"/>
+              <w:bottom w:val="none" w:color="FFFFFF" w:sz="0"/>
+              <w:right w:val="none" w:color="FFFFFF" w:sz="0"/>
+            </w:tcBorders>
+            <w:shd w:fill="1F3A5F" w:color="auto" w:val="clear"/>
+            <w:tcMar>
+              <w:top w:type="dxa" w:w="50"/>
+              <w:left w:type="dxa" w:w="80"/>
+              <w:bottom w:type="dxa" w:w="50"/>
+              <w:right w:type="dxa" w:w="80"/>
+            </w:tcMar>
+          </w:tcPr>
+          <w:p>
+            <w:pPr>
+              <w:spacing w:after="0" w:before="0"/>
+              <w:jc w:val="right"/>
+            </w:pPr>
+            <w:r>
+              <w:rPr>
+                <w:rFonts w:ascii="Calibri" w:cs="Calibri" w:eastAsia="Calibri" w:hAnsi="Calibri"/>
+                <w:b/>
+                <w:bCs/>
+                <w:color w:val="FFFFFF"/>
+                <w:sz w:val="16"/>
+                <w:szCs w:val="16"/>
+              </w:rPr>
+              <w:t xml:space="preserve">VA</w:t>
+            </w:r>
+          </w:p>
+        </w:tc>
+      </w:tr>
+      <w:tr>
+        <w:trPr>
+          <w:cantSplit/>
+        </w:trPr>
+        <w:tc>
+          <w:tcPr>
+            <w:tcW w:type="dxa" w:w="1101"/>
+            <w:tcBorders>
+              <w:top w:val="none" w:color="FFFFFF" w:sz="0"/>
+              <w:left w:val="none" w:color="FFFFFF" w:sz="0"/>
+              <w:bottom w:val="single" w:color="D9D8D3" w:sz="4"/>
+              <w:right w:val="none" w:color="FFFFFF" w:sz="0"/>
+            </w:tcBorders>
+            <w:tcMar>
+              <w:top w:type="dxa" w:w="50"/>
+              <w:left w:type="dxa" w:w="80"/>
+              <w:bottom w:type="dxa" w:w="50"/>
+              <w:right w:type="dxa" w:w="80"/>
+            </w:tcMar>
+          </w:tcPr>
+          <w:p>
+            <w:pPr>
+              <w:spacing w:after="0" w:before="0"/>
+              <w:jc w:val="left"/>
+            </w:pPr>
+            <w:r>
+              <w:rPr>
+                <w:rFonts w:ascii="Calibri" w:cs="Calibri" w:eastAsia="Calibri" w:hAnsi="Calibri"/>
+                <w:b/>
+                <w:bCs/>
+                <w:color w:val="1F2A3C"/>
+                <w:sz w:val="16"/>
+                <w:szCs w:val="16"/>
+              </w:rPr>
+              <w:t xml:space="preserve">{{calc.dcf.etapa2.filas[].periodo}}</w:t>
+            </w:r>
+          </w:p>
+        </w:tc>
+        <w:tc>
+          <w:tcPr>
+            <w:tcW w:type="dxa" w:w="1376"/>
+            <w:tcBorders>
+              <w:top w:val="none" w:color="FFFFFF" w:sz="0"/>
+              <w:left w:val="none" w:color="FFFFFF" w:sz="0"/>
+              <w:bottom w:val="single" w:color="D9D8D3" w:sz="4"/>
+              <w:right w:val="none" w:color="FFFFFF" w:sz="0"/>
+            </w:tcBorders>
+            <w:tcMar>
+              <w:top w:type="dxa" w:w="50"/>
+              <w:left w:type="dxa" w:w="80"/>
+              <w:bottom w:type="dxa" w:w="50"/>
+              <w:right w:type="dxa" w:w="80"/>
+            </w:tcMar>
+          </w:tcPr>
+          <w:p>
+            <w:pPr>
+              <w:spacing w:after="0" w:before="0"/>
+              <w:jc w:val="right"/>
+            </w:pPr>
+            <w:r>
+              <w:rPr>
+                <w:rFonts w:ascii="Calibri" w:cs="Calibri" w:eastAsia="Calibri" w:hAnsi="Calibri"/>
+                <w:b w:val="false"/>
+                <w:bCs w:val="false"/>
+                <w:color w:val="1F2A3C"/>
+                <w:sz w:val="16"/>
+                <w:szCs w:val="16"/>
+              </w:rPr>
+              <w:t xml:space="preserve">{{calc.dcf.etapa2.filas[].ingresos|0}}</w:t>
+            </w:r>
+          </w:p>
+        </w:tc>
+        <w:tc>
+          <w:tcPr>
+            <w:tcW w:type="dxa" w:w="1101"/>
+            <w:tcBorders>
+              <w:top w:val="none" w:color="FFFFFF" w:sz="0"/>
+              <w:left w:val="none" w:color="FFFFFF" w:sz="0"/>
+              <w:bottom w:val="single" w:color="D9D8D3" w:sz="4"/>
+              <w:right w:val="none" w:color="FFFFFF" w:sz="0"/>
+            </w:tcBorders>
+            <w:tcMar>
+              <w:top w:type="dxa" w:w="50"/>
+              <w:left w:type="dxa" w:w="80"/>
+              <w:bottom w:type="dxa" w:w="50"/>
+              <w:right w:type="dxa" w:w="80"/>
+            </w:tcMar>
+          </w:tcPr>
+          <w:p>
+            <w:pPr>
+              <w:spacing w:after="0" w:before="0"/>
+              <w:jc w:val="right"/>
+            </w:pPr>
+            <w:r>
+              <w:rPr>
+                <w:rFonts w:ascii="Calibri" w:cs="Calibri" w:eastAsia="Calibri" w:hAnsi="Calibri"/>
+                <w:b w:val="false"/>
+                <w:bCs w:val="false"/>
+                <w:color w:val="1F2A3C"/>
+                <w:sz w:val="16"/>
+                <w:szCs w:val="16"/>
+              </w:rPr>
+              <w:t xml:space="preserve">{{calc.dcf.etapa2.filas[].crecimiento_pct|pct}}</w:t>
+            </w:r>
+          </w:p>
+        </w:tc>
+        <w:tc>
+          <w:tcPr>
+            <w:tcW w:type="dxa" w:w="1239"/>
+            <w:tcBorders>
+              <w:top w:val="none" w:color="FFFFFF" w:sz="0"/>
+              <w:left w:val="none" w:color="FFFFFF" w:sz="0"/>
+              <w:bottom w:val="single" w:color="D9D8D3" w:sz="4"/>
+              <w:right w:val="none" w:color="FFFFFF" w:sz="0"/>
+            </w:tcBorders>
+            <w:tcMar>
+              <w:top w:type="dxa" w:w="50"/>
+              <w:left w:type="dxa" w:w="80"/>
+              <w:bottom w:type="dxa" w:w="50"/>
+              <w:right w:type="dxa" w:w="80"/>
+            </w:tcMar>
+          </w:tcPr>
+          <w:p>
+            <w:pPr>
+              <w:spacing w:after="0" w:before="0"/>
+              <w:jc w:val="right"/>
+            </w:pPr>
+            <w:r>
+              <w:rPr>
+                <w:rFonts w:ascii="Calibri" w:cs="Calibri" w:eastAsia="Calibri" w:hAnsi="Calibri"/>
+                <w:b w:val="false"/>
+                <w:bCs w:val="false"/>
+                <w:color w:val="1F2A3C"/>
+                <w:sz w:val="16"/>
+                <w:szCs w:val="16"/>
+              </w:rPr>
+              <w:t xml:space="preserve">{{calc.dcf.etapa2.filas[].margen_ebitda_pct|pct}}</w:t>
+            </w:r>
+          </w:p>
+        </w:tc>
+        <w:tc>
+          <w:tcPr>
+            <w:tcW w:type="dxa" w:w="1239"/>
+            <w:tcBorders>
+              <w:top w:val="none" w:color="FFFFFF" w:sz="0"/>
+              <w:left w:val="none" w:color="FFFFFF" w:sz="0"/>
+              <w:bottom w:val="single" w:color="D9D8D3" w:sz="4"/>
+              <w:right w:val="none" w:color="FFFFFF" w:sz="0"/>
+            </w:tcBorders>
+            <w:tcMar>
+              <w:top w:type="dxa" w:w="50"/>
+              <w:left w:type="dxa" w:w="80"/>
+              <w:bottom w:type="dxa" w:w="50"/>
+              <w:right w:type="dxa" w:w="80"/>
+            </w:tcMar>
+          </w:tcPr>
+          <w:p>
+            <w:pPr>
+              <w:spacing w:after="0" w:before="0"/>
+              <w:jc w:val="right"/>
+            </w:pPr>
+            <w:r>
+              <w:rPr>
+                <w:rFonts w:ascii="Calibri" w:cs="Calibri" w:eastAsia="Calibri" w:hAnsi="Calibri"/>
+                <w:b w:val="false"/>
+                <w:bCs w:val="false"/>
+                <w:color w:val="1F2A3C"/>
+                <w:sz w:val="16"/>
+                <w:szCs w:val="16"/>
+              </w:rPr>
+              <w:t xml:space="preserve">{{calc.dcf.etapa2.filas[].capex|0}}</w:t>
+            </w:r>
+          </w:p>
+        </w:tc>
+        <w:tc>
+          <w:tcPr>
+            <w:tcW w:type="dxa" w:w="1239"/>
+            <w:tcBorders>
+              <w:top w:val="none" w:color="FFFFFF" w:sz="0"/>
+              <w:left w:val="none" w:color="FFFFFF" w:sz="0"/>
+              <w:bottom w:val="single" w:color="D9D8D3" w:sz="4"/>
+              <w:right w:val="none" w:color="FFFFFF" w:sz="0"/>
+            </w:tcBorders>
+            <w:tcMar>
+              <w:top w:type="dxa" w:w="50"/>
+              <w:left w:type="dxa" w:w="80"/>
+              <w:bottom w:type="dxa" w:w="50"/>
+              <w:right w:type="dxa" w:w="80"/>
+            </w:tcMar>
+          </w:tcPr>
+          <w:p>
+            <w:pPr>
+              <w:spacing w:after="0" w:before="0"/>
+              <w:jc w:val="right"/>
+            </w:pPr>
+            <w:r>
+              <w:rPr>
+                <w:rFonts w:ascii="Calibri" w:cs="Calibri" w:eastAsia="Calibri" w:hAnsi="Calibri"/>
+                <w:b w:val="false"/>
+                <w:bCs w:val="false"/>
+                <w:color w:val="1F2A3C"/>
+                <w:sz w:val="16"/>
+                <w:szCs w:val="16"/>
+              </w:rPr>
+              <w:t xml:space="preserve">{{calc.dcf.etapa2.filas[].fcff|0}}</w:t>
+            </w:r>
+          </w:p>
+        </w:tc>
+        <w:tc>
+          <w:tcPr>
+            <w:tcW w:type="dxa" w:w="1101"/>
+            <w:tcBorders>
+              <w:top w:val="none" w:color="FFFFFF" w:sz="0"/>
+              <w:left w:val="none" w:color="FFFFFF" w:sz="0"/>
+              <w:bottom w:val="single" w:color="D9D8D3" w:sz="4"/>
+              <w:right w:val="none" w:color="FFFFFF" w:sz="0"/>
+            </w:tcBorders>
+            <w:tcMar>
+              <w:top w:type="dxa" w:w="50"/>
+              <w:left w:type="dxa" w:w="80"/>
+              <w:bottom w:type="dxa" w:w="50"/>
+              <w:right w:type="dxa" w:w="80"/>
+            </w:tcMar>
+          </w:tcPr>
+          <w:p>
+            <w:pPr>
+              <w:spacing w:after="0" w:before="0"/>
+              <w:jc w:val="right"/>
+            </w:pPr>
+            <w:r>
+              <w:rPr>
+                <w:rFonts w:ascii="Calibri" w:cs="Calibri" w:eastAsia="Calibri" w:hAnsi="Calibri"/>
+                <w:b w:val="false"/>
+                <w:bCs w:val="false"/>
+                <w:color w:val="1F2A3C"/>
+                <w:sz w:val="16"/>
+                <w:szCs w:val="16"/>
+              </w:rPr>
+              <w:t xml:space="preserve">{{calc.dcf.etapa2.filas[].factor|3}}</w:t>
+            </w:r>
+          </w:p>
+        </w:tc>
+        <w:tc>
+          <w:tcPr>
+            <w:tcW w:type="dxa" w:w="1242"/>
+            <w:tcBorders>
+              <w:top w:val="none" w:color="FFFFFF" w:sz="0"/>
+              <w:left w:val="none" w:color="FFFFFF" w:sz="0"/>
+              <w:bottom w:val="single" w:color="D9D8D3" w:sz="4"/>
+              <w:right w:val="none" w:color="FFFFFF" w:sz="0"/>
+            </w:tcBorders>
+            <w:tcMar>
+              <w:top w:type="dxa" w:w="50"/>
+              <w:left w:type="dxa" w:w="80"/>
+              <w:bottom w:type="dxa" w:w="50"/>
+              <w:right w:type="dxa" w:w="80"/>
+            </w:tcMar>
+          </w:tcPr>
+          <w:p>
+            <w:pPr>
+              <w:spacing w:after="0" w:before="0"/>
+              <w:jc w:val="right"/>
+            </w:pPr>
+            <w:r>
+              <w:rPr>
+                <w:rFonts w:ascii="Calibri" w:cs="Calibri" w:eastAsia="Calibri" w:hAnsi="Calibri"/>
+                <w:b w:val="false"/>
+                <w:bCs w:val="false"/>
+                <w:color w:val="1F2A3C"/>
+                <w:sz w:val="16"/>
+                <w:szCs w:val="16"/>
+              </w:rPr>
+              <w:t xml:space="preserve">{{calc.dcf.etapa2.filas[].vp|0}}</w:t>
+            </w:r>
+          </w:p>
+        </w:tc>
+      </w:tr>
+    </w:tbl>
+    <w:p>
+      <w:pPr>
+        <w:spacing w:after="160" w:before="0"/>
+      </w:pPr>
+    </w:p>
+    <w:p>
+      <w:pPr>
+        <w:pStyle w:val="Nota"/>
+        <w:spacing w:after="100"/>
+      </w:pPr>
+      <w:r>
+        <w:t xml:space="preserve">Entre la proyección explícita y el valor terminal, el crecimiento baja en línea recta hasta el terminal; el margen y los ratios son los del último año explícito, y la inversión neta (capex − amortización) se reduce en proporción al crecimiento.</w:t>
+      </w:r>
+    </w:p>
+    <w:p>
+      <w:pPr>
+        <w:spacing w:after="0" w:before="0"/>
+      </w:pPr>
+      <w:r>
+        <w:rPr>
+          <w:color w:val="8A8984"/>
+          <w:sz w:val="2"/>
+          <w:szCs w:val="2"/>
+        </w:rPr>
+        <w:t xml:space="preserve">{{si:dcf.etapa2.justificacion}}</w:t>
+      </w:r>
+    </w:p>
+    <w:p>
+      <w:pPr>
+        <w:keepNext/>
+        <w:spacing w:after="100"/>
+      </w:pPr>
+      <w:r>
+        <w:rPr>
+          <w:b/>
+          <w:bCs/>
+        </w:rPr>
+        <w:t xml:space="preserve">Por qué el crecimiento dura más allá de la proyección.</w:t>
+      </w:r>
+    </w:p>
+    <w:p>
+      <w:pPr>
+        <w:spacing w:after="100"/>
+      </w:pPr>
+      <w:r>
+        <w:t xml:space="preserve">{{texto:dcf.etapa2.justificacion}}</w:t>
+      </w:r>
+    </w:p>
+    <w:p>
+      <w:pPr>
+        <w:spacing w:after="0" w:before="0"/>
+      </w:pPr>
+      <w:r>
+        <w:rPr>
+          <w:color w:val="8A8984"/>
+          <w:sz w:val="2"/>
+          <w:szCs w:val="2"/>
+        </w:rPr>
+        <w:t xml:space="preserve">{{fin:dcf.etapa2.justificacion}}</w:t>
+      </w:r>
+    </w:p>
+    <w:p>
+      <w:pPr>
+        <w:spacing w:after="0" w:before="0"/>
+      </w:pPr>
+      <w:r>
+        <w:rPr>
+          <w:color w:val="8A8984"/>
+          <w:sz w:val="2"/>
+          <w:szCs w:val="2"/>
+        </w:rPr>
+        <w:t xml:space="preserve">{{fin:calc.dcf.etapa2}}</w:t>
       </w:r>
     </w:p>
     <w:p>

</xml_diff>

<commit_message>
Portada: objetivo y rentabilidad con la prima del mercado junto a los propios
Con un Comprar que solo da la regla relativa, la portada enseñaba el objetivo absoluto (+4,5 % en On) junto a «Comprar».

Co-Authored-By: Claude Opus 5.5 <noreply@anthropic.com>
</commit_message>
<xml_diff>
--- a/verticales/empresa/plantilla.docx
+++ b/verticales/empresa/plantilla.docx
@@ -271,7 +271,7 @@
                 <w:sz w:val="26"/>
                 <w:szCs w:val="26"/>
               </w:rPr>
-              <w:t xml:space="preserve">{{calc.sintesis.valor_objetivo|2}} {{meta.divisa}}{{calc.recomendacion.valor_objetivo_txt|opc}}</w:t>
+              <w:t xml:space="preserve">{{calc.sintesis.valor_objetivo|2}} {{meta.divisa}}{{calc.recomendacion.valor_objetivo_txt|opc}}{{calc.recomendacion.objetivo_mercado_corto|opc}}</w:t>
             </w:r>
           </w:p>
         </w:tc>
@@ -319,7 +319,7 @@
                 <w:sz w:val="26"/>
                 <w:szCs w:val="26"/>
               </w:rPr>
-              <w:t xml:space="preserve">{{calc.recomendacion.rentabilidad_total_pct|+pct}}</w:t>
+              <w:t xml:space="preserve">{{calc.recomendacion.rentabilidad_total_pct|+pct}}{{calc.recomendacion.rentabilidad_mercado_corto|opc}}</w:t>
             </w:r>
           </w:p>
         </w:tc>

</xml_diff>

<commit_message>
Capa de sentimiento: sección 28 con foros y comentarios actuales, y subagente E
Co-Authored-By: Claude Opus 5.5 (1M context) <noreply@anthropic.com>
</commit_message>
<xml_diff>
--- a/verticales/empresa/plantilla.docx
+++ b/verticales/empresa/plantilla.docx
@@ -1819,7 +1819,7 @@
           <w:sz w:val="18"/>
           <w:szCs w:val="18"/>
         </w:rPr>
-        <w:t xml:space="preserve">Parte V — Tesis, riesgos y seguimiento: 24. Catalizadores · 25. Riesgos y pre-mortem · 26. ESG · 27. Preguntas abiertas</w:t>
+        <w:t xml:space="preserve">Parte V — Tesis, riesgos y seguimiento: 24. Catalizadores · 25. Riesgos y pre-mortem · 26. ESG · 27. Preguntas abiertas · 28. Sentimiento en foros y comentarios</w:t>
       </w:r>
     </w:p>
     <w:p>
@@ -33056,6 +33056,783 @@
           <w:szCs w:val="2"/>
         </w:rPr>
         <w:t xml:space="preserve">{{fin:preguntas}}</w:t>
+      </w:r>
+    </w:p>
+    <w:p>
+      <w:pPr>
+        <w:spacing w:after="0" w:before="0"/>
+      </w:pPr>
+      <w:r>
+        <w:rPr>
+          <w:color w:val="8A8984"/>
+          <w:sz w:val="2"/>
+          <w:szCs w:val="2"/>
+        </w:rPr>
+        <w:t xml:space="preserve">{{si:sentimiento|28. Sentimiento en foros y comentarios|Complemento}}</w:t>
+      </w:r>
+    </w:p>
+    <w:p>
+      <w:pPr>
+        <w:pStyle w:val="Heading1"/>
+      </w:pPr>
+      <w:r>
+        <w:t xml:space="preserve">28. Sentimiento en foros y comentarios</w:t>
+      </w:r>
+    </w:p>
+    <w:p>
+      <w:pPr>
+        <w:pStyle w:val="Confianza"/>
+        <w:spacing w:after="100"/>
+      </w:pPr>
+      <w:r>
+        <w:t xml:space="preserve">Confianza: {{sentimiento.confianza}}</w:t>
+      </w:r>
+    </w:p>
+    <w:p>
+      <w:pPr>
+        <w:spacing w:after="100"/>
+      </w:pPr>
+      <w:r>
+        <w:rPr>
+          <w:b/>
+          <w:bCs/>
+        </w:rPr>
+        <w:t xml:space="preserve">Tono:</w:t>
+      </w:r>
+      <w:r>
+        <w:t xml:space="preserve"> {{sentimiento.tono}} · </w:t>
+      </w:r>
+      <w:r>
+        <w:rPr>
+          <w:b/>
+          <w:bCs/>
+        </w:rPr>
+        <w:t xml:space="preserve">Tendencia:</w:t>
+      </w:r>
+      <w:r>
+        <w:t xml:space="preserve"> {{sentimiento.tendencia}}</w:t>
+      </w:r>
+    </w:p>
+    <w:tbl>
+      <w:tblPr>
+        <w:tblW w:type="dxa" w:w="9638"/>
+        <w:tblBorders>
+          <w:top w:val="single" w:color="auto" w:sz="4"/>
+          <w:left w:val="single" w:color="auto" w:sz="4"/>
+          <w:bottom w:val="single" w:color="auto" w:sz="4"/>
+          <w:right w:val="single" w:color="auto" w:sz="4"/>
+          <w:insideH w:val="single" w:color="auto" w:sz="4"/>
+          <w:insideV w:val="single" w:color="auto" w:sz="4"/>
+        </w:tblBorders>
+      </w:tblPr>
+      <w:tblGrid>
+        <w:gridCol w:w="2168"/>
+        <w:gridCol w:w="963"/>
+        <w:gridCol w:w="1084"/>
+        <w:gridCol w:w="1084"/>
+        <w:gridCol w:w="4339"/>
+      </w:tblGrid>
+      <w:tr>
+        <w:trPr>
+          <w:cantSplit/>
+          <w:tblHeader/>
+        </w:trPr>
+        <w:tc>
+          <w:tcPr>
+            <w:tcW w:type="dxa" w:w="2168"/>
+            <w:tcBorders>
+              <w:top w:val="none" w:color="FFFFFF" w:sz="0"/>
+              <w:left w:val="none" w:color="FFFFFF" w:sz="0"/>
+              <w:bottom w:val="none" w:color="FFFFFF" w:sz="0"/>
+              <w:right w:val="none" w:color="FFFFFF" w:sz="0"/>
+            </w:tcBorders>
+            <w:shd w:fill="1F3A5F" w:color="auto" w:val="clear"/>
+            <w:tcMar>
+              <w:top w:type="dxa" w:w="50"/>
+              <w:left w:type="dxa" w:w="80"/>
+              <w:bottom w:type="dxa" w:w="50"/>
+              <w:right w:type="dxa" w:w="80"/>
+            </w:tcMar>
+          </w:tcPr>
+          <w:p>
+            <w:pPr>
+              <w:spacing w:after="0" w:before="0"/>
+              <w:jc w:val="left"/>
+            </w:pPr>
+            <w:r>
+              <w:rPr>
+                <w:rFonts w:ascii="Calibri" w:cs="Calibri" w:eastAsia="Calibri" w:hAnsi="Calibri"/>
+                <w:b/>
+                <w:bCs/>
+                <w:color w:val="FFFFFF"/>
+                <w:sz w:val="16"/>
+                <w:szCs w:val="16"/>
+              </w:rPr>
+              <w:t xml:space="preserve">Dónde</w:t>
+            </w:r>
+          </w:p>
+        </w:tc>
+        <w:tc>
+          <w:tcPr>
+            <w:tcW w:type="dxa" w:w="963"/>
+            <w:tcBorders>
+              <w:top w:val="none" w:color="FFFFFF" w:sz="0"/>
+              <w:left w:val="none" w:color="FFFFFF" w:sz="0"/>
+              <w:bottom w:val="none" w:color="FFFFFF" w:sz="0"/>
+              <w:right w:val="none" w:color="FFFFFF" w:sz="0"/>
+            </w:tcBorders>
+            <w:shd w:fill="1F3A5F" w:color="auto" w:val="clear"/>
+            <w:tcMar>
+              <w:top w:type="dxa" w:w="50"/>
+              <w:left w:type="dxa" w:w="80"/>
+              <w:bottom w:type="dxa" w:w="50"/>
+              <w:right w:type="dxa" w:w="80"/>
+            </w:tcMar>
+          </w:tcPr>
+          <w:p>
+            <w:pPr>
+              <w:spacing w:after="0" w:before="0"/>
+              <w:jc w:val="left"/>
+            </w:pPr>
+            <w:r>
+              <w:rPr>
+                <w:rFonts w:ascii="Calibri" w:cs="Calibri" w:eastAsia="Calibri" w:hAnsi="Calibri"/>
+                <w:b/>
+                <w:bCs/>
+                <w:color w:val="FFFFFF"/>
+                <w:sz w:val="16"/>
+                <w:szCs w:val="16"/>
+              </w:rPr>
+              <w:t xml:space="preserve">Fecha</w:t>
+            </w:r>
+          </w:p>
+        </w:tc>
+        <w:tc>
+          <w:tcPr>
+            <w:tcW w:type="dxa" w:w="1084"/>
+            <w:tcBorders>
+              <w:top w:val="none" w:color="FFFFFF" w:sz="0"/>
+              <w:left w:val="none" w:color="FFFFFF" w:sz="0"/>
+              <w:bottom w:val="none" w:color="FFFFFF" w:sz="0"/>
+              <w:right w:val="none" w:color="FFFFFF" w:sz="0"/>
+            </w:tcBorders>
+            <w:shd w:fill="1F3A5F" w:color="auto" w:val="clear"/>
+            <w:tcMar>
+              <w:top w:type="dxa" w:w="50"/>
+              <w:left w:type="dxa" w:w="80"/>
+              <w:bottom w:type="dxa" w:w="50"/>
+              <w:right w:type="dxa" w:w="80"/>
+            </w:tcMar>
+          </w:tcPr>
+          <w:p>
+            <w:pPr>
+              <w:spacing w:after="0" w:before="0"/>
+              <w:jc w:val="right"/>
+            </w:pPr>
+            <w:r>
+              <w:rPr>
+                <w:rFonts w:ascii="Calibri" w:cs="Calibri" w:eastAsia="Calibri" w:hAnsi="Calibri"/>
+                <w:b/>
+                <w:bCs/>
+                <w:color w:val="FFFFFF"/>
+                <w:sz w:val="16"/>
+                <w:szCs w:val="16"/>
+              </w:rPr>
+              <w:t xml:space="preserve">Comentarios</w:t>
+            </w:r>
+          </w:p>
+        </w:tc>
+        <w:tc>
+          <w:tcPr>
+            <w:tcW w:type="dxa" w:w="1084"/>
+            <w:tcBorders>
+              <w:top w:val="none" w:color="FFFFFF" w:sz="0"/>
+              <w:left w:val="none" w:color="FFFFFF" w:sz="0"/>
+              <w:bottom w:val="none" w:color="FFFFFF" w:sz="0"/>
+              <w:right w:val="none" w:color="FFFFFF" w:sz="0"/>
+            </w:tcBorders>
+            <w:shd w:fill="1F3A5F" w:color="auto" w:val="clear"/>
+            <w:tcMar>
+              <w:top w:type="dxa" w:w="50"/>
+              <w:left w:type="dxa" w:w="80"/>
+              <w:bottom w:type="dxa" w:w="50"/>
+              <w:right w:type="dxa" w:w="80"/>
+            </w:tcMar>
+          </w:tcPr>
+          <w:p>
+            <w:pPr>
+              <w:spacing w:after="0" w:before="0"/>
+              <w:jc w:val="center"/>
+            </w:pPr>
+            <w:r>
+              <w:rPr>
+                <w:rFonts w:ascii="Calibri" w:cs="Calibri" w:eastAsia="Calibri" w:hAnsi="Calibri"/>
+                <w:b/>
+                <w:bCs/>
+                <w:color w:val="FFFFFF"/>
+                <w:sz w:val="16"/>
+                <w:szCs w:val="16"/>
+              </w:rPr>
+              <w:t xml:space="preserve">Tono</w:t>
+            </w:r>
+          </w:p>
+        </w:tc>
+        <w:tc>
+          <w:tcPr>
+            <w:tcW w:type="dxa" w:w="4339"/>
+            <w:tcBorders>
+              <w:top w:val="none" w:color="FFFFFF" w:sz="0"/>
+              <w:left w:val="none" w:color="FFFFFF" w:sz="0"/>
+              <w:bottom w:val="none" w:color="FFFFFF" w:sz="0"/>
+              <w:right w:val="none" w:color="FFFFFF" w:sz="0"/>
+            </w:tcBorders>
+            <w:shd w:fill="1F3A5F" w:color="auto" w:val="clear"/>
+            <w:tcMar>
+              <w:top w:type="dxa" w:w="50"/>
+              <w:left w:type="dxa" w:w="80"/>
+              <w:bottom w:type="dxa" w:w="50"/>
+              <w:right w:type="dxa" w:w="80"/>
+            </w:tcMar>
+          </w:tcPr>
+          <w:p>
+            <w:pPr>
+              <w:spacing w:after="0" w:before="0"/>
+              <w:jc w:val="left"/>
+            </w:pPr>
+            <w:r>
+              <w:rPr>
+                <w:rFonts w:ascii="Calibri" w:cs="Calibri" w:eastAsia="Calibri" w:hAnsi="Calibri"/>
+                <w:b/>
+                <w:bCs/>
+                <w:color w:val="FFFFFF"/>
+                <w:sz w:val="16"/>
+                <w:szCs w:val="16"/>
+              </w:rPr>
+              <w:t xml:space="preserve">Qué se dice</w:t>
+            </w:r>
+          </w:p>
+        </w:tc>
+      </w:tr>
+      <w:tr>
+        <w:trPr>
+          <w:cantSplit/>
+        </w:trPr>
+        <w:tc>
+          <w:tcPr>
+            <w:tcW w:type="dxa" w:w="2168"/>
+            <w:tcBorders>
+              <w:top w:val="none" w:color="FFFFFF" w:sz="0"/>
+              <w:left w:val="none" w:color="FFFFFF" w:sz="0"/>
+              <w:bottom w:val="single" w:color="D9D8D3" w:sz="4"/>
+              <w:right w:val="none" w:color="FFFFFF" w:sz="0"/>
+            </w:tcBorders>
+            <w:tcMar>
+              <w:top w:type="dxa" w:w="50"/>
+              <w:left w:type="dxa" w:w="80"/>
+              <w:bottom w:type="dxa" w:w="50"/>
+              <w:right w:type="dxa" w:w="80"/>
+            </w:tcMar>
+          </w:tcPr>
+          <w:p>
+            <w:pPr>
+              <w:spacing w:after="0" w:before="0"/>
+              <w:jc w:val="left"/>
+            </w:pPr>
+            <w:r>
+              <w:rPr>
+                <w:rFonts w:ascii="Calibri" w:cs="Calibri" w:eastAsia="Calibri" w:hAnsi="Calibri"/>
+                <w:b/>
+                <w:bCs/>
+                <w:color w:val="1F2A3C"/>
+                <w:sz w:val="16"/>
+                <w:szCs w:val="16"/>
+              </w:rPr>
+              <w:t xml:space="preserve">{{sentimiento.revisadas[].plataforma}}</w:t>
+            </w:r>
+          </w:p>
+        </w:tc>
+        <w:tc>
+          <w:tcPr>
+            <w:tcW w:type="dxa" w:w="963"/>
+            <w:tcBorders>
+              <w:top w:val="none" w:color="FFFFFF" w:sz="0"/>
+              <w:left w:val="none" w:color="FFFFFF" w:sz="0"/>
+              <w:bottom w:val="single" w:color="D9D8D3" w:sz="4"/>
+              <w:right w:val="none" w:color="FFFFFF" w:sz="0"/>
+            </w:tcBorders>
+            <w:tcMar>
+              <w:top w:type="dxa" w:w="50"/>
+              <w:left w:type="dxa" w:w="80"/>
+              <w:bottom w:type="dxa" w:w="50"/>
+              <w:right w:type="dxa" w:w="80"/>
+            </w:tcMar>
+          </w:tcPr>
+          <w:p>
+            <w:pPr>
+              <w:spacing w:after="0" w:before="0"/>
+              <w:jc w:val="left"/>
+            </w:pPr>
+            <w:r>
+              <w:rPr>
+                <w:rFonts w:ascii="Calibri" w:cs="Calibri" w:eastAsia="Calibri" w:hAnsi="Calibri"/>
+                <w:b w:val="false"/>
+                <w:bCs w:val="false"/>
+                <w:color w:val="1F2A3C"/>
+                <w:sz w:val="16"/>
+                <w:szCs w:val="16"/>
+              </w:rPr>
+              <w:t xml:space="preserve">{{sentimiento.revisadas[].fecha}}</w:t>
+            </w:r>
+          </w:p>
+        </w:tc>
+        <w:tc>
+          <w:tcPr>
+            <w:tcW w:type="dxa" w:w="1084"/>
+            <w:tcBorders>
+              <w:top w:val="none" w:color="FFFFFF" w:sz="0"/>
+              <w:left w:val="none" w:color="FFFFFF" w:sz="0"/>
+              <w:bottom w:val="single" w:color="D9D8D3" w:sz="4"/>
+              <w:right w:val="none" w:color="FFFFFF" w:sz="0"/>
+            </w:tcBorders>
+            <w:tcMar>
+              <w:top w:type="dxa" w:w="50"/>
+              <w:left w:type="dxa" w:w="80"/>
+              <w:bottom w:type="dxa" w:w="50"/>
+              <w:right w:type="dxa" w:w="80"/>
+            </w:tcMar>
+          </w:tcPr>
+          <w:p>
+            <w:pPr>
+              <w:spacing w:after="0" w:before="0"/>
+              <w:jc w:val="right"/>
+            </w:pPr>
+            <w:r>
+              <w:rPr>
+                <w:rFonts w:ascii="Calibri" w:cs="Calibri" w:eastAsia="Calibri" w:hAnsi="Calibri"/>
+                <w:b w:val="false"/>
+                <w:bCs w:val="false"/>
+                <w:color w:val="1F2A3C"/>
+                <w:sz w:val="16"/>
+                <w:szCs w:val="16"/>
+              </w:rPr>
+              <w:t xml:space="preserve">{{sentimiento.revisadas[].n_comentarios|0}}</w:t>
+            </w:r>
+          </w:p>
+        </w:tc>
+        <w:tc>
+          <w:tcPr>
+            <w:tcW w:type="dxa" w:w="1084"/>
+            <w:tcBorders>
+              <w:top w:val="none" w:color="FFFFFF" w:sz="0"/>
+              <w:left w:val="none" w:color="FFFFFF" w:sz="0"/>
+              <w:bottom w:val="single" w:color="D9D8D3" w:sz="4"/>
+              <w:right w:val="none" w:color="FFFFFF" w:sz="0"/>
+            </w:tcBorders>
+            <w:tcMar>
+              <w:top w:type="dxa" w:w="50"/>
+              <w:left w:type="dxa" w:w="80"/>
+              <w:bottom w:type="dxa" w:w="50"/>
+              <w:right w:type="dxa" w:w="80"/>
+            </w:tcMar>
+          </w:tcPr>
+          <w:p>
+            <w:pPr>
+              <w:spacing w:after="0" w:before="0"/>
+              <w:jc w:val="center"/>
+            </w:pPr>
+            <w:r>
+              <w:rPr>
+                <w:rFonts w:ascii="Calibri" w:cs="Calibri" w:eastAsia="Calibri" w:hAnsi="Calibri"/>
+                <w:b w:val="false"/>
+                <w:bCs w:val="false"/>
+                <w:color w:val="1F2A3C"/>
+                <w:sz w:val="16"/>
+                <w:szCs w:val="16"/>
+              </w:rPr>
+              <w:t xml:space="preserve">{{sentimiento.revisadas[].tono}}</w:t>
+            </w:r>
+          </w:p>
+        </w:tc>
+        <w:tc>
+          <w:tcPr>
+            <w:tcW w:type="dxa" w:w="4339"/>
+            <w:tcBorders>
+              <w:top w:val="none" w:color="FFFFFF" w:sz="0"/>
+              <w:left w:val="none" w:color="FFFFFF" w:sz="0"/>
+              <w:bottom w:val="single" w:color="D9D8D3" w:sz="4"/>
+              <w:right w:val="none" w:color="FFFFFF" w:sz="0"/>
+            </w:tcBorders>
+            <w:tcMar>
+              <w:top w:type="dxa" w:w="50"/>
+              <w:left w:type="dxa" w:w="80"/>
+              <w:bottom w:type="dxa" w:w="50"/>
+              <w:right w:type="dxa" w:w="80"/>
+            </w:tcMar>
+          </w:tcPr>
+          <w:p>
+            <w:pPr>
+              <w:spacing w:after="0" w:before="0"/>
+              <w:jc w:val="left"/>
+            </w:pPr>
+            <w:r>
+              <w:rPr>
+                <w:rFonts w:ascii="Calibri" w:cs="Calibri" w:eastAsia="Calibri" w:hAnsi="Calibri"/>
+                <w:b w:val="false"/>
+                <w:bCs w:val="false"/>
+                <w:color w:val="1F2A3C"/>
+                <w:sz w:val="16"/>
+                <w:szCs w:val="16"/>
+              </w:rPr>
+              <w:t xml:space="preserve">{{sentimiento.revisadas[].resumen}}</w:t>
+            </w:r>
+          </w:p>
+        </w:tc>
+      </w:tr>
+    </w:tbl>
+    <w:p>
+      <w:pPr>
+        <w:spacing w:after="160" w:before="0"/>
+      </w:pPr>
+    </w:p>
+    <w:tbl>
+      <w:tblPr>
+        <w:tblW w:type="dxa" w:w="9638"/>
+        <w:tblBorders>
+          <w:top w:val="single" w:color="auto" w:sz="4"/>
+          <w:left w:val="single" w:color="auto" w:sz="4"/>
+          <w:bottom w:val="single" w:color="auto" w:sz="4"/>
+          <w:right w:val="single" w:color="auto" w:sz="4"/>
+          <w:insideH w:val="single" w:color="auto" w:sz="4"/>
+          <w:insideV w:val="single" w:color="auto" w:sz="4"/>
+        </w:tblBorders>
+      </w:tblPr>
+      <w:tblGrid>
+        <w:gridCol w:w="2202"/>
+        <w:gridCol w:w="1239"/>
+        <w:gridCol w:w="963"/>
+        <w:gridCol w:w="5234"/>
+      </w:tblGrid>
+      <w:tr>
+        <w:trPr>
+          <w:cantSplit/>
+          <w:tblHeader/>
+        </w:trPr>
+        <w:tc>
+          <w:tcPr>
+            <w:tcW w:type="dxa" w:w="2202"/>
+            <w:tcBorders>
+              <w:top w:val="none" w:color="FFFFFF" w:sz="0"/>
+              <w:left w:val="none" w:color="FFFFFF" w:sz="0"/>
+              <w:bottom w:val="none" w:color="FFFFFF" w:sz="0"/>
+              <w:right w:val="none" w:color="FFFFFF" w:sz="0"/>
+            </w:tcBorders>
+            <w:shd w:fill="1F3A5F" w:color="auto" w:val="clear"/>
+            <w:tcMar>
+              <w:top w:type="dxa" w:w="50"/>
+              <w:left w:type="dxa" w:w="80"/>
+              <w:bottom w:type="dxa" w:w="50"/>
+              <w:right w:type="dxa" w:w="80"/>
+            </w:tcMar>
+          </w:tcPr>
+          <w:p>
+            <w:pPr>
+              <w:spacing w:after="0" w:before="0"/>
+              <w:jc w:val="left"/>
+            </w:pPr>
+            <w:r>
+              <w:rPr>
+                <w:rFonts w:ascii="Calibri" w:cs="Calibri" w:eastAsia="Calibri" w:hAnsi="Calibri"/>
+                <w:b/>
+                <w:bCs/>
+                <w:color w:val="FFFFFF"/>
+                <w:sz w:val="16"/>
+                <w:szCs w:val="16"/>
+              </w:rPr>
+              <w:t xml:space="preserve">Tema</w:t>
+            </w:r>
+          </w:p>
+        </w:tc>
+        <w:tc>
+          <w:tcPr>
+            <w:tcW w:type="dxa" w:w="1239"/>
+            <w:tcBorders>
+              <w:top w:val="none" w:color="FFFFFF" w:sz="0"/>
+              <w:left w:val="none" w:color="FFFFFF" w:sz="0"/>
+              <w:bottom w:val="none" w:color="FFFFFF" w:sz="0"/>
+              <w:right w:val="none" w:color="FFFFFF" w:sz="0"/>
+            </w:tcBorders>
+            <w:shd w:fill="1F3A5F" w:color="auto" w:val="clear"/>
+            <w:tcMar>
+              <w:top w:type="dxa" w:w="50"/>
+              <w:left w:type="dxa" w:w="80"/>
+              <w:bottom w:type="dxa" w:w="50"/>
+              <w:right w:type="dxa" w:w="80"/>
+            </w:tcMar>
+          </w:tcPr>
+          <w:p>
+            <w:pPr>
+              <w:spacing w:after="0" w:before="0"/>
+              <w:jc w:val="center"/>
+            </w:pPr>
+            <w:r>
+              <w:rPr>
+                <w:rFonts w:ascii="Calibri" w:cs="Calibri" w:eastAsia="Calibri" w:hAnsi="Calibri"/>
+                <w:b/>
+                <w:bCs/>
+                <w:color w:val="FFFFFF"/>
+                <w:sz w:val="16"/>
+                <w:szCs w:val="16"/>
+              </w:rPr>
+              <w:t xml:space="preserve">Postura</w:t>
+            </w:r>
+          </w:p>
+        </w:tc>
+        <w:tc>
+          <w:tcPr>
+            <w:tcW w:type="dxa" w:w="963"/>
+            <w:tcBorders>
+              <w:top w:val="none" w:color="FFFFFF" w:sz="0"/>
+              <w:left w:val="none" w:color="FFFFFF" w:sz="0"/>
+              <w:bottom w:val="none" w:color="FFFFFF" w:sz="0"/>
+              <w:right w:val="none" w:color="FFFFFF" w:sz="0"/>
+            </w:tcBorders>
+            <w:shd w:fill="1F3A5F" w:color="auto" w:val="clear"/>
+            <w:tcMar>
+              <w:top w:type="dxa" w:w="50"/>
+              <w:left w:type="dxa" w:w="80"/>
+              <w:bottom w:type="dxa" w:w="50"/>
+              <w:right w:type="dxa" w:w="80"/>
+            </w:tcMar>
+          </w:tcPr>
+          <w:p>
+            <w:pPr>
+              <w:spacing w:after="0" w:before="0"/>
+              <w:jc w:val="center"/>
+            </w:pPr>
+            <w:r>
+              <w:rPr>
+                <w:rFonts w:ascii="Calibri" w:cs="Calibri" w:eastAsia="Calibri" w:hAnsi="Calibri"/>
+                <w:b/>
+                <w:bCs/>
+                <w:color w:val="FFFFFF"/>
+                <w:sz w:val="16"/>
+                <w:szCs w:val="16"/>
+              </w:rPr>
+              <w:t xml:space="preserve">Peso</w:t>
+            </w:r>
+          </w:p>
+        </w:tc>
+        <w:tc>
+          <w:tcPr>
+            <w:tcW w:type="dxa" w:w="5234"/>
+            <w:tcBorders>
+              <w:top w:val="none" w:color="FFFFFF" w:sz="0"/>
+              <w:left w:val="none" w:color="FFFFFF" w:sz="0"/>
+              <w:bottom w:val="none" w:color="FFFFFF" w:sz="0"/>
+              <w:right w:val="none" w:color="FFFFFF" w:sz="0"/>
+            </w:tcBorders>
+            <w:shd w:fill="1F3A5F" w:color="auto" w:val="clear"/>
+            <w:tcMar>
+              <w:top w:type="dxa" w:w="50"/>
+              <w:left w:type="dxa" w:w="80"/>
+              <w:bottom w:type="dxa" w:w="50"/>
+              <w:right w:type="dxa" w:w="80"/>
+            </w:tcMar>
+          </w:tcPr>
+          <w:p>
+            <w:pPr>
+              <w:spacing w:after="0" w:before="0"/>
+              <w:jc w:val="left"/>
+            </w:pPr>
+            <w:r>
+              <w:rPr>
+                <w:rFonts w:ascii="Calibri" w:cs="Calibri" w:eastAsia="Calibri" w:hAnsi="Calibri"/>
+                <w:b/>
+                <w:bCs/>
+                <w:color w:val="FFFFFF"/>
+                <w:sz w:val="16"/>
+                <w:szCs w:val="16"/>
+              </w:rPr>
+              <w:t xml:space="preserve">Qué dicen los datos</w:t>
+            </w:r>
+          </w:p>
+        </w:tc>
+      </w:tr>
+      <w:tr>
+        <w:trPr>
+          <w:cantSplit/>
+        </w:trPr>
+        <w:tc>
+          <w:tcPr>
+            <w:tcW w:type="dxa" w:w="2202"/>
+            <w:tcBorders>
+              <w:top w:val="none" w:color="FFFFFF" w:sz="0"/>
+              <w:left w:val="none" w:color="FFFFFF" w:sz="0"/>
+              <w:bottom w:val="single" w:color="D9D8D3" w:sz="4"/>
+              <w:right w:val="none" w:color="FFFFFF" w:sz="0"/>
+            </w:tcBorders>
+            <w:tcMar>
+              <w:top w:type="dxa" w:w="50"/>
+              <w:left w:type="dxa" w:w="80"/>
+              <w:bottom w:type="dxa" w:w="50"/>
+              <w:right w:type="dxa" w:w="80"/>
+            </w:tcMar>
+          </w:tcPr>
+          <w:p>
+            <w:pPr>
+              <w:spacing w:after="0" w:before="0"/>
+              <w:jc w:val="left"/>
+            </w:pPr>
+            <w:r>
+              <w:rPr>
+                <w:rFonts w:ascii="Calibri" w:cs="Calibri" w:eastAsia="Calibri" w:hAnsi="Calibri"/>
+                <w:b/>
+                <w:bCs/>
+                <w:color w:val="1F2A3C"/>
+                <w:sz w:val="16"/>
+                <w:szCs w:val="16"/>
+              </w:rPr>
+              <w:t xml:space="preserve">{{sentimiento.temas[].tema}}</w:t>
+            </w:r>
+          </w:p>
+        </w:tc>
+        <w:tc>
+          <w:tcPr>
+            <w:tcW w:type="dxa" w:w="1239"/>
+            <w:tcBorders>
+              <w:top w:val="none" w:color="FFFFFF" w:sz="0"/>
+              <w:left w:val="none" w:color="FFFFFF" w:sz="0"/>
+              <w:bottom w:val="single" w:color="D9D8D3" w:sz="4"/>
+              <w:right w:val="none" w:color="FFFFFF" w:sz="0"/>
+            </w:tcBorders>
+            <w:tcMar>
+              <w:top w:type="dxa" w:w="50"/>
+              <w:left w:type="dxa" w:w="80"/>
+              <w:bottom w:type="dxa" w:w="50"/>
+              <w:right w:type="dxa" w:w="80"/>
+            </w:tcMar>
+          </w:tcPr>
+          <w:p>
+            <w:pPr>
+              <w:spacing w:after="0" w:before="0"/>
+              <w:jc w:val="center"/>
+            </w:pPr>
+            <w:r>
+              <w:rPr>
+                <w:rFonts w:ascii="Calibri" w:cs="Calibri" w:eastAsia="Calibri" w:hAnsi="Calibri"/>
+                <w:b w:val="false"/>
+                <w:bCs w:val="false"/>
+                <w:color w:val="1F2A3C"/>
+                <w:sz w:val="16"/>
+                <w:szCs w:val="16"/>
+              </w:rPr>
+              <w:t xml:space="preserve">{{sentimiento.temas[].postura}}</w:t>
+            </w:r>
+          </w:p>
+        </w:tc>
+        <w:tc>
+          <w:tcPr>
+            <w:tcW w:type="dxa" w:w="963"/>
+            <w:tcBorders>
+              <w:top w:val="none" w:color="FFFFFF" w:sz="0"/>
+              <w:left w:val="none" w:color="FFFFFF" w:sz="0"/>
+              <w:bottom w:val="single" w:color="D9D8D3" w:sz="4"/>
+              <w:right w:val="none" w:color="FFFFFF" w:sz="0"/>
+            </w:tcBorders>
+            <w:tcMar>
+              <w:top w:type="dxa" w:w="50"/>
+              <w:left w:type="dxa" w:w="80"/>
+              <w:bottom w:type="dxa" w:w="50"/>
+              <w:right w:type="dxa" w:w="80"/>
+            </w:tcMar>
+          </w:tcPr>
+          <w:p>
+            <w:pPr>
+              <w:spacing w:after="0" w:before="0"/>
+              <w:jc w:val="center"/>
+            </w:pPr>
+            <w:r>
+              <w:rPr>
+                <w:rFonts w:ascii="Calibri" w:cs="Calibri" w:eastAsia="Calibri" w:hAnsi="Calibri"/>
+                <w:b w:val="false"/>
+                <w:bCs w:val="false"/>
+                <w:color w:val="1F2A3C"/>
+                <w:sz w:val="16"/>
+                <w:szCs w:val="16"/>
+              </w:rPr>
+              <w:t xml:space="preserve">{{sentimiento.temas[].peso}}</w:t>
+            </w:r>
+          </w:p>
+        </w:tc>
+        <w:tc>
+          <w:tcPr>
+            <w:tcW w:type="dxa" w:w="5234"/>
+            <w:tcBorders>
+              <w:top w:val="none" w:color="FFFFFF" w:sz="0"/>
+              <w:left w:val="none" w:color="FFFFFF" w:sz="0"/>
+              <w:bottom w:val="single" w:color="D9D8D3" w:sz="4"/>
+              <w:right w:val="none" w:color="FFFFFF" w:sz="0"/>
+            </w:tcBorders>
+            <w:tcMar>
+              <w:top w:type="dxa" w:w="50"/>
+              <w:left w:type="dxa" w:w="80"/>
+              <w:bottom w:type="dxa" w:w="50"/>
+              <w:right w:type="dxa" w:w="80"/>
+            </w:tcMar>
+          </w:tcPr>
+          <w:p>
+            <w:pPr>
+              <w:spacing w:after="0" w:before="0"/>
+              <w:jc w:val="left"/>
+            </w:pPr>
+            <w:r>
+              <w:rPr>
+                <w:rFonts w:ascii="Calibri" w:cs="Calibri" w:eastAsia="Calibri" w:hAnsi="Calibri"/>
+                <w:b w:val="false"/>
+                <w:bCs w:val="false"/>
+                <w:color w:val="1F2A3C"/>
+                <w:sz w:val="16"/>
+                <w:szCs w:val="16"/>
+              </w:rPr>
+              <w:t xml:space="preserve">{{sentimiento.temas[].contraste}}</w:t>
+            </w:r>
+          </w:p>
+        </w:tc>
+      </w:tr>
+    </w:tbl>
+    <w:p>
+      <w:pPr>
+        <w:spacing w:after="160" w:before="0"/>
+      </w:pPr>
+    </w:p>
+    <w:p>
+      <w:pPr>
+        <w:spacing w:after="100"/>
+      </w:pPr>
+      <w:r>
+        <w:t xml:space="preserve">{{texto:sentimiento.lectura}}</w:t>
+      </w:r>
+    </w:p>
+    <w:p>
+      <w:pPr>
+        <w:pStyle w:val="Nota"/>
+        <w:spacing w:after="100"/>
+      </w:pPr>
+      <w:r>
+        <w:t xml:space="preserve">Opiniones de inversores en foros, redes y comentarios de prensa: sirven para saber qué preocupa o entusiasma al mercado, no como fuente de cifras. No entran en la valoración.</w:t>
+      </w:r>
+    </w:p>
+    <w:p>
+      <w:pPr>
+        <w:spacing w:after="0" w:before="0"/>
+      </w:pPr>
+      <w:r>
+        <w:rPr>
+          <w:color w:val="8A8984"/>
+          <w:sz w:val="2"/>
+          <w:szCs w:val="2"/>
+        </w:rPr>
+        <w:t xml:space="preserve">{{fin:sentimiento}}</w:t>
       </w:r>
     </w:p>
     <w:p>

</xml_diff>

<commit_message>
Sostenibilidad del crecimiento en el DCF: puente volumen × precio, cuota implícita, reinversión y veredicto; aplicada a Constellation y Auto Trader
Co-Authored-By: Claude Opus 5.5 (1M context) <noreply@anthropic.com>
</commit_message>
<xml_diff>
--- a/verticales/empresa/plantilla.docx
+++ b/verticales/empresa/plantilla.docx
@@ -29040,6 +29040,690 @@
           <w:szCs w:val="2"/>
         </w:rPr>
         <w:t xml:space="preserve">{{fin:calc.dcf.sensibilidad2}}</w:t>
+      </w:r>
+    </w:p>
+    <w:p>
+      <w:pPr>
+        <w:spacing w:after="0" w:before="0"/>
+      </w:pPr>
+      <w:r>
+        <w:rPr>
+          <w:color w:val="8A8984"/>
+          <w:sz w:val="2"/>
+          <w:szCs w:val="2"/>
+        </w:rPr>
+        <w:t xml:space="preserve">{{si:calc.dcf.sostenibilidad,dcf.sostenibilidad}}</w:t>
+      </w:r>
+    </w:p>
+    <w:p>
+      <w:pPr>
+        <w:pStyle w:val="Heading2"/>
+      </w:pPr>
+      <w:r>
+        <w:t xml:space="preserve">¿Puede la empresa sostener el crecimiento previsto?</w:t>
+      </w:r>
+    </w:p>
+    <w:p>
+      <w:pPr>
+        <w:spacing w:after="100"/>
+      </w:pPr>
+      <w:r>
+        <w:rPr>
+          <w:b/>
+          <w:bCs/>
+        </w:rPr>
+        <w:t xml:space="preserve">Veredicto: {{dcf.sostenibilidad.veredicto}}.</w:t>
+      </w:r>
+    </w:p>
+    <w:tbl>
+      <w:tblPr>
+        <w:tblW w:type="dxa" w:w="9638"/>
+        <w:tblBorders>
+          <w:top w:val="single" w:color="auto" w:sz="4"/>
+          <w:left w:val="single" w:color="auto" w:sz="4"/>
+          <w:bottom w:val="single" w:color="auto" w:sz="4"/>
+          <w:right w:val="single" w:color="auto" w:sz="4"/>
+          <w:insideH w:val="single" w:color="auto" w:sz="4"/>
+          <w:insideV w:val="single" w:color="auto" w:sz="4"/>
+        </w:tblBorders>
+      </w:tblPr>
+      <w:tblGrid>
+        <w:gridCol w:w="6646"/>
+        <w:gridCol w:w="2992"/>
+      </w:tblGrid>
+      <w:tr>
+        <w:trPr>
+          <w:cantSplit/>
+          <w:tblHeader/>
+        </w:trPr>
+        <w:tc>
+          <w:tcPr>
+            <w:tcW w:type="dxa" w:w="6646"/>
+            <w:tcBorders>
+              <w:top w:val="none" w:color="FFFFFF" w:sz="0"/>
+              <w:left w:val="none" w:color="FFFFFF" w:sz="0"/>
+              <w:bottom w:val="none" w:color="FFFFFF" w:sz="0"/>
+              <w:right w:val="none" w:color="FFFFFF" w:sz="0"/>
+            </w:tcBorders>
+            <w:shd w:fill="1F3A5F" w:color="auto" w:val="clear"/>
+            <w:tcMar>
+              <w:top w:type="dxa" w:w="50"/>
+              <w:left w:type="dxa" w:w="80"/>
+              <w:bottom w:type="dxa" w:w="50"/>
+              <w:right w:type="dxa" w:w="80"/>
+            </w:tcMar>
+          </w:tcPr>
+          <w:p>
+            <w:pPr>
+              <w:spacing w:after="0" w:before="0"/>
+              <w:jc w:val="left"/>
+            </w:pPr>
+            <w:r>
+              <w:rPr>
+                <w:rFonts w:ascii="Calibri" w:cs="Calibri" w:eastAsia="Calibri" w:hAnsi="Calibri"/>
+                <w:b/>
+                <w:bCs/>
+                <w:color w:val="FFFFFF"/>
+                <w:sz w:val="16"/>
+                <w:szCs w:val="16"/>
+              </w:rPr>
+              <w:t xml:space="preserve">Prueba</w:t>
+            </w:r>
+          </w:p>
+        </w:tc>
+        <w:tc>
+          <w:tcPr>
+            <w:tcW w:type="dxa" w:w="2992"/>
+            <w:tcBorders>
+              <w:top w:val="none" w:color="FFFFFF" w:sz="0"/>
+              <w:left w:val="none" w:color="FFFFFF" w:sz="0"/>
+              <w:bottom w:val="none" w:color="FFFFFF" w:sz="0"/>
+              <w:right w:val="none" w:color="FFFFFF" w:sz="0"/>
+            </w:tcBorders>
+            <w:shd w:fill="1F3A5F" w:color="auto" w:val="clear"/>
+            <w:tcMar>
+              <w:top w:type="dxa" w:w="50"/>
+              <w:left w:type="dxa" w:w="80"/>
+              <w:bottom w:type="dxa" w:w="50"/>
+              <w:right w:type="dxa" w:w="80"/>
+            </w:tcMar>
+          </w:tcPr>
+          <w:p>
+            <w:pPr>
+              <w:spacing w:after="0" w:before="0"/>
+              <w:jc w:val="right"/>
+            </w:pPr>
+            <w:r>
+              <w:rPr>
+                <w:rFonts w:ascii="Calibri" w:cs="Calibri" w:eastAsia="Calibri" w:hAnsi="Calibri"/>
+                <w:b/>
+                <w:bCs/>
+                <w:color w:val="FFFFFF"/>
+                <w:sz w:val="16"/>
+                <w:szCs w:val="16"/>
+              </w:rPr>
+              <w:t xml:space="preserve">Valor</w:t>
+            </w:r>
+          </w:p>
+        </w:tc>
+      </w:tr>
+      <w:tr>
+        <w:trPr>
+          <w:cantSplit/>
+        </w:trPr>
+        <w:tc>
+          <w:tcPr>
+            <w:tcW w:type="dxa" w:w="6646"/>
+            <w:tcBorders>
+              <w:top w:val="none" w:color="FFFFFF" w:sz="0"/>
+              <w:left w:val="none" w:color="FFFFFF" w:sz="0"/>
+              <w:bottom w:val="single" w:color="D9D8D3" w:sz="4"/>
+              <w:right w:val="none" w:color="FFFFFF" w:sz="0"/>
+            </w:tcBorders>
+            <w:tcMar>
+              <w:top w:type="dxa" w:w="50"/>
+              <w:left w:type="dxa" w:w="80"/>
+              <w:bottom w:type="dxa" w:w="50"/>
+              <w:right w:type="dxa" w:w="80"/>
+            </w:tcMar>
+          </w:tcPr>
+          <w:p>
+            <w:pPr>
+              <w:spacing w:after="0" w:before="0"/>
+              <w:jc w:val="left"/>
+            </w:pPr>
+            <w:r>
+              <w:rPr>
+                <w:rFonts w:ascii="Calibri" w:cs="Calibri" w:eastAsia="Calibri" w:hAnsi="Calibri"/>
+                <w:b/>
+                <w:bCs/>
+                <w:color w:val="1F2A3C"/>
+                <w:sz w:val="16"/>
+                <w:szCs w:val="16"/>
+              </w:rPr>
+              <w:t xml:space="preserve">{{calc.dcf.sostenibilidad.tabla[].concepto}}</w:t>
+            </w:r>
+          </w:p>
+        </w:tc>
+        <w:tc>
+          <w:tcPr>
+            <w:tcW w:type="dxa" w:w="2992"/>
+            <w:tcBorders>
+              <w:top w:val="none" w:color="FFFFFF" w:sz="0"/>
+              <w:left w:val="none" w:color="FFFFFF" w:sz="0"/>
+              <w:bottom w:val="single" w:color="D9D8D3" w:sz="4"/>
+              <w:right w:val="none" w:color="FFFFFF" w:sz="0"/>
+            </w:tcBorders>
+            <w:tcMar>
+              <w:top w:type="dxa" w:w="50"/>
+              <w:left w:type="dxa" w:w="80"/>
+              <w:bottom w:type="dxa" w:w="50"/>
+              <w:right w:type="dxa" w:w="80"/>
+            </w:tcMar>
+          </w:tcPr>
+          <w:p>
+            <w:pPr>
+              <w:spacing w:after="0" w:before="0"/>
+              <w:jc w:val="right"/>
+            </w:pPr>
+            <w:r>
+              <w:rPr>
+                <w:rFonts w:ascii="Calibri" w:cs="Calibri" w:eastAsia="Calibri" w:hAnsi="Calibri"/>
+                <w:b w:val="false"/>
+                <w:bCs w:val="false"/>
+                <w:color w:val="1F2A3C"/>
+                <w:sz w:val="16"/>
+                <w:szCs w:val="16"/>
+              </w:rPr>
+              <w:t xml:space="preserve">{{calc.dcf.sostenibilidad.tabla[].valor}}</w:t>
+            </w:r>
+          </w:p>
+        </w:tc>
+      </w:tr>
+    </w:tbl>
+    <w:p>
+      <w:pPr>
+        <w:spacing w:after="160" w:before="0"/>
+      </w:pPr>
+    </w:p>
+    <w:p>
+      <w:pPr>
+        <w:spacing w:after="100"/>
+      </w:pPr>
+      <w:r>
+        <w:t xml:space="preserve">{{texto:calc.dcf.sostenibilidad.texto}}</w:t>
+      </w:r>
+    </w:p>
+    <w:tbl>
+      <w:tblPr>
+        <w:tblW w:type="dxa" w:w="9638"/>
+        <w:tblBorders>
+          <w:top w:val="single" w:color="auto" w:sz="4"/>
+          <w:left w:val="single" w:color="auto" w:sz="4"/>
+          <w:bottom w:val="single" w:color="auto" w:sz="4"/>
+          <w:right w:val="single" w:color="auto" w:sz="4"/>
+          <w:insideH w:val="single" w:color="auto" w:sz="4"/>
+          <w:insideV w:val="single" w:color="auto" w:sz="4"/>
+        </w:tblBorders>
+      </w:tblPr>
+      <w:tblGrid>
+        <w:gridCol w:w="1028"/>
+        <w:gridCol w:w="1028"/>
+        <w:gridCol w:w="1028"/>
+        <w:gridCol w:w="1285"/>
+        <w:gridCol w:w="1156"/>
+        <w:gridCol w:w="4113"/>
+      </w:tblGrid>
+      <w:tr>
+        <w:trPr>
+          <w:cantSplit/>
+          <w:tblHeader/>
+        </w:trPr>
+        <w:tc>
+          <w:tcPr>
+            <w:tcW w:type="dxa" w:w="1028"/>
+            <w:tcBorders>
+              <w:top w:val="none" w:color="FFFFFF" w:sz="0"/>
+              <w:left w:val="none" w:color="FFFFFF" w:sz="0"/>
+              <w:bottom w:val="none" w:color="FFFFFF" w:sz="0"/>
+              <w:right w:val="none" w:color="FFFFFF" w:sz="0"/>
+            </w:tcBorders>
+            <w:shd w:fill="1F3A5F" w:color="auto" w:val="clear"/>
+            <w:tcMar>
+              <w:top w:type="dxa" w:w="50"/>
+              <w:left w:type="dxa" w:w="80"/>
+              <w:bottom w:type="dxa" w:w="50"/>
+              <w:right w:type="dxa" w:w="80"/>
+            </w:tcMar>
+          </w:tcPr>
+          <w:p>
+            <w:pPr>
+              <w:spacing w:after="0" w:before="0"/>
+              <w:jc w:val="left"/>
+            </w:pPr>
+            <w:r>
+              <w:rPr>
+                <w:rFonts w:ascii="Calibri" w:cs="Calibri" w:eastAsia="Calibri" w:hAnsi="Calibri"/>
+                <w:b/>
+                <w:bCs/>
+                <w:color w:val="FFFFFF"/>
+                <w:sz w:val="16"/>
+                <w:szCs w:val="16"/>
+              </w:rPr>
+              <w:t xml:space="preserve">Año</w:t>
+            </w:r>
+          </w:p>
+        </w:tc>
+        <w:tc>
+          <w:tcPr>
+            <w:tcW w:type="dxa" w:w="1028"/>
+            <w:tcBorders>
+              <w:top w:val="none" w:color="FFFFFF" w:sz="0"/>
+              <w:left w:val="none" w:color="FFFFFF" w:sz="0"/>
+              <w:bottom w:val="none" w:color="FFFFFF" w:sz="0"/>
+              <w:right w:val="none" w:color="FFFFFF" w:sz="0"/>
+            </w:tcBorders>
+            <w:shd w:fill="1F3A5F" w:color="auto" w:val="clear"/>
+            <w:tcMar>
+              <w:top w:type="dxa" w:w="50"/>
+              <w:left w:type="dxa" w:w="80"/>
+              <w:bottom w:type="dxa" w:w="50"/>
+              <w:right w:type="dxa" w:w="80"/>
+            </w:tcMar>
+          </w:tcPr>
+          <w:p>
+            <w:pPr>
+              <w:spacing w:after="0" w:before="0"/>
+              <w:jc w:val="right"/>
+            </w:pPr>
+            <w:r>
+              <w:rPr>
+                <w:rFonts w:ascii="Calibri" w:cs="Calibri" w:eastAsia="Calibri" w:hAnsi="Calibri"/>
+                <w:b/>
+                <w:bCs/>
+                <w:color w:val="FFFFFF"/>
+                <w:sz w:val="16"/>
+                <w:szCs w:val="16"/>
+              </w:rPr>
+              <w:t xml:space="preserve">Volumen</w:t>
+            </w:r>
+          </w:p>
+        </w:tc>
+        <w:tc>
+          <w:tcPr>
+            <w:tcW w:type="dxa" w:w="1028"/>
+            <w:tcBorders>
+              <w:top w:val="none" w:color="FFFFFF" w:sz="0"/>
+              <w:left w:val="none" w:color="FFFFFF" w:sz="0"/>
+              <w:bottom w:val="none" w:color="FFFFFF" w:sz="0"/>
+              <w:right w:val="none" w:color="FFFFFF" w:sz="0"/>
+            </w:tcBorders>
+            <w:shd w:fill="1F3A5F" w:color="auto" w:val="clear"/>
+            <w:tcMar>
+              <w:top w:type="dxa" w:w="50"/>
+              <w:left w:type="dxa" w:w="80"/>
+              <w:bottom w:type="dxa" w:w="50"/>
+              <w:right w:type="dxa" w:w="80"/>
+            </w:tcMar>
+          </w:tcPr>
+          <w:p>
+            <w:pPr>
+              <w:spacing w:after="0" w:before="0"/>
+              <w:jc w:val="right"/>
+            </w:pPr>
+            <w:r>
+              <w:rPr>
+                <w:rFonts w:ascii="Calibri" w:cs="Calibri" w:eastAsia="Calibri" w:hAnsi="Calibri"/>
+                <w:b/>
+                <w:bCs/>
+                <w:color w:val="FFFFFF"/>
+                <w:sz w:val="16"/>
+                <w:szCs w:val="16"/>
+              </w:rPr>
+              <w:t xml:space="preserve">Precio</w:t>
+            </w:r>
+          </w:p>
+        </w:tc>
+        <w:tc>
+          <w:tcPr>
+            <w:tcW w:type="dxa" w:w="1285"/>
+            <w:tcBorders>
+              <w:top w:val="none" w:color="FFFFFF" w:sz="0"/>
+              <w:left w:val="none" w:color="FFFFFF" w:sz="0"/>
+              <w:bottom w:val="none" w:color="FFFFFF" w:sz="0"/>
+              <w:right w:val="none" w:color="FFFFFF" w:sz="0"/>
+            </w:tcBorders>
+            <w:shd w:fill="1F3A5F" w:color="auto" w:val="clear"/>
+            <w:tcMar>
+              <w:top w:type="dxa" w:w="50"/>
+              <w:left w:type="dxa" w:w="80"/>
+              <w:bottom w:type="dxa" w:w="50"/>
+              <w:right w:type="dxa" w:w="80"/>
+            </w:tcMar>
+          </w:tcPr>
+          <w:p>
+            <w:pPr>
+              <w:spacing w:after="0" w:before="0"/>
+              <w:jc w:val="right"/>
+            </w:pPr>
+            <w:r>
+              <w:rPr>
+                <w:rFonts w:ascii="Calibri" w:cs="Calibri" w:eastAsia="Calibri" w:hAnsi="Calibri"/>
+                <w:b/>
+                <w:bCs/>
+                <w:color w:val="FFFFFF"/>
+                <w:sz w:val="16"/>
+                <w:szCs w:val="16"/>
+              </w:rPr>
+              <w:t xml:space="preserve">Otros (mezcla, compras)</w:t>
+            </w:r>
+          </w:p>
+        </w:tc>
+        <w:tc>
+          <w:tcPr>
+            <w:tcW w:type="dxa" w:w="1156"/>
+            <w:tcBorders>
+              <w:top w:val="none" w:color="FFFFFF" w:sz="0"/>
+              <w:left w:val="none" w:color="FFFFFF" w:sz="0"/>
+              <w:bottom w:val="none" w:color="FFFFFF" w:sz="0"/>
+              <w:right w:val="none" w:color="FFFFFF" w:sz="0"/>
+            </w:tcBorders>
+            <w:shd w:fill="1F3A5F" w:color="auto" w:val="clear"/>
+            <w:tcMar>
+              <w:top w:type="dxa" w:w="50"/>
+              <w:left w:type="dxa" w:w="80"/>
+              <w:bottom w:type="dxa" w:w="50"/>
+              <w:right w:type="dxa" w:w="80"/>
+            </w:tcMar>
+          </w:tcPr>
+          <w:p>
+            <w:pPr>
+              <w:spacing w:after="0" w:before="0"/>
+              <w:jc w:val="right"/>
+            </w:pPr>
+            <w:r>
+              <w:rPr>
+                <w:rFonts w:ascii="Calibri" w:cs="Calibri" w:eastAsia="Calibri" w:hAnsi="Calibri"/>
+                <w:b/>
+                <w:bCs/>
+                <w:color w:val="FFFFFF"/>
+                <w:sz w:val="16"/>
+                <w:szCs w:val="16"/>
+              </w:rPr>
+              <w:t xml:space="preserve">Crecimiento</w:t>
+            </w:r>
+          </w:p>
+        </w:tc>
+        <w:tc>
+          <w:tcPr>
+            <w:tcW w:type="dxa" w:w="4113"/>
+            <w:tcBorders>
+              <w:top w:val="none" w:color="FFFFFF" w:sz="0"/>
+              <w:left w:val="none" w:color="FFFFFF" w:sz="0"/>
+              <w:bottom w:val="none" w:color="FFFFFF" w:sz="0"/>
+              <w:right w:val="none" w:color="FFFFFF" w:sz="0"/>
+            </w:tcBorders>
+            <w:shd w:fill="1F3A5F" w:color="auto" w:val="clear"/>
+            <w:tcMar>
+              <w:top w:type="dxa" w:w="50"/>
+              <w:left w:type="dxa" w:w="80"/>
+              <w:bottom w:type="dxa" w:w="50"/>
+              <w:right w:type="dxa" w:w="80"/>
+            </w:tcMar>
+          </w:tcPr>
+          <w:p>
+            <w:pPr>
+              <w:spacing w:after="0" w:before="0"/>
+              <w:jc w:val="left"/>
+            </w:pPr>
+            <w:r>
+              <w:rPr>
+                <w:rFonts w:ascii="Calibri" w:cs="Calibri" w:eastAsia="Calibri" w:hAnsi="Calibri"/>
+                <w:b/>
+                <w:bCs/>
+                <w:color w:val="FFFFFF"/>
+                <w:sz w:val="16"/>
+                <w:szCs w:val="16"/>
+              </w:rPr>
+              <w:t xml:space="preserve">De dónde sale</w:t>
+            </w:r>
+          </w:p>
+        </w:tc>
+      </w:tr>
+      <w:tr>
+        <w:trPr>
+          <w:cantSplit/>
+        </w:trPr>
+        <w:tc>
+          <w:tcPr>
+            <w:tcW w:type="dxa" w:w="1028"/>
+            <w:tcBorders>
+              <w:top w:val="none" w:color="FFFFFF" w:sz="0"/>
+              <w:left w:val="none" w:color="FFFFFF" w:sz="0"/>
+              <w:bottom w:val="single" w:color="D9D8D3" w:sz="4"/>
+              <w:right w:val="none" w:color="FFFFFF" w:sz="0"/>
+            </w:tcBorders>
+            <w:tcMar>
+              <w:top w:type="dxa" w:w="50"/>
+              <w:left w:type="dxa" w:w="80"/>
+              <w:bottom w:type="dxa" w:w="50"/>
+              <w:right w:type="dxa" w:w="80"/>
+            </w:tcMar>
+          </w:tcPr>
+          <w:p>
+            <w:pPr>
+              <w:spacing w:after="0" w:before="0"/>
+              <w:jc w:val="left"/>
+            </w:pPr>
+            <w:r>
+              <w:rPr>
+                <w:rFonts w:ascii="Calibri" w:cs="Calibri" w:eastAsia="Calibri" w:hAnsi="Calibri"/>
+                <w:b/>
+                <w:bCs/>
+                <w:color w:val="1F2A3C"/>
+                <w:sz w:val="16"/>
+                <w:szCs w:val="16"/>
+              </w:rPr>
+              <w:t xml:space="preserve">{{calc.dcf.sostenibilidad.puente[].periodo}}</w:t>
+            </w:r>
+          </w:p>
+        </w:tc>
+        <w:tc>
+          <w:tcPr>
+            <w:tcW w:type="dxa" w:w="1028"/>
+            <w:tcBorders>
+              <w:top w:val="none" w:color="FFFFFF" w:sz="0"/>
+              <w:left w:val="none" w:color="FFFFFF" w:sz="0"/>
+              <w:bottom w:val="single" w:color="D9D8D3" w:sz="4"/>
+              <w:right w:val="none" w:color="FFFFFF" w:sz="0"/>
+            </w:tcBorders>
+            <w:tcMar>
+              <w:top w:type="dxa" w:w="50"/>
+              <w:left w:type="dxa" w:w="80"/>
+              <w:bottom w:type="dxa" w:w="50"/>
+              <w:right w:type="dxa" w:w="80"/>
+            </w:tcMar>
+          </w:tcPr>
+          <w:p>
+            <w:pPr>
+              <w:spacing w:after="0" w:before="0"/>
+              <w:jc w:val="right"/>
+            </w:pPr>
+            <w:r>
+              <w:rPr>
+                <w:rFonts w:ascii="Calibri" w:cs="Calibri" w:eastAsia="Calibri" w:hAnsi="Calibri"/>
+                <w:b w:val="false"/>
+                <w:bCs w:val="false"/>
+                <w:color w:val="1F2A3C"/>
+                <w:sz w:val="16"/>
+                <w:szCs w:val="16"/>
+              </w:rPr>
+              <w:t xml:space="preserve">{{calc.dcf.sostenibilidad.puente[].volumen_pct|+pct}}</w:t>
+            </w:r>
+          </w:p>
+        </w:tc>
+        <w:tc>
+          <w:tcPr>
+            <w:tcW w:type="dxa" w:w="1028"/>
+            <w:tcBorders>
+              <w:top w:val="none" w:color="FFFFFF" w:sz="0"/>
+              <w:left w:val="none" w:color="FFFFFF" w:sz="0"/>
+              <w:bottom w:val="single" w:color="D9D8D3" w:sz="4"/>
+              <w:right w:val="none" w:color="FFFFFF" w:sz="0"/>
+            </w:tcBorders>
+            <w:tcMar>
+              <w:top w:type="dxa" w:w="50"/>
+              <w:left w:type="dxa" w:w="80"/>
+              <w:bottom w:type="dxa" w:w="50"/>
+              <w:right w:type="dxa" w:w="80"/>
+            </w:tcMar>
+          </w:tcPr>
+          <w:p>
+            <w:pPr>
+              <w:spacing w:after="0" w:before="0"/>
+              <w:jc w:val="right"/>
+            </w:pPr>
+            <w:r>
+              <w:rPr>
+                <w:rFonts w:ascii="Calibri" w:cs="Calibri" w:eastAsia="Calibri" w:hAnsi="Calibri"/>
+                <w:b w:val="false"/>
+                <w:bCs w:val="false"/>
+                <w:color w:val="1F2A3C"/>
+                <w:sz w:val="16"/>
+                <w:szCs w:val="16"/>
+              </w:rPr>
+              <w:t xml:space="preserve">{{calc.dcf.sostenibilidad.puente[].precio_pct|+pct}}</w:t>
+            </w:r>
+          </w:p>
+        </w:tc>
+        <w:tc>
+          <w:tcPr>
+            <w:tcW w:type="dxa" w:w="1285"/>
+            <w:tcBorders>
+              <w:top w:val="none" w:color="FFFFFF" w:sz="0"/>
+              <w:left w:val="none" w:color="FFFFFF" w:sz="0"/>
+              <w:bottom w:val="single" w:color="D9D8D3" w:sz="4"/>
+              <w:right w:val="none" w:color="FFFFFF" w:sz="0"/>
+            </w:tcBorders>
+            <w:tcMar>
+              <w:top w:type="dxa" w:w="50"/>
+              <w:left w:type="dxa" w:w="80"/>
+              <w:bottom w:type="dxa" w:w="50"/>
+              <w:right w:type="dxa" w:w="80"/>
+            </w:tcMar>
+          </w:tcPr>
+          <w:p>
+            <w:pPr>
+              <w:spacing w:after="0" w:before="0"/>
+              <w:jc w:val="right"/>
+            </w:pPr>
+            <w:r>
+              <w:rPr>
+                <w:rFonts w:ascii="Calibri" w:cs="Calibri" w:eastAsia="Calibri" w:hAnsi="Calibri"/>
+                <w:b w:val="false"/>
+                <w:bCs w:val="false"/>
+                <w:color w:val="1F2A3C"/>
+                <w:sz w:val="16"/>
+                <w:szCs w:val="16"/>
+              </w:rPr>
+              <w:t xml:space="preserve">{{calc.dcf.sostenibilidad.puente[].otros_pct|+pct}}</w:t>
+            </w:r>
+          </w:p>
+        </w:tc>
+        <w:tc>
+          <w:tcPr>
+            <w:tcW w:type="dxa" w:w="1156"/>
+            <w:tcBorders>
+              <w:top w:val="none" w:color="FFFFFF" w:sz="0"/>
+              <w:left w:val="none" w:color="FFFFFF" w:sz="0"/>
+              <w:bottom w:val="single" w:color="D9D8D3" w:sz="4"/>
+              <w:right w:val="none" w:color="FFFFFF" w:sz="0"/>
+            </w:tcBorders>
+            <w:tcMar>
+              <w:top w:type="dxa" w:w="50"/>
+              <w:left w:type="dxa" w:w="80"/>
+              <w:bottom w:type="dxa" w:w="50"/>
+              <w:right w:type="dxa" w:w="80"/>
+            </w:tcMar>
+          </w:tcPr>
+          <w:p>
+            <w:pPr>
+              <w:spacing w:after="0" w:before="0"/>
+              <w:jc w:val="right"/>
+            </w:pPr>
+            <w:r>
+              <w:rPr>
+                <w:rFonts w:ascii="Calibri" w:cs="Calibri" w:eastAsia="Calibri" w:hAnsi="Calibri"/>
+                <w:b w:val="false"/>
+                <w:bCs w:val="false"/>
+                <w:color w:val="1F2A3C"/>
+                <w:sz w:val="16"/>
+                <w:szCs w:val="16"/>
+              </w:rPr>
+              <w:t xml:space="preserve">{{calc.dcf.sostenibilidad.puente[].crecimiento_pct|+pct}}</w:t>
+            </w:r>
+          </w:p>
+        </w:tc>
+        <w:tc>
+          <w:tcPr>
+            <w:tcW w:type="dxa" w:w="4113"/>
+            <w:tcBorders>
+              <w:top w:val="none" w:color="FFFFFF" w:sz="0"/>
+              <w:left w:val="none" w:color="FFFFFF" w:sz="0"/>
+              <w:bottom w:val="single" w:color="D9D8D3" w:sz="4"/>
+              <w:right w:val="none" w:color="FFFFFF" w:sz="0"/>
+            </w:tcBorders>
+            <w:tcMar>
+              <w:top w:type="dxa" w:w="50"/>
+              <w:left w:type="dxa" w:w="80"/>
+              <w:bottom w:type="dxa" w:w="50"/>
+              <w:right w:type="dxa" w:w="80"/>
+            </w:tcMar>
+          </w:tcPr>
+          <w:p>
+            <w:pPr>
+              <w:spacing w:after="0" w:before="0"/>
+              <w:jc w:val="left"/>
+            </w:pPr>
+            <w:r>
+              <w:rPr>
+                <w:rFonts w:ascii="Calibri" w:cs="Calibri" w:eastAsia="Calibri" w:hAnsi="Calibri"/>
+                <w:b w:val="false"/>
+                <w:bCs w:val="false"/>
+                <w:color w:val="1F2A3C"/>
+                <w:sz w:val="16"/>
+                <w:szCs w:val="16"/>
+              </w:rPr>
+              <w:t xml:space="preserve">{{calc.dcf.sostenibilidad.puente[].comentario}}</w:t>
+            </w:r>
+          </w:p>
+        </w:tc>
+      </w:tr>
+    </w:tbl>
+    <w:p>
+      <w:pPr>
+        <w:spacing w:after="160" w:before="0"/>
+      </w:pPr>
+    </w:p>
+    <w:p>
+      <w:pPr>
+        <w:spacing w:after="100"/>
+      </w:pPr>
+      <w:r>
+        <w:t xml:space="preserve">{{texto:dcf.sostenibilidad.justificacion}}</w:t>
+      </w:r>
+    </w:p>
+    <w:p>
+      <w:pPr>
+        <w:spacing w:after="0" w:before="0"/>
+      </w:pPr>
+      <w:r>
+        <w:rPr>
+          <w:color w:val="8A8984"/>
+          <w:sz w:val="2"/>
+          <w:szCs w:val="2"/>
+        </w:rPr>
+        <w:t xml:space="preserve">{{fin:calc.dcf.sostenibilidad,dcf.sostenibilidad}}</w:t>
       </w:r>
     </w:p>
     <w:p>

</xml_diff>

<commit_message>
Método v2 homogéneo: objetivo a 12 meses en el informe (valoracion.objetivo_12m) con regla de múltiplos común en el motor
Las revisiones del 13-oct elegían los múltiplos a mano y casi siempre al alza (alcista con
medias de épocas de múltiplos altos; bajista igual al base cuando la empresa ya cotiza en
mínimos). La regla queda cerrada y en código (motor/objetivo12m.mjs): base = menor entre
PER actual y mediana de 5 años; bajista = mínimo de 5 años o base x 0,85; alcista = mayor
entre media larga y comparables, con techo base x 1,30. Ponderada con las probabilidades,
señal Comprar >= 15 % con base >= 12 % y valor intrínseco >= precio. El consenso solo
se compara. Prompt, plantilla, ejemplo, motor, apuntar-12m, lecciones y procedimiento al día.

Co-Authored-By: Claude Opus 5.5 (1M context) <noreply@anthropic.com>
Claude-Session: https://claude.ai/code/session_01VixYSaGQiQE1rx56hFwG7W
</commit_message>
<xml_diff>
--- a/verticales/empresa/plantilla.docx
+++ b/verticales/empresa/plantilla.docx
@@ -255,7 +255,7 @@
                 <w:sz w:val="15"/>
                 <w:szCs w:val="15"/>
               </w:rPr>
-              <w:t xml:space="preserve">Valor objetivo</w:t>
+              <w:t xml:space="preserve">Objetivo 12 m</w:t>
             </w:r>
           </w:p>
           <w:p>
@@ -271,7 +271,7 @@
                 <w:sz w:val="26"/>
                 <w:szCs w:val="26"/>
               </w:rPr>
-              <w:t xml:space="preserve">{{calc.sintesis.valor_objetivo|2}} {{meta.divisa}}{{calc.recomendacion.valor_objetivo_txt|opc}}{{calc.recomendacion.objetivo_mercado_corto|opc}}</w:t>
+              <w:t xml:space="preserve">{{calc.recomendacion.objetivo_12m_txt}}</w:t>
             </w:r>
           </w:p>
         </w:tc>
@@ -303,7 +303,7 @@
                 <w:sz w:val="15"/>
                 <w:szCs w:val="15"/>
               </w:rPr>
-              <w:t xml:space="preserve">Rentabilidad total 12 m</w:t>
+              <w:t xml:space="preserve">Rentabilidad 12 m</w:t>
             </w:r>
           </w:p>
           <w:p>
@@ -319,7 +319,7 @@
                 <w:sz w:val="26"/>
                 <w:szCs w:val="26"/>
               </w:rPr>
-              <w:t xml:space="preserve">{{calc.recomendacion.rentabilidad_total_pct|+pct}}{{calc.recomendacion.rentabilidad_mercado_corto|opc}}</w:t>
+              <w:t xml:space="preserve">{{calc.recomendacion.rentabilidad_12m_txt}}</w:t>
             </w:r>
           </w:p>
         </w:tc>
@@ -356,7 +356,7 @@
                 <w:sz w:val="15"/>
                 <w:szCs w:val="15"/>
               </w:rPr>
-              <w:t xml:space="preserve">Convicción</w:t>
+              <w:t xml:space="preserve">Valor intrínseco</w:t>
             </w:r>
           </w:p>
           <w:p>
@@ -372,7 +372,7 @@
                 <w:sz w:val="26"/>
                 <w:szCs w:val="26"/>
               </w:rPr>
-              <w:t xml:space="preserve">{{resumen.conviccion}}</w:t>
+              <w:t xml:space="preserve">{{calc.sintesis.valor_objetivo|2}} {{meta.divisa}}{{calc.recomendacion.valor_objetivo_txt|opc}}{{calc.recomendacion.objetivo_mercado_corto|opc}}</w:t>
             </w:r>
           </w:p>
         </w:tc>
@@ -404,7 +404,7 @@
                 <w:sz w:val="15"/>
                 <w:szCs w:val="15"/>
               </w:rPr>
-              <w:t xml:space="preserve">Capitalización</w:t>
+              <w:t xml:space="preserve">Convicción</w:t>
             </w:r>
           </w:p>
           <w:p>
@@ -420,7 +420,7 @@
                 <w:sz w:val="26"/>
                 <w:szCs w:val="26"/>
               </w:rPr>
-              <w:t xml:space="preserve">{{calc.mercado.capitalizacion|0}} M</w:t>
+              <w:t xml:space="preserve">{{resumen.conviccion}}</w:t>
             </w:r>
           </w:p>
         </w:tc>
@@ -452,7 +452,7 @@
                 <w:sz w:val="15"/>
                 <w:szCs w:val="15"/>
               </w:rPr>
-              <w:t xml:space="preserve">EV/EBITDA próx. 12 m</w:t>
+              <w:t xml:space="preserve">Capitalización</w:t>
             </w:r>
           </w:p>
           <w:p>
@@ -468,7 +468,7 @@
                 <w:sz w:val="26"/>
                 <w:szCs w:val="26"/>
               </w:rPr>
-              <w:t xml:space="preserve">{{calc.clave.ev_ebitda_ntm|x}}</w:t>
+              <w:t xml:space="preserve">{{calc.mercado.capitalizacion|0}} M</w:t>
             </w:r>
           </w:p>
         </w:tc>
@@ -500,7 +500,7 @@
                 <w:sz w:val="15"/>
                 <w:szCs w:val="15"/>
               </w:rPr>
-              <w:t xml:space="preserve">Deuda neta aj. / EBITDA</w:t>
+              <w:t xml:space="preserve">EV/EBITDA próx. 12 m</w:t>
             </w:r>
           </w:p>
           <w:p>
@@ -516,7 +516,204 @@
                 <w:sz w:val="26"/>
                 <w:szCs w:val="26"/>
               </w:rPr>
+              <w:t xml:space="preserve">{{calc.clave.ev_ebitda_ntm|x}}</w:t>
+            </w:r>
+          </w:p>
+        </w:tc>
+      </w:tr>
+      <w:tr>
+        <w:trPr>
+          <w:cantSplit/>
+        </w:trPr>
+        <w:tc>
+          <w:tcPr>
+            <w:tcW w:type="dxa" w:w="2409"/>
+            <w:tcBorders>
+              <w:top w:val="single" w:color="FFFFFF" w:sz="24"/>
+              <w:left w:val="single" w:color="FFFFFF" w:sz="24"/>
+              <w:bottom w:val="single" w:color="FFFFFF" w:sz="24"/>
+              <w:right w:val="single" w:color="FFFFFF" w:sz="24"/>
+            </w:tcBorders>
+            <w:shd w:fill="F3F2EE" w:color="auto" w:val="clear"/>
+            <w:tcMar>
+              <w:top w:type="dxa" w:w="100"/>
+              <w:left w:type="dxa" w:w="140"/>
+              <w:bottom w:type="dxa" w:w="100"/>
+              <w:right w:type="dxa" w:w="100"/>
+            </w:tcMar>
+          </w:tcPr>
+          <w:p>
+            <w:pPr>
+              <w:spacing w:after="20"/>
+            </w:pPr>
+            <w:r>
+              <w:rPr>
+                <w:rFonts w:ascii="Calibri" w:cs="Calibri" w:eastAsia="Calibri" w:hAnsi="Calibri"/>
+                <w:color w:val="52514E"/>
+                <w:sz w:val="15"/>
+                <w:szCs w:val="15"/>
+              </w:rPr>
+              <w:t xml:space="preserve">Deuda neta aj. / EBITDA</w:t>
+            </w:r>
+          </w:p>
+          <w:p>
+            <w:pPr>
+              <w:spacing w:after="0"/>
+            </w:pPr>
+            <w:r>
+              <w:rPr>
+                <w:rFonts w:ascii="Calibri" w:cs="Calibri" w:eastAsia="Calibri" w:hAnsi="Calibri"/>
+                <w:b/>
+                <w:bCs/>
+                <w:color w:val="1F2A3C"/>
+                <w:sz w:val="26"/>
+                <w:szCs w:val="26"/>
+              </w:rPr>
               <w:t xml:space="preserve">{{calc.clave.dn_ebitda_ajustada|x}}</w:t>
+            </w:r>
+          </w:p>
+        </w:tc>
+        <w:tc>
+          <w:tcPr>
+            <w:tcW w:type="dxa" w:w="2409"/>
+            <w:tcBorders>
+              <w:top w:val="single" w:color="FFFFFF" w:sz="24"/>
+              <w:left w:val="single" w:color="FFFFFF" w:sz="24"/>
+              <w:bottom w:val="single" w:color="FFFFFF" w:sz="24"/>
+              <w:right w:val="single" w:color="FFFFFF" w:sz="24"/>
+            </w:tcBorders>
+            <w:shd w:fill="F3F2EE" w:color="auto" w:val="clear"/>
+            <w:tcMar>
+              <w:top w:type="dxa" w:w="100"/>
+              <w:left w:type="dxa" w:w="140"/>
+              <w:bottom w:type="dxa" w:w="100"/>
+              <w:right w:type="dxa" w:w="100"/>
+            </w:tcMar>
+          </w:tcPr>
+          <w:p>
+            <w:pPr>
+              <w:spacing w:after="20"/>
+            </w:pPr>
+            <w:r>
+              <w:rPr>
+                <w:rFonts w:ascii="Calibri" w:cs="Calibri" w:eastAsia="Calibri" w:hAnsi="Calibri"/>
+                <w:color w:val="52514E"/>
+                <w:sz w:val="15"/>
+                <w:szCs w:val="15"/>
+              </w:rPr>
+              <w:t xml:space="preserve"/>
+            </w:r>
+          </w:p>
+          <w:p>
+            <w:pPr>
+              <w:spacing w:after="0"/>
+            </w:pPr>
+            <w:r>
+              <w:rPr>
+                <w:rFonts w:ascii="Calibri" w:cs="Calibri" w:eastAsia="Calibri" w:hAnsi="Calibri"/>
+                <w:b/>
+                <w:bCs/>
+                <w:color w:val="1F2A3C"/>
+                <w:sz w:val="26"/>
+                <w:szCs w:val="26"/>
+              </w:rPr>
+              <w:t xml:space="preserve"/>
+            </w:r>
+          </w:p>
+        </w:tc>
+        <w:tc>
+          <w:tcPr>
+            <w:tcW w:type="dxa" w:w="2409"/>
+            <w:tcBorders>
+              <w:top w:val="single" w:color="FFFFFF" w:sz="24"/>
+              <w:left w:val="single" w:color="FFFFFF" w:sz="24"/>
+              <w:bottom w:val="single" w:color="FFFFFF" w:sz="24"/>
+              <w:right w:val="single" w:color="FFFFFF" w:sz="24"/>
+            </w:tcBorders>
+            <w:shd w:fill="F3F2EE" w:color="auto" w:val="clear"/>
+            <w:tcMar>
+              <w:top w:type="dxa" w:w="100"/>
+              <w:left w:type="dxa" w:w="140"/>
+              <w:bottom w:type="dxa" w:w="100"/>
+              <w:right w:type="dxa" w:w="100"/>
+            </w:tcMar>
+          </w:tcPr>
+          <w:p>
+            <w:pPr>
+              <w:spacing w:after="20"/>
+            </w:pPr>
+            <w:r>
+              <w:rPr>
+                <w:rFonts w:ascii="Calibri" w:cs="Calibri" w:eastAsia="Calibri" w:hAnsi="Calibri"/>
+                <w:color w:val="52514E"/>
+                <w:sz w:val="15"/>
+                <w:szCs w:val="15"/>
+              </w:rPr>
+              <w:t xml:space="preserve"/>
+            </w:r>
+          </w:p>
+          <w:p>
+            <w:pPr>
+              <w:spacing w:after="0"/>
+            </w:pPr>
+            <w:r>
+              <w:rPr>
+                <w:rFonts w:ascii="Calibri" w:cs="Calibri" w:eastAsia="Calibri" w:hAnsi="Calibri"/>
+                <w:b/>
+                <w:bCs/>
+                <w:color w:val="1F2A3C"/>
+                <w:sz w:val="26"/>
+                <w:szCs w:val="26"/>
+              </w:rPr>
+              <w:t xml:space="preserve"/>
+            </w:r>
+          </w:p>
+        </w:tc>
+        <w:tc>
+          <w:tcPr>
+            <w:tcW w:type="dxa" w:w="2411"/>
+            <w:tcBorders>
+              <w:top w:val="single" w:color="FFFFFF" w:sz="24"/>
+              <w:left w:val="single" w:color="FFFFFF" w:sz="24"/>
+              <w:bottom w:val="single" w:color="FFFFFF" w:sz="24"/>
+              <w:right w:val="single" w:color="FFFFFF" w:sz="24"/>
+            </w:tcBorders>
+            <w:shd w:fill="F3F2EE" w:color="auto" w:val="clear"/>
+            <w:tcMar>
+              <w:top w:type="dxa" w:w="100"/>
+              <w:left w:type="dxa" w:w="140"/>
+              <w:bottom w:type="dxa" w:w="100"/>
+              <w:right w:type="dxa" w:w="100"/>
+            </w:tcMar>
+          </w:tcPr>
+          <w:p>
+            <w:pPr>
+              <w:spacing w:after="20"/>
+            </w:pPr>
+            <w:r>
+              <w:rPr>
+                <w:rFonts w:ascii="Calibri" w:cs="Calibri" w:eastAsia="Calibri" w:hAnsi="Calibri"/>
+                <w:color w:val="52514E"/>
+                <w:sz w:val="15"/>
+                <w:szCs w:val="15"/>
+              </w:rPr>
+              <w:t xml:space="preserve"/>
+            </w:r>
+          </w:p>
+          <w:p>
+            <w:pPr>
+              <w:spacing w:after="0"/>
+            </w:pPr>
+            <w:r>
+              <w:rPr>
+                <w:rFonts w:ascii="Calibri" w:cs="Calibri" w:eastAsia="Calibri" w:hAnsi="Calibri"/>
+                <w:b/>
+                <w:bCs/>
+                <w:color w:val="1F2A3C"/>
+                <w:sz w:val="26"/>
+                <w:szCs w:val="26"/>
+              </w:rPr>
+              <w:t xml:space="preserve"/>
             </w:r>
           </w:p>
         </w:tc>
@@ -1894,27 +2091,27 @@
         <w:t xml:space="preserve">{{calc.recomendacion.recomendacion}}</w:t>
       </w:r>
       <w:r>
-        <w:t xml:space="preserve"> · Convicción {{resumen.conviccion}} · Valor objetivo </w:t>
+        <w:t xml:space="preserve"> · Convicción {{resumen.conviccion}} · Objetivo a 12 meses </w:t>
       </w:r>
       <w:r>
         <w:rPr>
           <w:b/>
           <w:bCs/>
         </w:rPr>
-        <w:t xml:space="preserve">{{calc.sintesis.valor_objetivo|2}} {{meta.divisa}}{{calc.recomendacion.valor_objetivo_txt|opc}}</w:t>
-      </w:r>
-      <w:r>
-        <w:t xml:space="preserve"> frente a {{identificacion.precio|2}}{{calc.recomendacion.precio_txt|opc}}{{calc.recomendacion.objetivo_mercado_txt|opc}} · Rentabilidad total esperada a 12 meses </w:t>
+        <w:t xml:space="preserve">{{calc.recomendacion.objetivo_12m_txt}}</w:t>
+      </w:r>
+      <w:r>
+        <w:t xml:space="preserve"> frente a {{identificacion.precio|2}}{{calc.recomendacion.precio_txt|opc}} · Rentabilidad a 12 meses </w:t>
       </w:r>
       <w:r>
         <w:rPr>
           <w:b/>
           <w:bCs/>
         </w:rPr>
-        <w:t xml:space="preserve">{{calc.recomendacion.rentabilidad_total_pct|+pct}}</w:t>
-      </w:r>
-      <w:r>
-        <w:t xml:space="preserve"> · Alcista / bajista {{calc.recomendacion.alcista_pct|+pct}} / {{calc.recomendacion.bajista_pct|+pct}}</w:t>
+        <w:t xml:space="preserve">{{calc.recomendacion.rentabilidad_12m_txt}}</w:t>
+      </w:r>
+      <w:r>
+        <w:t xml:space="preserve"> · Valor intrínseco {{calc.sintesis.valor_objetivo|2}} {{meta.divisa}}{{calc.recomendacion.valor_objetivo_txt|opc}}{{calc.recomendacion.objetivo_mercado_txt|opc}} · Alcista / bajista {{calc.recomendacion.alcista_pct|+pct}} / {{calc.recomendacion.bajista_pct|+pct}}</w:t>
       </w:r>
     </w:p>
     <w:p>
@@ -1981,17 +2178,17 @@
         <w:t xml:space="preserve">Recomendación: {{calc.recomendacion.recomendacion}}</w:t>
       </w:r>
       <w:r>
-        <w:t xml:space="preserve"> · Convicción: {{resumen.conviccion}} · Horizonte: {{resumen.horizonte}} · Valor objetivo: </w:t>
+        <w:t xml:space="preserve"> · Convicción: {{resumen.conviccion}} · Horizonte: {{resumen.horizonte}} · Objetivo a 12 meses: </w:t>
       </w:r>
       <w:r>
         <w:rPr>
           <w:b/>
           <w:bCs/>
         </w:rPr>
-        <w:t xml:space="preserve">{{calc.sintesis.valor_objetivo|2}} {{meta.divisa}}{{calc.recomendacion.valor_objetivo_txt|opc}}</w:t>
-      </w:r>
-      <w:r>
-        <w:t xml:space="preserve"> ({{calc.sintesis.potencial_pct|+pct}} sobre {{identificacion.precio|2}}; rentabilidad total esperada {{calc.recomendacion.rentabilidad_total_pct|+pct}}){{calc.recomendacion.objetivo_mercado_txt|opc}}</w:t>
+        <w:t xml:space="preserve">{{calc.recomendacion.objetivo_12m_txt}}</w:t>
+      </w:r>
+      <w:r>
+        <w:t xml:space="preserve"> (rentabilidad {{calc.recomendacion.rentabilidad_12m_txt}}) · Valor intrínseco: {{calc.sintesis.valor_objetivo|2}} {{meta.divisa}}{{calc.recomendacion.valor_objetivo_txt|opc}} ({{calc.sintesis.potencial_pct|+pct}} sobre {{identificacion.precio|2}}){{calc.recomendacion.objetivo_mercado_txt|opc}}</w:t>
       </w:r>
     </w:p>
     <w:p>
@@ -2200,7 +2397,7 @@
         <w:spacing w:after="100"/>
       </w:pPr>
       <w:r>
-        <w:t xml:space="preserve">Regla: Comprar si la rentabilidad total esperada a 12 meses es ≥ 15 % y el alcista gana al menos lo que pierde el bajista; Vender si es ≤ −10 %, o negativa con asimetría &lt; 0,5; Mantener en el resto. Se aplica dos veces: con el WACC del análisis (regla absoluta: ¿rinde más que su coste de capital?) y con el WACC que resulta de la prima de riesgo implícita del mercado (regla relativa: ¿rinde más que lo que hoy pide el mercado, ajustado por su beta?). Manda la relativa, salvo que las dos se contradigan (una Comprar y otra Vender): entonces, Mantener.</w:t>
+        <w:t xml:space="preserve">Regla (método v2): la recomendación sigue al objetivo a 12 meses, que es nuestro PER × nuestro BPA del ejercicio que mirará el mercado dentro de un año, con la misma regla de múltiplos para todas las empresas (base: el menor entre el PER actual y la mediana de 5 años; bajista: el mínimo de 5 años, o el base −15 % si ya cotiza por debajo; alcista: la media histórica o la de los comparables, sin pasar de base +30 %), ponderado con las probabilidades de los escenarios. Comprar si la rentabilidad ponderada es ≥ 15 %, la del base ≥ 12 % y el valor intrínseco no queda por debajo del precio; Vender si la ponderada es ≤ −10 %; Mantener en el resto. El consenso de analistas solo se compara. El valor intrínseco (DCF) es la referencia a largo plazo; su regla, la de siempre: Comprar si la rentabilidad total esperada a 12 meses es ≥ 15 % y el alcista gana al menos lo que pierde el bajista; Vender si es ≤ −10 %, o negativa con asimetría &lt; 0,5; Mantener en el resto. Se aplica dos veces: con el WACC del análisis (regla absoluta: ¿rinde más que su coste de capital?) y con el WACC que resulta de la prima de riesgo implícita del mercado (regla relativa: ¿rinde más que lo que hoy pide el mercado, ajustado por su beta?). Manda la relativa, salvo que las dos se contradigan (una Comprar y otra Vender): entonces, Mantener.</w:t>
       </w:r>
     </w:p>
     <w:tbl>
@@ -31880,7 +32077,7 @@
           <w:b/>
           <w:bCs/>
         </w:rPr>
-        <w:t xml:space="preserve">Valor objetivo ponderado:</w:t>
+        <w:t xml:space="preserve">Valor intrínseco ponderado (largo plazo):</w:t>
       </w:r>
       <w:r>
         <w:t xml:space="preserve"> {{calc.sintesis.valor_objetivo|2}} {{meta.divisa}} ({{calc.sintesis.potencial_pct|+pct}} sobre {{identificacion.precio|2}}).</w:t>
@@ -31892,6 +32089,600 @@
       </w:pPr>
       <w:r>
         <w:t xml:space="preserve">{{texto:valoracion.comentario}}</w:t>
+      </w:r>
+    </w:p>
+    <w:p>
+      <w:pPr>
+        <w:spacing w:after="0" w:before="0"/>
+      </w:pPr>
+      <w:r>
+        <w:rPr>
+          <w:color w:val="8A8984"/>
+          <w:sz w:val="2"/>
+          <w:szCs w:val="2"/>
+        </w:rPr>
+        <w:t xml:space="preserve">{{si:calc.recomendacion.objetivo_12m.filas}}</w:t>
+      </w:r>
+    </w:p>
+    <w:p>
+      <w:pPr>
+        <w:pStyle w:val="Heading2"/>
+      </w:pPr>
+      <w:r>
+        <w:t xml:space="preserve">Objetivo a 12 meses: nuestro PER × nuestro BPA</w:t>
+      </w:r>
+    </w:p>
+    <w:tbl>
+      <w:tblPr>
+        <w:tblW w:type="dxa" w:w="9638"/>
+        <w:tblBorders>
+          <w:top w:val="single" w:color="auto" w:sz="4"/>
+          <w:left w:val="single" w:color="auto" w:sz="4"/>
+          <w:bottom w:val="single" w:color="auto" w:sz="4"/>
+          <w:right w:val="single" w:color="auto" w:sz="4"/>
+          <w:insideH w:val="single" w:color="auto" w:sz="4"/>
+          <w:insideV w:val="single" w:color="auto" w:sz="4"/>
+        </w:tblBorders>
+      </w:tblPr>
+      <w:tblGrid>
+        <w:gridCol w:w="1376"/>
+        <w:gridCol w:w="1101"/>
+        <w:gridCol w:w="963"/>
+        <w:gridCol w:w="3579"/>
+        <w:gridCol w:w="1239"/>
+        <w:gridCol w:w="1380"/>
+      </w:tblGrid>
+      <w:tr>
+        <w:trPr>
+          <w:cantSplit/>
+          <w:tblHeader/>
+        </w:trPr>
+        <w:tc>
+          <w:tcPr>
+            <w:tcW w:type="dxa" w:w="1376"/>
+            <w:tcBorders>
+              <w:top w:val="none" w:color="FFFFFF" w:sz="0"/>
+              <w:left w:val="none" w:color="FFFFFF" w:sz="0"/>
+              <w:bottom w:val="none" w:color="FFFFFF" w:sz="0"/>
+              <w:right w:val="none" w:color="FFFFFF" w:sz="0"/>
+            </w:tcBorders>
+            <w:shd w:fill="1F3A5F" w:color="auto" w:val="clear"/>
+            <w:tcMar>
+              <w:top w:type="dxa" w:w="50"/>
+              <w:left w:type="dxa" w:w="80"/>
+              <w:bottom w:type="dxa" w:w="50"/>
+              <w:right w:type="dxa" w:w="80"/>
+            </w:tcMar>
+          </w:tcPr>
+          <w:p>
+            <w:pPr>
+              <w:spacing w:after="0" w:before="0"/>
+              <w:jc w:val="left"/>
+            </w:pPr>
+            <w:r>
+              <w:rPr>
+                <w:rFonts w:ascii="Calibri" w:cs="Calibri" w:eastAsia="Calibri" w:hAnsi="Calibri"/>
+                <w:b/>
+                <w:bCs/>
+                <w:color w:val="FFFFFF"/>
+                <w:sz w:val="16"/>
+                <w:szCs w:val="16"/>
+              </w:rPr>
+              <w:t xml:space="preserve">Escenario</w:t>
+            </w:r>
+          </w:p>
+        </w:tc>
+        <w:tc>
+          <w:tcPr>
+            <w:tcW w:type="dxa" w:w="1101"/>
+            <w:tcBorders>
+              <w:top w:val="none" w:color="FFFFFF" w:sz="0"/>
+              <w:left w:val="none" w:color="FFFFFF" w:sz="0"/>
+              <w:bottom w:val="none" w:color="FFFFFF" w:sz="0"/>
+              <w:right w:val="none" w:color="FFFFFF" w:sz="0"/>
+            </w:tcBorders>
+            <w:shd w:fill="1F3A5F" w:color="auto" w:val="clear"/>
+            <w:tcMar>
+              <w:top w:type="dxa" w:w="50"/>
+              <w:left w:type="dxa" w:w="80"/>
+              <w:bottom w:type="dxa" w:w="50"/>
+              <w:right w:type="dxa" w:w="80"/>
+            </w:tcMar>
+          </w:tcPr>
+          <w:p>
+            <w:pPr>
+              <w:spacing w:after="0" w:before="0"/>
+              <w:jc w:val="right"/>
+            </w:pPr>
+            <w:r>
+              <w:rPr>
+                <w:rFonts w:ascii="Calibri" w:cs="Calibri" w:eastAsia="Calibri" w:hAnsi="Calibri"/>
+                <w:b/>
+                <w:bCs/>
+                <w:color w:val="FFFFFF"/>
+                <w:sz w:val="16"/>
+                <w:szCs w:val="16"/>
+              </w:rPr>
+              <w:t xml:space="preserve">BPA</w:t>
+            </w:r>
+          </w:p>
+        </w:tc>
+        <w:tc>
+          <w:tcPr>
+            <w:tcW w:type="dxa" w:w="963"/>
+            <w:tcBorders>
+              <w:top w:val="none" w:color="FFFFFF" w:sz="0"/>
+              <w:left w:val="none" w:color="FFFFFF" w:sz="0"/>
+              <w:bottom w:val="none" w:color="FFFFFF" w:sz="0"/>
+              <w:right w:val="none" w:color="FFFFFF" w:sz="0"/>
+            </w:tcBorders>
+            <w:shd w:fill="1F3A5F" w:color="auto" w:val="clear"/>
+            <w:tcMar>
+              <w:top w:type="dxa" w:w="50"/>
+              <w:left w:type="dxa" w:w="80"/>
+              <w:bottom w:type="dxa" w:w="50"/>
+              <w:right w:type="dxa" w:w="80"/>
+            </w:tcMar>
+          </w:tcPr>
+          <w:p>
+            <w:pPr>
+              <w:spacing w:after="0" w:before="0"/>
+              <w:jc w:val="right"/>
+            </w:pPr>
+            <w:r>
+              <w:rPr>
+                <w:rFonts w:ascii="Calibri" w:cs="Calibri" w:eastAsia="Calibri" w:hAnsi="Calibri"/>
+                <w:b/>
+                <w:bCs/>
+                <w:color w:val="FFFFFF"/>
+                <w:sz w:val="16"/>
+                <w:szCs w:val="16"/>
+              </w:rPr>
+              <w:t xml:space="preserve">PER</w:t>
+            </w:r>
+          </w:p>
+        </w:tc>
+        <w:tc>
+          <w:tcPr>
+            <w:tcW w:type="dxa" w:w="3579"/>
+            <w:tcBorders>
+              <w:top w:val="none" w:color="FFFFFF" w:sz="0"/>
+              <w:left w:val="none" w:color="FFFFFF" w:sz="0"/>
+              <w:bottom w:val="none" w:color="FFFFFF" w:sz="0"/>
+              <w:right w:val="none" w:color="FFFFFF" w:sz="0"/>
+            </w:tcBorders>
+            <w:shd w:fill="1F3A5F" w:color="auto" w:val="clear"/>
+            <w:tcMar>
+              <w:top w:type="dxa" w:w="50"/>
+              <w:left w:type="dxa" w:w="80"/>
+              <w:bottom w:type="dxa" w:w="50"/>
+              <w:right w:type="dxa" w:w="80"/>
+            </w:tcMar>
+          </w:tcPr>
+          <w:p>
+            <w:pPr>
+              <w:spacing w:after="0" w:before="0"/>
+              <w:jc w:val="left"/>
+            </w:pPr>
+            <w:r>
+              <w:rPr>
+                <w:rFonts w:ascii="Calibri" w:cs="Calibri" w:eastAsia="Calibri" w:hAnsi="Calibri"/>
+                <w:b/>
+                <w:bCs/>
+                <w:color w:val="FFFFFF"/>
+                <w:sz w:val="16"/>
+                <w:szCs w:val="16"/>
+              </w:rPr>
+              <w:t xml:space="preserve">De dónde sale el PER</w:t>
+            </w:r>
+          </w:p>
+        </w:tc>
+        <w:tc>
+          <w:tcPr>
+            <w:tcW w:type="dxa" w:w="1239"/>
+            <w:tcBorders>
+              <w:top w:val="none" w:color="FFFFFF" w:sz="0"/>
+              <w:left w:val="none" w:color="FFFFFF" w:sz="0"/>
+              <w:bottom w:val="none" w:color="FFFFFF" w:sz="0"/>
+              <w:right w:val="none" w:color="FFFFFF" w:sz="0"/>
+            </w:tcBorders>
+            <w:shd w:fill="1F3A5F" w:color="auto" w:val="clear"/>
+            <w:tcMar>
+              <w:top w:type="dxa" w:w="50"/>
+              <w:left w:type="dxa" w:w="80"/>
+              <w:bottom w:type="dxa" w:w="50"/>
+              <w:right w:type="dxa" w:w="80"/>
+            </w:tcMar>
+          </w:tcPr>
+          <w:p>
+            <w:pPr>
+              <w:spacing w:after="0" w:before="0"/>
+              <w:jc w:val="right"/>
+            </w:pPr>
+            <w:r>
+              <w:rPr>
+                <w:rFonts w:ascii="Calibri" w:cs="Calibri" w:eastAsia="Calibri" w:hAnsi="Calibri"/>
+                <w:b/>
+                <w:bCs/>
+                <w:color w:val="FFFFFF"/>
+                <w:sz w:val="16"/>
+                <w:szCs w:val="16"/>
+              </w:rPr>
+              <w:t xml:space="preserve">Precio</w:t>
+            </w:r>
+          </w:p>
+        </w:tc>
+        <w:tc>
+          <w:tcPr>
+            <w:tcW w:type="dxa" w:w="1380"/>
+            <w:tcBorders>
+              <w:top w:val="none" w:color="FFFFFF" w:sz="0"/>
+              <w:left w:val="none" w:color="FFFFFF" w:sz="0"/>
+              <w:bottom w:val="none" w:color="FFFFFF" w:sz="0"/>
+              <w:right w:val="none" w:color="FFFFFF" w:sz="0"/>
+            </w:tcBorders>
+            <w:shd w:fill="1F3A5F" w:color="auto" w:val="clear"/>
+            <w:tcMar>
+              <w:top w:type="dxa" w:w="50"/>
+              <w:left w:type="dxa" w:w="80"/>
+              <w:bottom w:type="dxa" w:w="50"/>
+              <w:right w:type="dxa" w:w="80"/>
+            </w:tcMar>
+          </w:tcPr>
+          <w:p>
+            <w:pPr>
+              <w:spacing w:after="0" w:before="0"/>
+              <w:jc w:val="right"/>
+            </w:pPr>
+            <w:r>
+              <w:rPr>
+                <w:rFonts w:ascii="Calibri" w:cs="Calibri" w:eastAsia="Calibri" w:hAnsi="Calibri"/>
+                <w:b/>
+                <w:bCs/>
+                <w:color w:val="FFFFFF"/>
+                <w:sz w:val="16"/>
+                <w:szCs w:val="16"/>
+              </w:rPr>
+              <w:t xml:space="preserve">Rentabilidad</w:t>
+            </w:r>
+          </w:p>
+        </w:tc>
+      </w:tr>
+      <w:tr>
+        <w:trPr>
+          <w:cantSplit/>
+        </w:trPr>
+        <w:tc>
+          <w:tcPr>
+            <w:tcW w:type="dxa" w:w="1376"/>
+            <w:tcBorders>
+              <w:top w:val="none" w:color="FFFFFF" w:sz="0"/>
+              <w:left w:val="none" w:color="FFFFFF" w:sz="0"/>
+              <w:bottom w:val="single" w:color="D9D8D3" w:sz="4"/>
+              <w:right w:val="none" w:color="FFFFFF" w:sz="0"/>
+            </w:tcBorders>
+            <w:tcMar>
+              <w:top w:type="dxa" w:w="50"/>
+              <w:left w:type="dxa" w:w="80"/>
+              <w:bottom w:type="dxa" w:w="50"/>
+              <w:right w:type="dxa" w:w="80"/>
+            </w:tcMar>
+          </w:tcPr>
+          <w:p>
+            <w:pPr>
+              <w:spacing w:after="0" w:before="0"/>
+              <w:jc w:val="left"/>
+            </w:pPr>
+            <w:r>
+              <w:rPr>
+                <w:rFonts w:ascii="Calibri" w:cs="Calibri" w:eastAsia="Calibri" w:hAnsi="Calibri"/>
+                <w:b/>
+                <w:bCs/>
+                <w:color w:val="1F2A3C"/>
+                <w:sz w:val="16"/>
+                <w:szCs w:val="16"/>
+              </w:rPr>
+              <w:t xml:space="preserve">{{calc.recomendacion.objetivo_12m.filas[].escenario}}</w:t>
+            </w:r>
+          </w:p>
+        </w:tc>
+        <w:tc>
+          <w:tcPr>
+            <w:tcW w:type="dxa" w:w="1101"/>
+            <w:tcBorders>
+              <w:top w:val="none" w:color="FFFFFF" w:sz="0"/>
+              <w:left w:val="none" w:color="FFFFFF" w:sz="0"/>
+              <w:bottom w:val="single" w:color="D9D8D3" w:sz="4"/>
+              <w:right w:val="none" w:color="FFFFFF" w:sz="0"/>
+            </w:tcBorders>
+            <w:tcMar>
+              <w:top w:type="dxa" w:w="50"/>
+              <w:left w:type="dxa" w:w="80"/>
+              <w:bottom w:type="dxa" w:w="50"/>
+              <w:right w:type="dxa" w:w="80"/>
+            </w:tcMar>
+          </w:tcPr>
+          <w:p>
+            <w:pPr>
+              <w:spacing w:after="0" w:before="0"/>
+              <w:jc w:val="right"/>
+            </w:pPr>
+            <w:r>
+              <w:rPr>
+                <w:rFonts w:ascii="Calibri" w:cs="Calibri" w:eastAsia="Calibri" w:hAnsi="Calibri"/>
+                <w:b w:val="false"/>
+                <w:bCs w:val="false"/>
+                <w:color w:val="1F2A3C"/>
+                <w:sz w:val="16"/>
+                <w:szCs w:val="16"/>
+              </w:rPr>
+              <w:t xml:space="preserve">{{calc.recomendacion.objetivo_12m.filas[].beneficio_por_accion|2}}</w:t>
+            </w:r>
+          </w:p>
+        </w:tc>
+        <w:tc>
+          <w:tcPr>
+            <w:tcW w:type="dxa" w:w="963"/>
+            <w:tcBorders>
+              <w:top w:val="none" w:color="FFFFFF" w:sz="0"/>
+              <w:left w:val="none" w:color="FFFFFF" w:sz="0"/>
+              <w:bottom w:val="single" w:color="D9D8D3" w:sz="4"/>
+              <w:right w:val="none" w:color="FFFFFF" w:sz="0"/>
+            </w:tcBorders>
+            <w:tcMar>
+              <w:top w:type="dxa" w:w="50"/>
+              <w:left w:type="dxa" w:w="80"/>
+              <w:bottom w:type="dxa" w:w="50"/>
+              <w:right w:type="dxa" w:w="80"/>
+            </w:tcMar>
+          </w:tcPr>
+          <w:p>
+            <w:pPr>
+              <w:spacing w:after="0" w:before="0"/>
+              <w:jc w:val="right"/>
+            </w:pPr>
+            <w:r>
+              <w:rPr>
+                <w:rFonts w:ascii="Calibri" w:cs="Calibri" w:eastAsia="Calibri" w:hAnsi="Calibri"/>
+                <w:b w:val="false"/>
+                <w:bCs w:val="false"/>
+                <w:color w:val="1F2A3C"/>
+                <w:sz w:val="16"/>
+                <w:szCs w:val="16"/>
+              </w:rPr>
+              <w:t xml:space="preserve">{{calc.recomendacion.objetivo_12m.filas[].multiplo|x}}</w:t>
+            </w:r>
+          </w:p>
+        </w:tc>
+        <w:tc>
+          <w:tcPr>
+            <w:tcW w:type="dxa" w:w="3579"/>
+            <w:tcBorders>
+              <w:top w:val="none" w:color="FFFFFF" w:sz="0"/>
+              <w:left w:val="none" w:color="FFFFFF" w:sz="0"/>
+              <w:bottom w:val="single" w:color="D9D8D3" w:sz="4"/>
+              <w:right w:val="none" w:color="FFFFFF" w:sz="0"/>
+            </w:tcBorders>
+            <w:tcMar>
+              <w:top w:type="dxa" w:w="50"/>
+              <w:left w:type="dxa" w:w="80"/>
+              <w:bottom w:type="dxa" w:w="50"/>
+              <w:right w:type="dxa" w:w="80"/>
+            </w:tcMar>
+          </w:tcPr>
+          <w:p>
+            <w:pPr>
+              <w:spacing w:after="0" w:before="0"/>
+              <w:jc w:val="left"/>
+            </w:pPr>
+            <w:r>
+              <w:rPr>
+                <w:rFonts w:ascii="Calibri" w:cs="Calibri" w:eastAsia="Calibri" w:hAnsi="Calibri"/>
+                <w:b w:val="false"/>
+                <w:bCs w:val="false"/>
+                <w:color w:val="1F2A3C"/>
+                <w:sz w:val="16"/>
+                <w:szCs w:val="16"/>
+              </w:rPr>
+              <w:t xml:space="preserve">{{calc.recomendacion.objetivo_12m.filas[].origen}}</w:t>
+            </w:r>
+          </w:p>
+        </w:tc>
+        <w:tc>
+          <w:tcPr>
+            <w:tcW w:type="dxa" w:w="1239"/>
+            <w:tcBorders>
+              <w:top w:val="none" w:color="FFFFFF" w:sz="0"/>
+              <w:left w:val="none" w:color="FFFFFF" w:sz="0"/>
+              <w:bottom w:val="single" w:color="D9D8D3" w:sz="4"/>
+              <w:right w:val="none" w:color="FFFFFF" w:sz="0"/>
+            </w:tcBorders>
+            <w:tcMar>
+              <w:top w:type="dxa" w:w="50"/>
+              <w:left w:type="dxa" w:w="80"/>
+              <w:bottom w:type="dxa" w:w="50"/>
+              <w:right w:type="dxa" w:w="80"/>
+            </w:tcMar>
+          </w:tcPr>
+          <w:p>
+            <w:pPr>
+              <w:spacing w:after="0" w:before="0"/>
+              <w:jc w:val="right"/>
+            </w:pPr>
+            <w:r>
+              <w:rPr>
+                <w:rFonts w:ascii="Calibri" w:cs="Calibri" w:eastAsia="Calibri" w:hAnsi="Calibri"/>
+                <w:b w:val="false"/>
+                <w:bCs w:val="false"/>
+                <w:color w:val="1F2A3C"/>
+                <w:sz w:val="16"/>
+                <w:szCs w:val="16"/>
+              </w:rPr>
+              <w:t xml:space="preserve">{{calc.recomendacion.objetivo_12m.filas[].precio|2}}</w:t>
+            </w:r>
+          </w:p>
+        </w:tc>
+        <w:tc>
+          <w:tcPr>
+            <w:tcW w:type="dxa" w:w="1380"/>
+            <w:tcBorders>
+              <w:top w:val="none" w:color="FFFFFF" w:sz="0"/>
+              <w:left w:val="none" w:color="FFFFFF" w:sz="0"/>
+              <w:bottom w:val="single" w:color="D9D8D3" w:sz="4"/>
+              <w:right w:val="none" w:color="FFFFFF" w:sz="0"/>
+            </w:tcBorders>
+            <w:tcMar>
+              <w:top w:type="dxa" w:w="50"/>
+              <w:left w:type="dxa" w:w="80"/>
+              <w:bottom w:type="dxa" w:w="50"/>
+              <w:right w:type="dxa" w:w="80"/>
+            </w:tcMar>
+          </w:tcPr>
+          <w:p>
+            <w:pPr>
+              <w:spacing w:after="0" w:before="0"/>
+              <w:jc w:val="right"/>
+            </w:pPr>
+            <w:r>
+              <w:rPr>
+                <w:rFonts w:ascii="Calibri" w:cs="Calibri" w:eastAsia="Calibri" w:hAnsi="Calibri"/>
+                <w:b w:val="false"/>
+                <w:bCs w:val="false"/>
+                <w:color w:val="1F2A3C"/>
+                <w:sz w:val="16"/>
+                <w:szCs w:val="16"/>
+              </w:rPr>
+              <w:t xml:space="preserve">{{calc.recomendacion.objetivo_12m.filas[].rentabilidad_pct|+pct}}</w:t>
+            </w:r>
+          </w:p>
+        </w:tc>
+      </w:tr>
+    </w:tbl>
+    <w:p>
+      <w:pPr>
+        <w:spacing w:after="160" w:before="0"/>
+      </w:pPr>
+    </w:p>
+    <w:p>
+      <w:pPr>
+        <w:spacing w:after="100"/>
+      </w:pPr>
+      <w:r>
+        <w:rPr>
+          <w:b/>
+          <w:bCs/>
+        </w:rPr>
+        <w:t xml:space="preserve">Objetivo a 12 meses (ponderado):</w:t>
+      </w:r>
+      <w:r>
+        <w:t xml:space="preserve"> {{calc.recomendacion.objetivo_12m_txt}} · rentabilidad {{calc.recomendacion.rentabilidad_12m_txt}} · señal {{calc.recomendacion.objetivo_12m.senal}}.</w:t>
+      </w:r>
+    </w:p>
+    <w:p>
+      <w:pPr>
+        <w:spacing w:after="0" w:before="0"/>
+      </w:pPr>
+      <w:r>
+        <w:rPr>
+          <w:color w:val="8A8984"/>
+          <w:sz w:val="2"/>
+          <w:szCs w:val="2"/>
+        </w:rPr>
+        <w:t xml:space="preserve">{{si:valoracion.objetivo_12m.diferencia_consenso}}</w:t>
+      </w:r>
+    </w:p>
+    <w:p>
+      <w:pPr>
+        <w:keepNext/>
+        <w:spacing w:after="100"/>
+      </w:pPr>
+      <w:r>
+        <w:rPr>
+          <w:b/>
+          <w:bCs/>
+        </w:rPr>
+        <w:t xml:space="preserve">Frente al consenso (solo contraste).</w:t>
+      </w:r>
+    </w:p>
+    <w:p>
+      <w:pPr>
+        <w:spacing w:after="100"/>
+      </w:pPr>
+      <w:r>
+        <w:t xml:space="preserve">{{texto:valoracion.objetivo_12m.diferencia_consenso}}</w:t>
+      </w:r>
+    </w:p>
+    <w:p>
+      <w:pPr>
+        <w:spacing w:after="0" w:before="0"/>
+      </w:pPr>
+      <w:r>
+        <w:rPr>
+          <w:color w:val="8A8984"/>
+          <w:sz w:val="2"/>
+          <w:szCs w:val="2"/>
+        </w:rPr>
+        <w:t xml:space="preserve">{{fin:valoracion.objetivo_12m.diferencia_consenso}}</w:t>
+      </w:r>
+    </w:p>
+    <w:p>
+      <w:pPr>
+        <w:spacing w:after="0" w:before="0"/>
+      </w:pPr>
+      <w:r>
+        <w:rPr>
+          <w:color w:val="8A8984"/>
+          <w:sz w:val="2"/>
+          <w:szCs w:val="2"/>
+        </w:rPr>
+        <w:t xml:space="preserve">{{si:valoracion.objetivo_12m.comentario}}</w:t>
+      </w:r>
+    </w:p>
+    <w:p>
+      <w:pPr>
+        <w:keepNext/>
+        <w:spacing w:after="100"/>
+      </w:pPr>
+      <w:r>
+        <w:rPr>
+          <w:b/>
+          <w:bCs/>
+        </w:rPr>
+        <w:t xml:space="preserve">Del valor intrínseco al objetivo a 12 meses.</w:t>
+      </w:r>
+    </w:p>
+    <w:p>
+      <w:pPr>
+        <w:spacing w:after="100"/>
+      </w:pPr>
+      <w:r>
+        <w:t xml:space="preserve">{{texto:valoracion.objetivo_12m.comentario}}</w:t>
+      </w:r>
+    </w:p>
+    <w:p>
+      <w:pPr>
+        <w:spacing w:after="0" w:before="0"/>
+      </w:pPr>
+      <w:r>
+        <w:rPr>
+          <w:color w:val="8A8984"/>
+          <w:sz w:val="2"/>
+          <w:szCs w:val="2"/>
+        </w:rPr>
+        <w:t xml:space="preserve">{{fin:valoracion.objetivo_12m.comentario}}</w:t>
+      </w:r>
+    </w:p>
+    <w:p>
+      <w:pPr>
+        <w:spacing w:after="0" w:before="0"/>
+      </w:pPr>
+      <w:r>
+        <w:rPr>
+          <w:color w:val="8A8984"/>
+          <w:sz w:val="2"/>
+          <w:szCs w:val="2"/>
+        </w:rPr>
+        <w:t xml:space="preserve">{{fin:calc.recomendacion.objetivo_12m.filas}}</w:t>
       </w:r>
     </w:p>
     <w:p>

</xml_diff>

<commit_message>
METODO-VIGENTE.md (versiones, reglas, filtros y registro de descubrimientos); objetivo fijo con precio nuevo en apuntar-12m; regenerar.mjs; lote 1: cartera y órdenes (29 informes) con Word y PDF del motor vigente y la cifra v2 al lado
Co-Authored-By: Claude Fable 5.1 <noreply@anthropic.com>
Claude-Session: https://claude.ai/code/session_01VGL9AgDDw2x9sNJqKXa8Ev
</commit_message>
<xml_diff>
--- a/verticales/empresa/plantilla.docx
+++ b/verticales/empresa/plantilla.docx
@@ -32576,6 +32576,14 @@
       </w:r>
       <w:r>
         <w:t xml:space="preserve"> {{calc.recomendacion.objetivo_12m_txt}} · rentabilidad {{calc.recomendacion.rentabilidad_12m_txt}} · señal {{calc.recomendacion.objetivo_12m.senal}}.</w:t>
+      </w:r>
+    </w:p>
+    <w:p>
+      <w:pPr>
+        <w:spacing w:after="100"/>
+      </w:pPr>
+      <w:r>
+        <w:t xml:space="preserve">{{calc.recomendacion.objetivo_12m.comparacion_txt|opc}}</w:t>
       </w:r>
     </w:p>
     <w:p>

</xml_diff>

<commit_message>
Informe value: campo riesgos.ia (exposición, sentido, efecto en valor y comentario) en prompt, plantilla y ejemplo
Co-Authored-By: Claude Fable 5.1 <noreply@anthropic.com>
Claude-Session: https://claude.ai/code/session_01VGL9AgDDw2x9sNJqKXa8Ev
</commit_message>
<xml_diff>
--- a/verticales/empresa/plantilla.docx
+++ b/verticales/empresa/plantilla.docx
@@ -33804,6 +33804,83 @@
           <w:szCs w:val="2"/>
         </w:rPr>
         <w:t xml:space="preserve">{{fin:riesgos.premortem}}</w:t>
+      </w:r>
+    </w:p>
+    <w:p>
+      <w:pPr>
+        <w:spacing w:after="0" w:before="0"/>
+      </w:pPr>
+      <w:r>
+        <w:rPr>
+          <w:color w:val="8A8984"/>
+          <w:sz w:val="2"/>
+          <w:szCs w:val="2"/>
+        </w:rPr>
+        <w:t xml:space="preserve">{{si:riesgos.ia}}</w:t>
+      </w:r>
+    </w:p>
+    <w:p>
+      <w:pPr>
+        <w:pStyle w:val="Heading2"/>
+      </w:pPr>
+      <w:r>
+        <w:t xml:space="preserve">Riesgo de inteligencia artificial</w:t>
+      </w:r>
+    </w:p>
+    <w:p>
+      <w:pPr>
+        <w:spacing w:after="100"/>
+      </w:pPr>
+      <w:r>
+        <w:rPr>
+          <w:b/>
+          <w:bCs/>
+        </w:rPr>
+        <w:t xml:space="preserve">Exposición:</w:t>
+      </w:r>
+      <w:r>
+        <w:t xml:space="preserve"> {{riesgos.ia.exposicion}} · </w:t>
+      </w:r>
+      <w:r>
+        <w:rPr>
+          <w:b/>
+          <w:bCs/>
+        </w:rPr>
+        <w:t xml:space="preserve">Sentido:</w:t>
+      </w:r>
+      <w:r>
+        <w:t xml:space="preserve"> {{riesgos.ia.sentido}} · </w:t>
+      </w:r>
+      <w:r>
+        <w:rPr>
+          <w:b/>
+          <w:bCs/>
+        </w:rPr>
+        <w:t xml:space="preserve">Efecto en valor (3-5 años):</w:t>
+      </w:r>
+      <w:r>
+        <w:t xml:space="preserve"> {{riesgos.ia.efecto_valor}}</w:t>
+      </w:r>
+    </w:p>
+    <w:p>
+      <w:pPr>
+        <w:spacing w:after="100"/>
+      </w:pPr>
+      <w:r>
+        <w:t xml:space="preserve">{{texto:riesgos.ia.comentario}}</w:t>
+      </w:r>
+    </w:p>
+    <w:p>
+      <w:pPr>
+        <w:spacing w:after="0" w:before="0"/>
+      </w:pPr>
+      <w:r>
+        <w:rPr>
+          <w:color w:val="8A8984"/>
+          <w:sz w:val="2"/>
+          <w:szCs w:val="2"/>
+        </w:rPr>
+        <w:t xml:space="preserve">{{fin:riesgos.ia}}</w:t>
       </w:r>
     </w:p>
     <w:p>

</xml_diff>

<commit_message>
Motor value: ROIC sin fondo de comercio y tipo de comprador como dato, sostenibilidad con reinversión bruta y veredicto del motor; backtest de calidad y cíclicas (no adoptados)
Co-Authored-By: Claude Fable 5.1 <noreply@anthropic.com>
Claude-Session: https://claude.ai/code/session_01VGL9AgDDw2x9sNJqKXa8Ev
</commit_message>
<xml_diff>
--- a/verticales/empresa/plantilla.docx
+++ b/verticales/empresa/plantilla.docx
@@ -13920,14 +13920,15 @@
         </w:tblBorders>
       </w:tblPr>
       <w:tblGrid>
-        <w:gridCol w:w="1126"/>
-        <w:gridCol w:w="1126"/>
-        <w:gridCol w:w="1126"/>
-        <w:gridCol w:w="1126"/>
-        <w:gridCol w:w="1251"/>
-        <w:gridCol w:w="1251"/>
-        <w:gridCol w:w="1251"/>
-        <w:gridCol w:w="1381"/>
+        <w:gridCol w:w="985"/>
+        <w:gridCol w:w="985"/>
+        <w:gridCol w:w="985"/>
+        <w:gridCol w:w="985"/>
+        <w:gridCol w:w="1095"/>
+        <w:gridCol w:w="1095"/>
+        <w:gridCol w:w="1095"/>
+        <w:gridCol w:w="1204"/>
+        <w:gridCol w:w="1209"/>
       </w:tblGrid>
       <w:tr>
         <w:trPr>
@@ -13936,7 +13937,7 @@
         </w:trPr>
         <w:tc>
           <w:tcPr>
-            <w:tcW w:type="dxa" w:w="1126"/>
+            <w:tcW w:type="dxa" w:w="985"/>
             <w:tcBorders>
               <w:top w:val="none" w:color="FFFFFF" w:sz="0"/>
               <w:left w:val="none" w:color="FFFFFF" w:sz="0"/>
@@ -13971,7 +13972,7 @@
         </w:tc>
         <w:tc>
           <w:tcPr>
-            <w:tcW w:type="dxa" w:w="1126"/>
+            <w:tcW w:type="dxa" w:w="985"/>
             <w:tcBorders>
               <w:top w:val="none" w:color="FFFFFF" w:sz="0"/>
               <w:left w:val="none" w:color="FFFFFF" w:sz="0"/>
@@ -14006,7 +14007,7 @@
         </w:tc>
         <w:tc>
           <w:tcPr>
-            <w:tcW w:type="dxa" w:w="1126"/>
+            <w:tcW w:type="dxa" w:w="985"/>
             <w:tcBorders>
               <w:top w:val="none" w:color="FFFFFF" w:sz="0"/>
               <w:left w:val="none" w:color="FFFFFF" w:sz="0"/>
@@ -14041,7 +14042,7 @@
         </w:tc>
         <w:tc>
           <w:tcPr>
-            <w:tcW w:type="dxa" w:w="1126"/>
+            <w:tcW w:type="dxa" w:w="985"/>
             <w:tcBorders>
               <w:top w:val="none" w:color="FFFFFF" w:sz="0"/>
               <w:left w:val="none" w:color="FFFFFF" w:sz="0"/>
@@ -14076,7 +14077,7 @@
         </w:tc>
         <w:tc>
           <w:tcPr>
-            <w:tcW w:type="dxa" w:w="1251"/>
+            <w:tcW w:type="dxa" w:w="1095"/>
             <w:tcBorders>
               <w:top w:val="none" w:color="FFFFFF" w:sz="0"/>
               <w:left w:val="none" w:color="FFFFFF" w:sz="0"/>
@@ -14111,7 +14112,7 @@
         </w:tc>
         <w:tc>
           <w:tcPr>
-            <w:tcW w:type="dxa" w:w="1251"/>
+            <w:tcW w:type="dxa" w:w="1095"/>
             <w:tcBorders>
               <w:top w:val="none" w:color="FFFFFF" w:sz="0"/>
               <w:left w:val="none" w:color="FFFFFF" w:sz="0"/>
@@ -14146,7 +14147,7 @@
         </w:tc>
         <w:tc>
           <w:tcPr>
-            <w:tcW w:type="dxa" w:w="1251"/>
+            <w:tcW w:type="dxa" w:w="1095"/>
             <w:tcBorders>
               <w:top w:val="none" w:color="FFFFFF" w:sz="0"/>
               <w:left w:val="none" w:color="FFFFFF" w:sz="0"/>
@@ -14181,7 +14182,7 @@
         </w:tc>
         <w:tc>
           <w:tcPr>
-            <w:tcW w:type="dxa" w:w="1381"/>
+            <w:tcW w:type="dxa" w:w="1204"/>
             <w:tcBorders>
               <w:top w:val="none" w:color="FFFFFF" w:sz="0"/>
               <w:left w:val="none" w:color="FFFFFF" w:sz="0"/>
@@ -14211,6 +14212,41 @@
                 <w:szCs w:val="16"/>
               </w:rPr>
               <w:t xml:space="preserve">Capital invertido</w:t>
+            </w:r>
+          </w:p>
+        </w:tc>
+        <w:tc>
+          <w:tcPr>
+            <w:tcW w:type="dxa" w:w="1209"/>
+            <w:tcBorders>
+              <w:top w:val="none" w:color="FFFFFF" w:sz="0"/>
+              <w:left w:val="none" w:color="FFFFFF" w:sz="0"/>
+              <w:bottom w:val="none" w:color="FFFFFF" w:sz="0"/>
+              <w:right w:val="none" w:color="FFFFFF" w:sz="0"/>
+            </w:tcBorders>
+            <w:shd w:fill="1F3A5F" w:color="auto" w:val="clear"/>
+            <w:tcMar>
+              <w:top w:type="dxa" w:w="50"/>
+              <w:left w:type="dxa" w:w="80"/>
+              <w:bottom w:type="dxa" w:w="50"/>
+              <w:right w:type="dxa" w:w="80"/>
+            </w:tcMar>
+          </w:tcPr>
+          <w:p>
+            <w:pPr>
+              <w:spacing w:after="0" w:before="0"/>
+              <w:jc w:val="right"/>
+            </w:pPr>
+            <w:r>
+              <w:rPr>
+                <w:rFonts w:ascii="Calibri" w:cs="Calibri" w:eastAsia="Calibri" w:hAnsi="Calibri"/>
+                <w:b/>
+                <w:bCs/>
+                <w:color w:val="FFFFFF"/>
+                <w:sz w:val="16"/>
+                <w:szCs w:val="16"/>
+              </w:rPr>
+              <w:t xml:space="preserve">ROIC sin f. de comercio</w:t>
             </w:r>
           </w:p>
         </w:tc>
@@ -14221,7 +14257,7 @@
         </w:trPr>
         <w:tc>
           <w:tcPr>
-            <w:tcW w:type="dxa" w:w="1126"/>
+            <w:tcW w:type="dxa" w:w="985"/>
             <w:tcBorders>
               <w:top w:val="none" w:color="FFFFFF" w:sz="0"/>
               <w:left w:val="none" w:color="FFFFFF" w:sz="0"/>
@@ -14255,7 +14291,7 @@
         </w:tc>
         <w:tc>
           <w:tcPr>
-            <w:tcW w:type="dxa" w:w="1126"/>
+            <w:tcW w:type="dxa" w:w="985"/>
             <w:tcBorders>
               <w:top w:val="none" w:color="FFFFFF" w:sz="0"/>
               <w:left w:val="none" w:color="FFFFFF" w:sz="0"/>
@@ -14289,7 +14325,7 @@
         </w:tc>
         <w:tc>
           <w:tcPr>
-            <w:tcW w:type="dxa" w:w="1126"/>
+            <w:tcW w:type="dxa" w:w="985"/>
             <w:tcBorders>
               <w:top w:val="none" w:color="FFFFFF" w:sz="0"/>
               <w:left w:val="none" w:color="FFFFFF" w:sz="0"/>
@@ -14323,7 +14359,7 @@
         </w:tc>
         <w:tc>
           <w:tcPr>
-            <w:tcW w:type="dxa" w:w="1126"/>
+            <w:tcW w:type="dxa" w:w="985"/>
             <w:tcBorders>
               <w:top w:val="none" w:color="FFFFFF" w:sz="0"/>
               <w:left w:val="none" w:color="FFFFFF" w:sz="0"/>
@@ -14357,7 +14393,7 @@
         </w:tc>
         <w:tc>
           <w:tcPr>
-            <w:tcW w:type="dxa" w:w="1251"/>
+            <w:tcW w:type="dxa" w:w="1095"/>
             <w:tcBorders>
               <w:top w:val="none" w:color="FFFFFF" w:sz="0"/>
               <w:left w:val="none" w:color="FFFFFF" w:sz="0"/>
@@ -14391,7 +14427,7 @@
         </w:tc>
         <w:tc>
           <w:tcPr>
-            <w:tcW w:type="dxa" w:w="1251"/>
+            <w:tcW w:type="dxa" w:w="1095"/>
             <w:tcBorders>
               <w:top w:val="none" w:color="FFFFFF" w:sz="0"/>
               <w:left w:val="none" w:color="FFFFFF" w:sz="0"/>
@@ -14425,7 +14461,7 @@
         </w:tc>
         <w:tc>
           <w:tcPr>
-            <w:tcW w:type="dxa" w:w="1251"/>
+            <w:tcW w:type="dxa" w:w="1095"/>
             <w:tcBorders>
               <w:top w:val="none" w:color="FFFFFF" w:sz="0"/>
               <w:left w:val="none" w:color="FFFFFF" w:sz="0"/>
@@ -14459,7 +14495,7 @@
         </w:tc>
         <w:tc>
           <w:tcPr>
-            <w:tcW w:type="dxa" w:w="1381"/>
+            <w:tcW w:type="dxa" w:w="1204"/>
             <w:tcBorders>
               <w:top w:val="none" w:color="FFFFFF" w:sz="0"/>
               <w:left w:val="none" w:color="FFFFFF" w:sz="0"/>
@@ -14488,6 +14524,40 @@
                 <w:szCs w:val="16"/>
               </w:rPr>
               <w:t xml:space="preserve">{{calc.rentabilidad[].capital_invertido|0}}</w:t>
+            </w:r>
+          </w:p>
+        </w:tc>
+        <w:tc>
+          <w:tcPr>
+            <w:tcW w:type="dxa" w:w="1209"/>
+            <w:tcBorders>
+              <w:top w:val="none" w:color="FFFFFF" w:sz="0"/>
+              <w:left w:val="none" w:color="FFFFFF" w:sz="0"/>
+              <w:bottom w:val="single" w:color="D9D8D3" w:sz="4"/>
+              <w:right w:val="none" w:color="FFFFFF" w:sz="0"/>
+            </w:tcBorders>
+            <w:tcMar>
+              <w:top w:type="dxa" w:w="50"/>
+              <w:left w:type="dxa" w:w="80"/>
+              <w:bottom w:type="dxa" w:w="50"/>
+              <w:right w:type="dxa" w:w="80"/>
+            </w:tcMar>
+          </w:tcPr>
+          <w:p>
+            <w:pPr>
+              <w:spacing w:after="0" w:before="0"/>
+              <w:jc w:val="right"/>
+            </w:pPr>
+            <w:r>
+              <w:rPr>
+                <w:rFonts w:ascii="Calibri" w:cs="Calibri" w:eastAsia="Calibri" w:hAnsi="Calibri"/>
+                <w:b w:val="false"/>
+                <w:bCs w:val="false"/>
+                <w:color w:val="1F2A3C"/>
+                <w:sz w:val="16"/>
+                <w:szCs w:val="16"/>
+              </w:rPr>
+              <w:t xml:space="preserve">{{calc.rentabilidad[].roic_sin_fc_pct|pct}}</w:t>
             </w:r>
           </w:p>
         </w:tc>
@@ -14506,6 +14576,48 @@
       </w:pPr>
       <w:r>
         <w:t xml:space="preserve">{{grafico:roic}}</w:t>
+      </w:r>
+    </w:p>
+    <w:p>
+      <w:pPr>
+        <w:spacing w:after="0" w:before="0"/>
+      </w:pPr>
+      <w:r>
+        <w:rPr>
+          <w:color w:val="8A8984"/>
+          <w:sz w:val="2"/>
+          <w:szCs w:val="2"/>
+        </w:rPr>
+        <w:t xml:space="preserve">{{si:calc.compras}}</w:t>
+      </w:r>
+    </w:p>
+    <w:p>
+      <w:pPr>
+        <w:pStyle w:val="Heading2"/>
+      </w:pPr>
+      <w:r>
+        <w:t xml:space="preserve">Fondo de comercio y compras</w:t>
+      </w:r>
+    </w:p>
+    <w:p>
+      <w:pPr>
+        <w:spacing w:after="100"/>
+      </w:pPr>
+      <w:r>
+        <w:t xml:space="preserve">{{texto:calc.compras.texto}}</w:t>
+      </w:r>
+    </w:p>
+    <w:p>
+      <w:pPr>
+        <w:spacing w:after="0" w:before="0"/>
+      </w:pPr>
+      <w:r>
+        <w:rPr>
+          <w:color w:val="8A8984"/>
+          <w:sz w:val="2"/>
+          <w:szCs w:val="2"/>
+        </w:rPr>
+        <w:t xml:space="preserve">{{fin:calc.compras}}</w:t>
       </w:r>
     </w:p>
     <w:p>

</xml_diff>

<commit_message>
Precio y noticias antes de decidir: bloque contexto en informes value y growth, movimiento.mjs, avisos P1-P5 y C/G10 en robustez, backtests de movimiento y conservadurismo
Co-Authored-By: Claude Fable 5.1 <noreply@anthropic.com>
Claude-Session: https://claude.ai/code/session_01VGL9AgDDw2x9sNJqKXa8Ev
</commit_message>
<xml_diff>
--- a/verticales/empresa/plantilla.docx
+++ b/verticales/empresa/plantilla.docx
@@ -22172,6 +22172,1406 @@
       </w:pPr>
       <w:r>
         <w:t xml:space="preserve">{{texto:bolsa.comentario}}</w:t>
+      </w:r>
+    </w:p>
+    <w:p>
+      <w:pPr>
+        <w:spacing w:after="0" w:before="0"/>
+      </w:pPr>
+      <w:r>
+        <w:rPr>
+          <w:color w:val="8A8984"/>
+          <w:sz w:val="2"/>
+          <w:szCs w:val="2"/>
+        </w:rPr>
+        <w:t xml:space="preserve">{{si:bolsa.contexto}}</w:t>
+      </w:r>
+    </w:p>
+    <w:p>
+      <w:pPr>
+        <w:pStyle w:val="Heading2"/>
+      </w:pPr>
+      <w:r>
+        <w:t xml:space="preserve">Precio y noticias antes de decidir (regla 13)</w:t>
+      </w:r>
+    </w:p>
+    <w:tbl>
+      <w:tblPr>
+        <w:tblW w:type="dxa" w:w="9638"/>
+        <w:tblBorders>
+          <w:top w:val="single" w:color="auto" w:sz="4"/>
+          <w:left w:val="single" w:color="auto" w:sz="4"/>
+          <w:bottom w:val="single" w:color="auto" w:sz="4"/>
+          <w:right w:val="single" w:color="auto" w:sz="4"/>
+          <w:insideH w:val="single" w:color="auto" w:sz="4"/>
+          <w:insideV w:val="single" w:color="auto" w:sz="4"/>
+        </w:tblBorders>
+      </w:tblPr>
+      <w:tblGrid>
+        <w:gridCol w:w="2023"/>
+        <w:gridCol w:w="2796"/>
+        <w:gridCol w:w="2023"/>
+        <w:gridCol w:w="2796"/>
+      </w:tblGrid>
+      <w:tr>
+        <w:trPr>
+          <w:cantSplit/>
+        </w:trPr>
+        <w:tc>
+          <w:tcPr>
+            <w:tcW w:type="dxa" w:w="2023"/>
+            <w:tcBorders>
+              <w:top w:val="none" w:color="FFFFFF" w:sz="0"/>
+              <w:left w:val="none" w:color="FFFFFF" w:sz="0"/>
+              <w:bottom w:val="single" w:color="D9D8D3" w:sz="4"/>
+              <w:right w:val="none" w:color="FFFFFF" w:sz="0"/>
+            </w:tcBorders>
+            <w:shd w:fill="F3F2EE" w:color="auto" w:val="clear"/>
+            <w:tcMar>
+              <w:top w:type="dxa" w:w="50"/>
+              <w:left w:type="dxa" w:w="80"/>
+              <w:bottom w:type="dxa" w:w="50"/>
+              <w:right w:type="dxa" w:w="80"/>
+            </w:tcMar>
+          </w:tcPr>
+          <w:p>
+            <w:pPr>
+              <w:spacing w:after="0" w:before="0"/>
+              <w:jc w:val="left"/>
+            </w:pPr>
+            <w:r>
+              <w:rPr>
+                <w:rFonts w:ascii="Calibri" w:cs="Calibri" w:eastAsia="Calibri" w:hAnsi="Calibri"/>
+                <w:b w:val="false"/>
+                <w:bCs w:val="false"/>
+                <w:color w:val="52514E"/>
+                <w:sz w:val="16"/>
+                <w:szCs w:val="16"/>
+              </w:rPr>
+              <w:t xml:space="preserve">{{?bolsa.contexto.movimiento.var_1m_pct,bolsa.contexto.movimiento.var_3m_pct,bolsa.contexto.movimiento.var_6m_pct,bolsa.contexto.movimiento.var_12m_pct}}Variación 1 / 3 / 6 / 12 meses</w:t>
+            </w:r>
+          </w:p>
+        </w:tc>
+        <w:tc>
+          <w:tcPr>
+            <w:tcW w:type="dxa" w:w="2796"/>
+            <w:tcBorders>
+              <w:top w:val="none" w:color="FFFFFF" w:sz="0"/>
+              <w:left w:val="none" w:color="FFFFFF" w:sz="0"/>
+              <w:bottom w:val="single" w:color="D9D8D3" w:sz="4"/>
+              <w:right w:val="none" w:color="FFFFFF" w:sz="0"/>
+            </w:tcBorders>
+            <w:tcMar>
+              <w:top w:type="dxa" w:w="50"/>
+              <w:left w:type="dxa" w:w="80"/>
+              <w:bottom w:type="dxa" w:w="50"/>
+              <w:right w:type="dxa" w:w="80"/>
+            </w:tcMar>
+          </w:tcPr>
+          <w:p>
+            <w:pPr>
+              <w:spacing w:after="0" w:before="0"/>
+              <w:jc w:val="left"/>
+            </w:pPr>
+            <w:r>
+              <w:rPr>
+                <w:rFonts w:ascii="Calibri" w:cs="Calibri" w:eastAsia="Calibri" w:hAnsi="Calibri"/>
+                <w:b/>
+                <w:bCs/>
+                <w:color w:val="1F2A3C"/>
+                <w:sz w:val="17"/>
+                <w:szCs w:val="17"/>
+              </w:rPr>
+              <w:t xml:space="preserve">{{bolsa.contexto.movimiento.var_1m_pct|+pct}} / {{bolsa.contexto.movimiento.var_3m_pct|+pct}} / {{bolsa.contexto.movimiento.var_6m_pct|+pct}} / {{bolsa.contexto.movimiento.var_12m_pct|+pct}}</w:t>
+            </w:r>
+          </w:p>
+        </w:tc>
+        <w:tc>
+          <w:tcPr>
+            <w:tcW w:type="dxa" w:w="2023"/>
+            <w:tcBorders>
+              <w:top w:val="none" w:color="FFFFFF" w:sz="0"/>
+              <w:left w:val="none" w:color="FFFFFF" w:sz="0"/>
+              <w:bottom w:val="single" w:color="D9D8D3" w:sz="4"/>
+              <w:right w:val="none" w:color="FFFFFF" w:sz="0"/>
+            </w:tcBorders>
+            <w:shd w:fill="F3F2EE" w:color="auto" w:val="clear"/>
+            <w:tcMar>
+              <w:top w:type="dxa" w:w="50"/>
+              <w:left w:type="dxa" w:w="80"/>
+              <w:bottom w:type="dxa" w:w="50"/>
+              <w:right w:type="dxa" w:w="80"/>
+            </w:tcMar>
+          </w:tcPr>
+          <w:p>
+            <w:pPr>
+              <w:spacing w:after="0" w:before="0"/>
+              <w:jc w:val="left"/>
+            </w:pPr>
+            <w:r>
+              <w:rPr>
+                <w:rFonts w:ascii="Calibri" w:cs="Calibri" w:eastAsia="Calibri" w:hAnsi="Calibri"/>
+                <w:b w:val="false"/>
+                <w:bCs w:val="false"/>
+                <w:color w:val="52514E"/>
+                <w:sz w:val="16"/>
+                <w:szCs w:val="16"/>
+              </w:rPr>
+              <w:t xml:space="preserve">{{?bolsa.contexto.movimiento.dist_max_52s_pct,bolsa.contexto.movimiento.dist_min_52s_pct}}Frente al máximo y al mínimo de 52 semanas</w:t>
+            </w:r>
+          </w:p>
+        </w:tc>
+        <w:tc>
+          <w:tcPr>
+            <w:tcW w:type="dxa" w:w="2796"/>
+            <w:tcBorders>
+              <w:top w:val="none" w:color="FFFFFF" w:sz="0"/>
+              <w:left w:val="none" w:color="FFFFFF" w:sz="0"/>
+              <w:bottom w:val="single" w:color="D9D8D3" w:sz="4"/>
+              <w:right w:val="none" w:color="FFFFFF" w:sz="0"/>
+            </w:tcBorders>
+            <w:tcMar>
+              <w:top w:type="dxa" w:w="50"/>
+              <w:left w:type="dxa" w:w="80"/>
+              <w:bottom w:type="dxa" w:w="50"/>
+              <w:right w:type="dxa" w:w="80"/>
+            </w:tcMar>
+          </w:tcPr>
+          <w:p>
+            <w:pPr>
+              <w:spacing w:after="0" w:before="0"/>
+              <w:jc w:val="left"/>
+            </w:pPr>
+            <w:r>
+              <w:rPr>
+                <w:rFonts w:ascii="Calibri" w:cs="Calibri" w:eastAsia="Calibri" w:hAnsi="Calibri"/>
+                <w:b/>
+                <w:bCs/>
+                <w:color w:val="1F2A3C"/>
+                <w:sz w:val="17"/>
+                <w:szCs w:val="17"/>
+              </w:rPr>
+              <w:t xml:space="preserve">{{bolsa.contexto.movimiento.dist_max_52s_pct|+pct}} / {{bolsa.contexto.movimiento.dist_min_52s_pct|+pct}}</w:t>
+            </w:r>
+          </w:p>
+        </w:tc>
+      </w:tr>
+      <w:tr>
+        <w:trPr>
+          <w:cantSplit/>
+        </w:trPr>
+        <w:tc>
+          <w:tcPr>
+            <w:tcW w:type="dxa" w:w="2023"/>
+            <w:tcBorders>
+              <w:top w:val="none" w:color="FFFFFF" w:sz="0"/>
+              <w:left w:val="none" w:color="FFFFFF" w:sz="0"/>
+              <w:bottom w:val="single" w:color="D9D8D3" w:sz="4"/>
+              <w:right w:val="none" w:color="FFFFFF" w:sz="0"/>
+            </w:tcBorders>
+            <w:shd w:fill="F3F2EE" w:color="auto" w:val="clear"/>
+            <w:tcMar>
+              <w:top w:type="dxa" w:w="50"/>
+              <w:left w:type="dxa" w:w="80"/>
+              <w:bottom w:type="dxa" w:w="50"/>
+              <w:right w:type="dxa" w:w="80"/>
+            </w:tcMar>
+          </w:tcPr>
+          <w:p>
+            <w:pPr>
+              <w:spacing w:after="0" w:before="0"/>
+              <w:jc w:val="left"/>
+            </w:pPr>
+            <w:r>
+              <w:rPr>
+                <w:rFonts w:ascii="Calibri" w:cs="Calibri" w:eastAsia="Calibri" w:hAnsi="Calibri"/>
+                <w:b w:val="false"/>
+                <w:bCs w:val="false"/>
+                <w:color w:val="52514E"/>
+                <w:sz w:val="16"/>
+                <w:szCs w:val="16"/>
+              </w:rPr>
+              <w:t xml:space="preserve">{{?bolsa.contexto.movimiento.dist_max_historico_pct}}Frente al máximo de 5 años</w:t>
+            </w:r>
+          </w:p>
+        </w:tc>
+        <w:tc>
+          <w:tcPr>
+            <w:tcW w:type="dxa" w:w="2796"/>
+            <w:tcBorders>
+              <w:top w:val="none" w:color="FFFFFF" w:sz="0"/>
+              <w:left w:val="none" w:color="FFFFFF" w:sz="0"/>
+              <w:bottom w:val="single" w:color="D9D8D3" w:sz="4"/>
+              <w:right w:val="none" w:color="FFFFFF" w:sz="0"/>
+            </w:tcBorders>
+            <w:tcMar>
+              <w:top w:type="dxa" w:w="50"/>
+              <w:left w:type="dxa" w:w="80"/>
+              <w:bottom w:type="dxa" w:w="50"/>
+              <w:right w:type="dxa" w:w="80"/>
+            </w:tcMar>
+          </w:tcPr>
+          <w:p>
+            <w:pPr>
+              <w:spacing w:after="0" w:before="0"/>
+              <w:jc w:val="left"/>
+            </w:pPr>
+            <w:r>
+              <w:rPr>
+                <w:rFonts w:ascii="Calibri" w:cs="Calibri" w:eastAsia="Calibri" w:hAnsi="Calibri"/>
+                <w:b/>
+                <w:bCs/>
+                <w:color w:val="1F2A3C"/>
+                <w:sz w:val="17"/>
+                <w:szCs w:val="17"/>
+              </w:rPr>
+              <w:t xml:space="preserve">{{bolsa.contexto.movimiento.dist_max_historico_pct|+pct}}</w:t>
+            </w:r>
+          </w:p>
+        </w:tc>
+        <w:tc>
+          <w:tcPr>
+            <w:tcW w:type="dxa" w:w="2023"/>
+            <w:tcBorders>
+              <w:top w:val="none" w:color="FFFFFF" w:sz="0"/>
+              <w:left w:val="none" w:color="FFFFFF" w:sz="0"/>
+              <w:bottom w:val="single" w:color="D9D8D3" w:sz="4"/>
+              <w:right w:val="none" w:color="FFFFFF" w:sz="0"/>
+            </w:tcBorders>
+            <w:shd w:fill="F3F2EE" w:color="auto" w:val="clear"/>
+            <w:tcMar>
+              <w:top w:type="dxa" w:w="50"/>
+              <w:left w:type="dxa" w:w="80"/>
+              <w:bottom w:type="dxa" w:w="50"/>
+              <w:right w:type="dxa" w:w="80"/>
+            </w:tcMar>
+          </w:tcPr>
+          <w:p>
+            <w:pPr>
+              <w:spacing w:after="0" w:before="0"/>
+              <w:jc w:val="left"/>
+            </w:pPr>
+            <w:r>
+              <w:rPr>
+                <w:rFonts w:ascii="Calibri" w:cs="Calibri" w:eastAsia="Calibri" w:hAnsi="Calibri"/>
+                <w:b w:val="false"/>
+                <w:bCs w:val="false"/>
+                <w:color w:val="52514E"/>
+                <w:sz w:val="16"/>
+                <w:szCs w:val="16"/>
+              </w:rPr>
+              <w:t xml:space="preserve">{{?bolsa.contexto.movimiento.tendencia}}Tendencia (medias de 50 y 200 sesiones)</w:t>
+            </w:r>
+          </w:p>
+        </w:tc>
+        <w:tc>
+          <w:tcPr>
+            <w:tcW w:type="dxa" w:w="2796"/>
+            <w:tcBorders>
+              <w:top w:val="none" w:color="FFFFFF" w:sz="0"/>
+              <w:left w:val="none" w:color="FFFFFF" w:sz="0"/>
+              <w:bottom w:val="single" w:color="D9D8D3" w:sz="4"/>
+              <w:right w:val="none" w:color="FFFFFF" w:sz="0"/>
+            </w:tcBorders>
+            <w:tcMar>
+              <w:top w:type="dxa" w:w="50"/>
+              <w:left w:type="dxa" w:w="80"/>
+              <w:bottom w:type="dxa" w:w="50"/>
+              <w:right w:type="dxa" w:w="80"/>
+            </w:tcMar>
+          </w:tcPr>
+          <w:p>
+            <w:pPr>
+              <w:spacing w:after="0" w:before="0"/>
+              <w:jc w:val="left"/>
+            </w:pPr>
+            <w:r>
+              <w:rPr>
+                <w:rFonts w:ascii="Calibri" w:cs="Calibri" w:eastAsia="Calibri" w:hAnsi="Calibri"/>
+                <w:b/>
+                <w:bCs/>
+                <w:color w:val="1F2A3C"/>
+                <w:sz w:val="17"/>
+                <w:szCs w:val="17"/>
+              </w:rPr>
+              <w:t xml:space="preserve">{{bolsa.contexto.movimiento.tendencia}}</w:t>
+            </w:r>
+          </w:p>
+        </w:tc>
+      </w:tr>
+      <w:tr>
+        <w:trPr>
+          <w:cantSplit/>
+        </w:trPr>
+        <w:tc>
+          <w:tcPr>
+            <w:tcW w:type="dxa" w:w="2023"/>
+            <w:tcBorders>
+              <w:top w:val="none" w:color="FFFFFF" w:sz="0"/>
+              <w:left w:val="none" w:color="FFFFFF" w:sz="0"/>
+              <w:bottom w:val="single" w:color="D9D8D3" w:sz="4"/>
+              <w:right w:val="none" w:color="FFFFFF" w:sz="0"/>
+            </w:tcBorders>
+            <w:shd w:fill="F3F2EE" w:color="auto" w:val="clear"/>
+            <w:tcMar>
+              <w:top w:type="dxa" w:w="50"/>
+              <w:left w:type="dxa" w:w="80"/>
+              <w:bottom w:type="dxa" w:w="50"/>
+              <w:right w:type="dxa" w:w="80"/>
+            </w:tcMar>
+          </w:tcPr>
+          <w:p>
+            <w:pPr>
+              <w:spacing w:after="0" w:before="0"/>
+              <w:jc w:val="left"/>
+            </w:pPr>
+            <w:r>
+              <w:rPr>
+                <w:rFonts w:ascii="Calibri" w:cs="Calibri" w:eastAsia="Calibri" w:hAnsi="Calibri"/>
+                <w:b w:val="false"/>
+                <w:bCs w:val="false"/>
+                <w:color w:val="52514E"/>
+                <w:sz w:val="16"/>
+                <w:szCs w:val="16"/>
+              </w:rPr>
+              <w:t xml:space="preserve">{{?bolsa.contexto.movimiento.volatilidad_60d_pct}}Volatilidad (60 sesiones)</w:t>
+            </w:r>
+          </w:p>
+        </w:tc>
+        <w:tc>
+          <w:tcPr>
+            <w:tcW w:type="dxa" w:w="2796"/>
+            <w:tcBorders>
+              <w:top w:val="none" w:color="FFFFFF" w:sz="0"/>
+              <w:left w:val="none" w:color="FFFFFF" w:sz="0"/>
+              <w:bottom w:val="single" w:color="D9D8D3" w:sz="4"/>
+              <w:right w:val="none" w:color="FFFFFF" w:sz="0"/>
+            </w:tcBorders>
+            <w:tcMar>
+              <w:top w:type="dxa" w:w="50"/>
+              <w:left w:type="dxa" w:w="80"/>
+              <w:bottom w:type="dxa" w:w="50"/>
+              <w:right w:type="dxa" w:w="80"/>
+            </w:tcMar>
+          </w:tcPr>
+          <w:p>
+            <w:pPr>
+              <w:spacing w:after="0" w:before="0"/>
+              <w:jc w:val="left"/>
+            </w:pPr>
+            <w:r>
+              <w:rPr>
+                <w:rFonts w:ascii="Calibri" w:cs="Calibri" w:eastAsia="Calibri" w:hAnsi="Calibri"/>
+                <w:b/>
+                <w:bCs/>
+                <w:color w:val="1F2A3C"/>
+                <w:sz w:val="17"/>
+                <w:szCs w:val="17"/>
+              </w:rPr>
+              <w:t xml:space="preserve">{{bolsa.contexto.movimiento.volatilidad_60d_pct|pct}}</w:t>
+            </w:r>
+          </w:p>
+        </w:tc>
+        <w:tc>
+          <w:tcPr>
+            <w:tcW w:type="dxa" w:w="2023"/>
+            <w:tcBorders>
+              <w:top w:val="none" w:color="FFFFFF" w:sz="0"/>
+              <w:left w:val="none" w:color="FFFFFF" w:sz="0"/>
+              <w:bottom w:val="single" w:color="D9D8D3" w:sz="4"/>
+              <w:right w:val="none" w:color="FFFFFF" w:sz="0"/>
+            </w:tcBorders>
+            <w:shd w:fill="F3F2EE" w:color="auto" w:val="clear"/>
+            <w:tcMar>
+              <w:top w:type="dxa" w:w="50"/>
+              <w:left w:type="dxa" w:w="80"/>
+              <w:bottom w:type="dxa" w:w="50"/>
+              <w:right w:type="dxa" w:w="80"/>
+            </w:tcMar>
+          </w:tcPr>
+          <w:p>
+            <w:pPr>
+              <w:spacing w:after="0" w:before="0"/>
+              <w:jc w:val="left"/>
+            </w:pPr>
+            <w:r>
+              <w:rPr>
+                <w:rFonts w:ascii="Calibri" w:cs="Calibri" w:eastAsia="Calibri" w:hAnsi="Calibri"/>
+                <w:b w:val="false"/>
+                <w:bCs w:val="false"/>
+                <w:color w:val="52514E"/>
+                <w:sz w:val="16"/>
+                <w:szCs w:val="16"/>
+              </w:rPr>
+              <w:t xml:space="preserve">{{?bolsa.contexto.proximos_resultados}}Próximos resultados</w:t>
+            </w:r>
+          </w:p>
+        </w:tc>
+        <w:tc>
+          <w:tcPr>
+            <w:tcW w:type="dxa" w:w="2796"/>
+            <w:tcBorders>
+              <w:top w:val="none" w:color="FFFFFF" w:sz="0"/>
+              <w:left w:val="none" w:color="FFFFFF" w:sz="0"/>
+              <w:bottom w:val="single" w:color="D9D8D3" w:sz="4"/>
+              <w:right w:val="none" w:color="FFFFFF" w:sz="0"/>
+            </w:tcBorders>
+            <w:tcMar>
+              <w:top w:type="dxa" w:w="50"/>
+              <w:left w:type="dxa" w:w="80"/>
+              <w:bottom w:type="dxa" w:w="50"/>
+              <w:right w:type="dxa" w:w="80"/>
+            </w:tcMar>
+          </w:tcPr>
+          <w:p>
+            <w:pPr>
+              <w:spacing w:after="0" w:before="0"/>
+              <w:jc w:val="left"/>
+            </w:pPr>
+            <w:r>
+              <w:rPr>
+                <w:rFonts w:ascii="Calibri" w:cs="Calibri" w:eastAsia="Calibri" w:hAnsi="Calibri"/>
+                <w:b/>
+                <w:bCs/>
+                <w:color w:val="1F2A3C"/>
+                <w:sz w:val="17"/>
+                <w:szCs w:val="17"/>
+              </w:rPr>
+              <w:t xml:space="preserve">{{bolsa.contexto.proximos_resultados}}</w:t>
+            </w:r>
+          </w:p>
+        </w:tc>
+      </w:tr>
+      <w:tr>
+        <w:trPr>
+          <w:cantSplit/>
+        </w:trPr>
+        <w:tc>
+          <w:tcPr>
+            <w:tcW w:type="dxa" w:w="2023"/>
+            <w:tcBorders>
+              <w:top w:val="none" w:color="FFFFFF" w:sz="0"/>
+              <w:left w:val="none" w:color="FFFFFF" w:sz="0"/>
+              <w:bottom w:val="single" w:color="D9D8D3" w:sz="4"/>
+              <w:right w:val="none" w:color="FFFFFF" w:sz="0"/>
+            </w:tcBorders>
+            <w:shd w:fill="F3F2EE" w:color="auto" w:val="clear"/>
+            <w:tcMar>
+              <w:top w:type="dxa" w:w="50"/>
+              <w:left w:type="dxa" w:w="80"/>
+              <w:bottom w:type="dxa" w:w="50"/>
+              <w:right w:type="dxa" w:w="80"/>
+            </w:tcMar>
+          </w:tcPr>
+          <w:p>
+            <w:pPr>
+              <w:spacing w:after="0" w:before="0"/>
+              <w:jc w:val="left"/>
+            </w:pPr>
+            <w:r>
+              <w:rPr>
+                <w:rFonts w:ascii="Calibri" w:cs="Calibri" w:eastAsia="Calibri" w:hAnsi="Calibri"/>
+                <w:b w:val="false"/>
+                <w:bCs w:val="false"/>
+                <w:color w:val="52514E"/>
+                <w:sz w:val="16"/>
+                <w:szCs w:val="16"/>
+              </w:rPr>
+              <w:t xml:space="preserve">{{?bolsa.contexto.veredicto}}Veredicto</w:t>
+            </w:r>
+          </w:p>
+        </w:tc>
+        <w:tc>
+          <w:tcPr>
+            <w:tcW w:type="dxa" w:w="2796"/>
+            <w:tcBorders>
+              <w:top w:val="none" w:color="FFFFFF" w:sz="0"/>
+              <w:left w:val="none" w:color="FFFFFF" w:sz="0"/>
+              <w:bottom w:val="single" w:color="D9D8D3" w:sz="4"/>
+              <w:right w:val="none" w:color="FFFFFF" w:sz="0"/>
+            </w:tcBorders>
+            <w:tcMar>
+              <w:top w:type="dxa" w:w="50"/>
+              <w:left w:type="dxa" w:w="80"/>
+              <w:bottom w:type="dxa" w:w="50"/>
+              <w:right w:type="dxa" w:w="80"/>
+            </w:tcMar>
+          </w:tcPr>
+          <w:p>
+            <w:pPr>
+              <w:spacing w:after="0" w:before="0"/>
+              <w:jc w:val="left"/>
+            </w:pPr>
+            <w:r>
+              <w:rPr>
+                <w:rFonts w:ascii="Calibri" w:cs="Calibri" w:eastAsia="Calibri" w:hAnsi="Calibri"/>
+                <w:b/>
+                <w:bCs/>
+                <w:color w:val="1F2A3C"/>
+                <w:sz w:val="17"/>
+                <w:szCs w:val="17"/>
+              </w:rPr>
+              <w:t xml:space="preserve">{{bolsa.contexto.veredicto}}</w:t>
+            </w:r>
+          </w:p>
+        </w:tc>
+        <w:tc>
+          <w:tcPr>
+            <w:tcW w:type="dxa" w:w="2023"/>
+            <w:tcBorders>
+              <w:top w:val="none" w:color="FFFFFF" w:sz="0"/>
+              <w:left w:val="none" w:color="FFFFFF" w:sz="0"/>
+              <w:bottom w:val="single" w:color="D9D8D3" w:sz="4"/>
+              <w:right w:val="none" w:color="FFFFFF" w:sz="0"/>
+            </w:tcBorders>
+            <w:shd w:fill="F3F2EE" w:color="auto" w:val="clear"/>
+            <w:tcMar>
+              <w:top w:type="dxa" w:w="50"/>
+              <w:left w:type="dxa" w:w="80"/>
+              <w:bottom w:type="dxa" w:w="50"/>
+              <w:right w:type="dxa" w:w="80"/>
+            </w:tcMar>
+          </w:tcPr>
+          <w:p>
+            <w:pPr>
+              <w:spacing w:after="0" w:before="0"/>
+              <w:jc w:val="left"/>
+            </w:pPr>
+            <w:r>
+              <w:rPr>
+                <w:rFonts w:ascii="Calibri" w:cs="Calibri" w:eastAsia="Calibri" w:hAnsi="Calibri"/>
+                <w:b w:val="false"/>
+                <w:bCs w:val="false"/>
+                <w:color w:val="52514E"/>
+                <w:sz w:val="16"/>
+                <w:szCs w:val="16"/>
+              </w:rPr>
+              <w:t xml:space="preserve">{{?bolsa.contexto.condicion}}Condición</w:t>
+            </w:r>
+          </w:p>
+        </w:tc>
+        <w:tc>
+          <w:tcPr>
+            <w:tcW w:type="dxa" w:w="2796"/>
+            <w:tcBorders>
+              <w:top w:val="none" w:color="FFFFFF" w:sz="0"/>
+              <w:left w:val="none" w:color="FFFFFF" w:sz="0"/>
+              <w:bottom w:val="single" w:color="D9D8D3" w:sz="4"/>
+              <w:right w:val="none" w:color="FFFFFF" w:sz="0"/>
+            </w:tcBorders>
+            <w:tcMar>
+              <w:top w:type="dxa" w:w="50"/>
+              <w:left w:type="dxa" w:w="80"/>
+              <w:bottom w:type="dxa" w:w="50"/>
+              <w:right w:type="dxa" w:w="80"/>
+            </w:tcMar>
+          </w:tcPr>
+          <w:p>
+            <w:pPr>
+              <w:spacing w:after="0" w:before="0"/>
+              <w:jc w:val="left"/>
+            </w:pPr>
+            <w:r>
+              <w:rPr>
+                <w:rFonts w:ascii="Calibri" w:cs="Calibri" w:eastAsia="Calibri" w:hAnsi="Calibri"/>
+                <w:b/>
+                <w:bCs/>
+                <w:color w:val="1F2A3C"/>
+                <w:sz w:val="17"/>
+                <w:szCs w:val="17"/>
+              </w:rPr>
+              <w:t xml:space="preserve">{{bolsa.contexto.condicion}}</w:t>
+            </w:r>
+          </w:p>
+        </w:tc>
+      </w:tr>
+    </w:tbl>
+    <w:p>
+      <w:pPr>
+        <w:spacing w:after="160" w:before="0"/>
+      </w:pPr>
+    </w:p>
+    <w:tbl>
+      <w:tblPr>
+        <w:tblW w:type="dxa" w:w="9638"/>
+        <w:tblBorders>
+          <w:top w:val="single" w:color="auto" w:sz="4"/>
+          <w:left w:val="single" w:color="auto" w:sz="4"/>
+          <w:bottom w:val="single" w:color="auto" w:sz="4"/>
+          <w:right w:val="single" w:color="auto" w:sz="4"/>
+          <w:insideH w:val="single" w:color="auto" w:sz="4"/>
+          <w:insideV w:val="single" w:color="auto" w:sz="4"/>
+        </w:tblBorders>
+      </w:tblPr>
+      <w:tblGrid>
+        <w:gridCol w:w="1220"/>
+        <w:gridCol w:w="1098"/>
+        <w:gridCol w:w="4147"/>
+        <w:gridCol w:w="1220"/>
+        <w:gridCol w:w="1953"/>
+      </w:tblGrid>
+      <w:tr>
+        <w:trPr>
+          <w:cantSplit/>
+          <w:tblHeader/>
+        </w:trPr>
+        <w:tc>
+          <w:tcPr>
+            <w:tcW w:type="dxa" w:w="1220"/>
+            <w:tcBorders>
+              <w:top w:val="none" w:color="FFFFFF" w:sz="0"/>
+              <w:left w:val="none" w:color="FFFFFF" w:sz="0"/>
+              <w:bottom w:val="none" w:color="FFFFFF" w:sz="0"/>
+              <w:right w:val="none" w:color="FFFFFF" w:sz="0"/>
+            </w:tcBorders>
+            <w:shd w:fill="1F3A5F" w:color="auto" w:val="clear"/>
+            <w:tcMar>
+              <w:top w:type="dxa" w:w="50"/>
+              <w:left w:type="dxa" w:w="80"/>
+              <w:bottom w:type="dxa" w:w="50"/>
+              <w:right w:type="dxa" w:w="80"/>
+            </w:tcMar>
+          </w:tcPr>
+          <w:p>
+            <w:pPr>
+              <w:spacing w:after="0" w:before="0"/>
+              <w:jc w:val="left"/>
+            </w:pPr>
+            <w:r>
+              <w:rPr>
+                <w:rFonts w:ascii="Calibri" w:cs="Calibri" w:eastAsia="Calibri" w:hAnsi="Calibri"/>
+                <w:b/>
+                <w:bCs/>
+                <w:color w:val="FFFFFF"/>
+                <w:sz w:val="16"/>
+                <w:szCs w:val="16"/>
+              </w:rPr>
+              <w:t xml:space="preserve">Periodo</w:t>
+            </w:r>
+          </w:p>
+        </w:tc>
+        <w:tc>
+          <w:tcPr>
+            <w:tcW w:type="dxa" w:w="1098"/>
+            <w:tcBorders>
+              <w:top w:val="none" w:color="FFFFFF" w:sz="0"/>
+              <w:left w:val="none" w:color="FFFFFF" w:sz="0"/>
+              <w:bottom w:val="none" w:color="FFFFFF" w:sz="0"/>
+              <w:right w:val="none" w:color="FFFFFF" w:sz="0"/>
+            </w:tcBorders>
+            <w:shd w:fill="1F3A5F" w:color="auto" w:val="clear"/>
+            <w:tcMar>
+              <w:top w:type="dxa" w:w="50"/>
+              <w:left w:type="dxa" w:w="80"/>
+              <w:bottom w:type="dxa" w:w="50"/>
+              <w:right w:type="dxa" w:w="80"/>
+            </w:tcMar>
+          </w:tcPr>
+          <w:p>
+            <w:pPr>
+              <w:spacing w:after="0" w:before="0"/>
+              <w:jc w:val="right"/>
+            </w:pPr>
+            <w:r>
+              <w:rPr>
+                <w:rFonts w:ascii="Calibri" w:cs="Calibri" w:eastAsia="Calibri" w:hAnsi="Calibri"/>
+                <w:b/>
+                <w:bCs/>
+                <w:color w:val="FFFFFF"/>
+                <w:sz w:val="16"/>
+                <w:szCs w:val="16"/>
+              </w:rPr>
+              <w:t xml:space="preserve">Variación</w:t>
+            </w:r>
+          </w:p>
+        </w:tc>
+        <w:tc>
+          <w:tcPr>
+            <w:tcW w:type="dxa" w:w="4147"/>
+            <w:tcBorders>
+              <w:top w:val="none" w:color="FFFFFF" w:sz="0"/>
+              <w:left w:val="none" w:color="FFFFFF" w:sz="0"/>
+              <w:bottom w:val="none" w:color="FFFFFF" w:sz="0"/>
+              <w:right w:val="none" w:color="FFFFFF" w:sz="0"/>
+            </w:tcBorders>
+            <w:shd w:fill="1F3A5F" w:color="auto" w:val="clear"/>
+            <w:tcMar>
+              <w:top w:type="dxa" w:w="50"/>
+              <w:left w:type="dxa" w:w="80"/>
+              <w:bottom w:type="dxa" w:w="50"/>
+              <w:right w:type="dxa" w:w="80"/>
+            </w:tcMar>
+          </w:tcPr>
+          <w:p>
+            <w:pPr>
+              <w:spacing w:after="0" w:before="0"/>
+              <w:jc w:val="left"/>
+            </w:pPr>
+            <w:r>
+              <w:rPr>
+                <w:rFonts w:ascii="Calibri" w:cs="Calibri" w:eastAsia="Calibri" w:hAnsi="Calibri"/>
+                <w:b/>
+                <w:bCs/>
+                <w:color w:val="FFFFFF"/>
+                <w:sz w:val="16"/>
+                <w:szCs w:val="16"/>
+              </w:rPr>
+              <w:t xml:space="preserve">Causa</w:t>
+            </w:r>
+          </w:p>
+        </w:tc>
+        <w:tc>
+          <w:tcPr>
+            <w:tcW w:type="dxa" w:w="1220"/>
+            <w:tcBorders>
+              <w:top w:val="none" w:color="FFFFFF" w:sz="0"/>
+              <w:left w:val="none" w:color="FFFFFF" w:sz="0"/>
+              <w:bottom w:val="none" w:color="FFFFFF" w:sz="0"/>
+              <w:right w:val="none" w:color="FFFFFF" w:sz="0"/>
+            </w:tcBorders>
+            <w:shd w:fill="1F3A5F" w:color="auto" w:val="clear"/>
+            <w:tcMar>
+              <w:top w:type="dxa" w:w="50"/>
+              <w:left w:type="dxa" w:w="80"/>
+              <w:bottom w:type="dxa" w:w="50"/>
+              <w:right w:type="dxa" w:w="80"/>
+            </w:tcMar>
+          </w:tcPr>
+          <w:p>
+            <w:pPr>
+              <w:spacing w:after="0" w:before="0"/>
+              <w:jc w:val="left"/>
+            </w:pPr>
+            <w:r>
+              <w:rPr>
+                <w:rFonts w:ascii="Calibri" w:cs="Calibri" w:eastAsia="Calibri" w:hAnsi="Calibri"/>
+                <w:b/>
+                <w:bCs/>
+                <w:color w:val="FFFFFF"/>
+                <w:sz w:val="16"/>
+                <w:szCs w:val="16"/>
+              </w:rPr>
+              <w:t xml:space="preserve">Veredicto</w:t>
+            </w:r>
+          </w:p>
+        </w:tc>
+        <w:tc>
+          <w:tcPr>
+            <w:tcW w:type="dxa" w:w="1953"/>
+            <w:tcBorders>
+              <w:top w:val="none" w:color="FFFFFF" w:sz="0"/>
+              <w:left w:val="none" w:color="FFFFFF" w:sz="0"/>
+              <w:bottom w:val="none" w:color="FFFFFF" w:sz="0"/>
+              <w:right w:val="none" w:color="FFFFFF" w:sz="0"/>
+            </w:tcBorders>
+            <w:shd w:fill="1F3A5F" w:color="auto" w:val="clear"/>
+            <w:tcMar>
+              <w:top w:type="dxa" w:w="50"/>
+              <w:left w:type="dxa" w:w="80"/>
+              <w:bottom w:type="dxa" w:w="50"/>
+              <w:right w:type="dxa" w:w="80"/>
+            </w:tcMar>
+          </w:tcPr>
+          <w:p>
+            <w:pPr>
+              <w:spacing w:after="0" w:before="0"/>
+              <w:jc w:val="left"/>
+            </w:pPr>
+            <w:r>
+              <w:rPr>
+                <w:rFonts w:ascii="Calibri" w:cs="Calibri" w:eastAsia="Calibri" w:hAnsi="Calibri"/>
+                <w:b/>
+                <w:bCs/>
+                <w:color w:val="FFFFFF"/>
+                <w:sz w:val="16"/>
+                <w:szCs w:val="16"/>
+              </w:rPr>
+              <w:t xml:space="preserve">Condición</w:t>
+            </w:r>
+          </w:p>
+        </w:tc>
+      </w:tr>
+      <w:tr>
+        <w:trPr>
+          <w:cantSplit/>
+        </w:trPr>
+        <w:tc>
+          <w:tcPr>
+            <w:tcW w:type="dxa" w:w="1220"/>
+            <w:tcBorders>
+              <w:top w:val="none" w:color="FFFFFF" w:sz="0"/>
+              <w:left w:val="none" w:color="FFFFFF" w:sz="0"/>
+              <w:bottom w:val="single" w:color="D9D8D3" w:sz="4"/>
+              <w:right w:val="none" w:color="FFFFFF" w:sz="0"/>
+            </w:tcBorders>
+            <w:tcMar>
+              <w:top w:type="dxa" w:w="50"/>
+              <w:left w:type="dxa" w:w="80"/>
+              <w:bottom w:type="dxa" w:w="50"/>
+              <w:right w:type="dxa" w:w="80"/>
+            </w:tcMar>
+          </w:tcPr>
+          <w:p>
+            <w:pPr>
+              <w:spacing w:after="0" w:before="0"/>
+              <w:jc w:val="left"/>
+            </w:pPr>
+            <w:r>
+              <w:rPr>
+                <w:rFonts w:ascii="Calibri" w:cs="Calibri" w:eastAsia="Calibri" w:hAnsi="Calibri"/>
+                <w:b/>
+                <w:bCs/>
+                <w:color w:val="1F2A3C"/>
+                <w:sz w:val="16"/>
+                <w:szCs w:val="16"/>
+              </w:rPr>
+              <w:t xml:space="preserve">{{bolsa.contexto.movimientos_fuertes[].periodo}}</w:t>
+            </w:r>
+          </w:p>
+        </w:tc>
+        <w:tc>
+          <w:tcPr>
+            <w:tcW w:type="dxa" w:w="1098"/>
+            <w:tcBorders>
+              <w:top w:val="none" w:color="FFFFFF" w:sz="0"/>
+              <w:left w:val="none" w:color="FFFFFF" w:sz="0"/>
+              <w:bottom w:val="single" w:color="D9D8D3" w:sz="4"/>
+              <w:right w:val="none" w:color="FFFFFF" w:sz="0"/>
+            </w:tcBorders>
+            <w:tcMar>
+              <w:top w:type="dxa" w:w="50"/>
+              <w:left w:type="dxa" w:w="80"/>
+              <w:bottom w:type="dxa" w:w="50"/>
+              <w:right w:type="dxa" w:w="80"/>
+            </w:tcMar>
+          </w:tcPr>
+          <w:p>
+            <w:pPr>
+              <w:spacing w:after="0" w:before="0"/>
+              <w:jc w:val="right"/>
+            </w:pPr>
+            <w:r>
+              <w:rPr>
+                <w:rFonts w:ascii="Calibri" w:cs="Calibri" w:eastAsia="Calibri" w:hAnsi="Calibri"/>
+                <w:b w:val="false"/>
+                <w:bCs w:val="false"/>
+                <w:color w:val="1F2A3C"/>
+                <w:sz w:val="16"/>
+                <w:szCs w:val="16"/>
+              </w:rPr>
+              <w:t xml:space="preserve">{{bolsa.contexto.movimientos_fuertes[].var_pct|+pct}}</w:t>
+            </w:r>
+          </w:p>
+        </w:tc>
+        <w:tc>
+          <w:tcPr>
+            <w:tcW w:type="dxa" w:w="4147"/>
+            <w:tcBorders>
+              <w:top w:val="none" w:color="FFFFFF" w:sz="0"/>
+              <w:left w:val="none" w:color="FFFFFF" w:sz="0"/>
+              <w:bottom w:val="single" w:color="D9D8D3" w:sz="4"/>
+              <w:right w:val="none" w:color="FFFFFF" w:sz="0"/>
+            </w:tcBorders>
+            <w:tcMar>
+              <w:top w:type="dxa" w:w="50"/>
+              <w:left w:type="dxa" w:w="80"/>
+              <w:bottom w:type="dxa" w:w="50"/>
+              <w:right w:type="dxa" w:w="80"/>
+            </w:tcMar>
+          </w:tcPr>
+          <w:p>
+            <w:pPr>
+              <w:spacing w:after="0" w:before="0"/>
+              <w:jc w:val="left"/>
+            </w:pPr>
+            <w:r>
+              <w:rPr>
+                <w:rFonts w:ascii="Calibri" w:cs="Calibri" w:eastAsia="Calibri" w:hAnsi="Calibri"/>
+                <w:b w:val="false"/>
+                <w:bCs w:val="false"/>
+                <w:color w:val="1F2A3C"/>
+                <w:sz w:val="16"/>
+                <w:szCs w:val="16"/>
+              </w:rPr>
+              <w:t xml:space="preserve">{{bolsa.contexto.movimientos_fuertes[].causa}}</w:t>
+            </w:r>
+          </w:p>
+        </w:tc>
+        <w:tc>
+          <w:tcPr>
+            <w:tcW w:type="dxa" w:w="1220"/>
+            <w:tcBorders>
+              <w:top w:val="none" w:color="FFFFFF" w:sz="0"/>
+              <w:left w:val="none" w:color="FFFFFF" w:sz="0"/>
+              <w:bottom w:val="single" w:color="D9D8D3" w:sz="4"/>
+              <w:right w:val="none" w:color="FFFFFF" w:sz="0"/>
+            </w:tcBorders>
+            <w:tcMar>
+              <w:top w:type="dxa" w:w="50"/>
+              <w:left w:type="dxa" w:w="80"/>
+              <w:bottom w:type="dxa" w:w="50"/>
+              <w:right w:type="dxa" w:w="80"/>
+            </w:tcMar>
+          </w:tcPr>
+          <w:p>
+            <w:pPr>
+              <w:spacing w:after="0" w:before="0"/>
+              <w:jc w:val="left"/>
+            </w:pPr>
+            <w:r>
+              <w:rPr>
+                <w:rFonts w:ascii="Calibri" w:cs="Calibri" w:eastAsia="Calibri" w:hAnsi="Calibri"/>
+                <w:b w:val="false"/>
+                <w:bCs w:val="false"/>
+                <w:color w:val="1F2A3C"/>
+                <w:sz w:val="16"/>
+                <w:szCs w:val="16"/>
+              </w:rPr>
+              <w:t xml:space="preserve">{{bolsa.contexto.movimientos_fuertes[].veredicto}}</w:t>
+            </w:r>
+          </w:p>
+        </w:tc>
+        <w:tc>
+          <w:tcPr>
+            <w:tcW w:type="dxa" w:w="1953"/>
+            <w:tcBorders>
+              <w:top w:val="none" w:color="FFFFFF" w:sz="0"/>
+              <w:left w:val="none" w:color="FFFFFF" w:sz="0"/>
+              <w:bottom w:val="single" w:color="D9D8D3" w:sz="4"/>
+              <w:right w:val="none" w:color="FFFFFF" w:sz="0"/>
+            </w:tcBorders>
+            <w:tcMar>
+              <w:top w:type="dxa" w:w="50"/>
+              <w:left w:type="dxa" w:w="80"/>
+              <w:bottom w:type="dxa" w:w="50"/>
+              <w:right w:type="dxa" w:w="80"/>
+            </w:tcMar>
+          </w:tcPr>
+          <w:p>
+            <w:pPr>
+              <w:spacing w:after="0" w:before="0"/>
+              <w:jc w:val="left"/>
+            </w:pPr>
+            <w:r>
+              <w:rPr>
+                <w:rFonts w:ascii="Calibri" w:cs="Calibri" w:eastAsia="Calibri" w:hAnsi="Calibri"/>
+                <w:b w:val="false"/>
+                <w:bCs w:val="false"/>
+                <w:color w:val="1F2A3C"/>
+                <w:sz w:val="16"/>
+                <w:szCs w:val="16"/>
+              </w:rPr>
+              <w:t xml:space="preserve">{{bolsa.contexto.movimientos_fuertes[].condicion}}</w:t>
+            </w:r>
+          </w:p>
+        </w:tc>
+      </w:tr>
+    </w:tbl>
+    <w:p>
+      <w:pPr>
+        <w:spacing w:after="160" w:before="0"/>
+      </w:pPr>
+    </w:p>
+    <w:tbl>
+      <w:tblPr>
+        <w:tblW w:type="dxa" w:w="9638"/>
+        <w:tblBorders>
+          <w:top w:val="single" w:color="auto" w:sz="4"/>
+          <w:left w:val="single" w:color="auto" w:sz="4"/>
+          <w:bottom w:val="single" w:color="auto" w:sz="4"/>
+          <w:right w:val="single" w:color="auto" w:sz="4"/>
+          <w:insideH w:val="single" w:color="auto" w:sz="4"/>
+          <w:insideV w:val="single" w:color="auto" w:sz="4"/>
+        </w:tblBorders>
+      </w:tblPr>
+      <w:tblGrid>
+        <w:gridCol w:w="1098"/>
+        <w:gridCol w:w="1585"/>
+        <w:gridCol w:w="3904"/>
+        <w:gridCol w:w="1220"/>
+        <w:gridCol w:w="1831"/>
+      </w:tblGrid>
+      <w:tr>
+        <w:trPr>
+          <w:cantSplit/>
+          <w:tblHeader/>
+        </w:trPr>
+        <w:tc>
+          <w:tcPr>
+            <w:tcW w:type="dxa" w:w="1098"/>
+            <w:tcBorders>
+              <w:top w:val="none" w:color="FFFFFF" w:sz="0"/>
+              <w:left w:val="none" w:color="FFFFFF" w:sz="0"/>
+              <w:bottom w:val="none" w:color="FFFFFF" w:sz="0"/>
+              <w:right w:val="none" w:color="FFFFFF" w:sz="0"/>
+            </w:tcBorders>
+            <w:shd w:fill="1F3A5F" w:color="auto" w:val="clear"/>
+            <w:tcMar>
+              <w:top w:type="dxa" w:w="50"/>
+              <w:left w:type="dxa" w:w="80"/>
+              <w:bottom w:type="dxa" w:w="50"/>
+              <w:right w:type="dxa" w:w="80"/>
+            </w:tcMar>
+          </w:tcPr>
+          <w:p>
+            <w:pPr>
+              <w:spacing w:after="0" w:before="0"/>
+              <w:jc w:val="left"/>
+            </w:pPr>
+            <w:r>
+              <w:rPr>
+                <w:rFonts w:ascii="Calibri" w:cs="Calibri" w:eastAsia="Calibri" w:hAnsi="Calibri"/>
+                <w:b/>
+                <w:bCs/>
+                <w:color w:val="FFFFFF"/>
+                <w:sz w:val="16"/>
+                <w:szCs w:val="16"/>
+              </w:rPr>
+              <w:t xml:space="preserve">Fecha</w:t>
+            </w:r>
+          </w:p>
+        </w:tc>
+        <w:tc>
+          <w:tcPr>
+            <w:tcW w:type="dxa" w:w="1585"/>
+            <w:tcBorders>
+              <w:top w:val="none" w:color="FFFFFF" w:sz="0"/>
+              <w:left w:val="none" w:color="FFFFFF" w:sz="0"/>
+              <w:bottom w:val="none" w:color="FFFFFF" w:sz="0"/>
+              <w:right w:val="none" w:color="FFFFFF" w:sz="0"/>
+            </w:tcBorders>
+            <w:shd w:fill="1F3A5F" w:color="auto" w:val="clear"/>
+            <w:tcMar>
+              <w:top w:type="dxa" w:w="50"/>
+              <w:left w:type="dxa" w:w="80"/>
+              <w:bottom w:type="dxa" w:w="50"/>
+              <w:right w:type="dxa" w:w="80"/>
+            </w:tcMar>
+          </w:tcPr>
+          <w:p>
+            <w:pPr>
+              <w:spacing w:after="0" w:before="0"/>
+              <w:jc w:val="left"/>
+            </w:pPr>
+            <w:r>
+              <w:rPr>
+                <w:rFonts w:ascii="Calibri" w:cs="Calibri" w:eastAsia="Calibri" w:hAnsi="Calibri"/>
+                <w:b/>
+                <w:bCs/>
+                <w:color w:val="FFFFFF"/>
+                <w:sz w:val="16"/>
+                <w:szCs w:val="16"/>
+              </w:rPr>
+              <w:t xml:space="preserve">Tipo</w:t>
+            </w:r>
+          </w:p>
+        </w:tc>
+        <w:tc>
+          <w:tcPr>
+            <w:tcW w:type="dxa" w:w="3904"/>
+            <w:tcBorders>
+              <w:top w:val="none" w:color="FFFFFF" w:sz="0"/>
+              <w:left w:val="none" w:color="FFFFFF" w:sz="0"/>
+              <w:bottom w:val="none" w:color="FFFFFF" w:sz="0"/>
+              <w:right w:val="none" w:color="FFFFFF" w:sz="0"/>
+            </w:tcBorders>
+            <w:shd w:fill="1F3A5F" w:color="auto" w:val="clear"/>
+            <w:tcMar>
+              <w:top w:type="dxa" w:w="50"/>
+              <w:left w:type="dxa" w:w="80"/>
+              <w:bottom w:type="dxa" w:w="50"/>
+              <w:right w:type="dxa" w:w="80"/>
+            </w:tcMar>
+          </w:tcPr>
+          <w:p>
+            <w:pPr>
+              <w:spacing w:after="0" w:before="0"/>
+              <w:jc w:val="left"/>
+            </w:pPr>
+            <w:r>
+              <w:rPr>
+                <w:rFonts w:ascii="Calibri" w:cs="Calibri" w:eastAsia="Calibri" w:hAnsi="Calibri"/>
+                <w:b/>
+                <w:bCs/>
+                <w:color w:val="FFFFFF"/>
+                <w:sz w:val="16"/>
+                <w:szCs w:val="16"/>
+              </w:rPr>
+              <w:t xml:space="preserve">Hecho</w:t>
+            </w:r>
+          </w:p>
+        </w:tc>
+        <w:tc>
+          <w:tcPr>
+            <w:tcW w:type="dxa" w:w="1220"/>
+            <w:tcBorders>
+              <w:top w:val="none" w:color="FFFFFF" w:sz="0"/>
+              <w:left w:val="none" w:color="FFFFFF" w:sz="0"/>
+              <w:bottom w:val="none" w:color="FFFFFF" w:sz="0"/>
+              <w:right w:val="none" w:color="FFFFFF" w:sz="0"/>
+            </w:tcBorders>
+            <w:shd w:fill="1F3A5F" w:color="auto" w:val="clear"/>
+            <w:tcMar>
+              <w:top w:type="dxa" w:w="50"/>
+              <w:left w:type="dxa" w:w="80"/>
+              <w:bottom w:type="dxa" w:w="50"/>
+              <w:right w:type="dxa" w:w="80"/>
+            </w:tcMar>
+          </w:tcPr>
+          <w:p>
+            <w:pPr>
+              <w:spacing w:after="0" w:before="0"/>
+              <w:jc w:val="left"/>
+            </w:pPr>
+            <w:r>
+              <w:rPr>
+                <w:rFonts w:ascii="Calibri" w:cs="Calibri" w:eastAsia="Calibri" w:hAnsi="Calibri"/>
+                <w:b/>
+                <w:bCs/>
+                <w:color w:val="FFFFFF"/>
+                <w:sz w:val="16"/>
+                <w:szCs w:val="16"/>
+              </w:rPr>
+              <w:t xml:space="preserve">Veredicto</w:t>
+            </w:r>
+          </w:p>
+        </w:tc>
+        <w:tc>
+          <w:tcPr>
+            <w:tcW w:type="dxa" w:w="1831"/>
+            <w:tcBorders>
+              <w:top w:val="none" w:color="FFFFFF" w:sz="0"/>
+              <w:left w:val="none" w:color="FFFFFF" w:sz="0"/>
+              <w:bottom w:val="none" w:color="FFFFFF" w:sz="0"/>
+              <w:right w:val="none" w:color="FFFFFF" w:sz="0"/>
+            </w:tcBorders>
+            <w:shd w:fill="1F3A5F" w:color="auto" w:val="clear"/>
+            <w:tcMar>
+              <w:top w:type="dxa" w:w="50"/>
+              <w:left w:type="dxa" w:w="80"/>
+              <w:bottom w:type="dxa" w:w="50"/>
+              <w:right w:type="dxa" w:w="80"/>
+            </w:tcMar>
+          </w:tcPr>
+          <w:p>
+            <w:pPr>
+              <w:spacing w:after="0" w:before="0"/>
+              <w:jc w:val="left"/>
+            </w:pPr>
+            <w:r>
+              <w:rPr>
+                <w:rFonts w:ascii="Calibri" w:cs="Calibri" w:eastAsia="Calibri" w:hAnsi="Calibri"/>
+                <w:b/>
+                <w:bCs/>
+                <w:color w:val="FFFFFF"/>
+                <w:sz w:val="16"/>
+                <w:szCs w:val="16"/>
+              </w:rPr>
+              <w:t xml:space="preserve">Condición</w:t>
+            </w:r>
+          </w:p>
+        </w:tc>
+      </w:tr>
+      <w:tr>
+        <w:trPr>
+          <w:cantSplit/>
+        </w:trPr>
+        <w:tc>
+          <w:tcPr>
+            <w:tcW w:type="dxa" w:w="1098"/>
+            <w:tcBorders>
+              <w:top w:val="none" w:color="FFFFFF" w:sz="0"/>
+              <w:left w:val="none" w:color="FFFFFF" w:sz="0"/>
+              <w:bottom w:val="single" w:color="D9D8D3" w:sz="4"/>
+              <w:right w:val="none" w:color="FFFFFF" w:sz="0"/>
+            </w:tcBorders>
+            <w:tcMar>
+              <w:top w:type="dxa" w:w="50"/>
+              <w:left w:type="dxa" w:w="80"/>
+              <w:bottom w:type="dxa" w:w="50"/>
+              <w:right w:type="dxa" w:w="80"/>
+            </w:tcMar>
+          </w:tcPr>
+          <w:p>
+            <w:pPr>
+              <w:spacing w:after="0" w:before="0"/>
+              <w:jc w:val="left"/>
+            </w:pPr>
+            <w:r>
+              <w:rPr>
+                <w:rFonts w:ascii="Calibri" w:cs="Calibri" w:eastAsia="Calibri" w:hAnsi="Calibri"/>
+                <w:b/>
+                <w:bCs/>
+                <w:color w:val="1F2A3C"/>
+                <w:sz w:val="16"/>
+                <w:szCs w:val="16"/>
+              </w:rPr>
+              <w:t xml:space="preserve">{{bolsa.contexto.noticias[].fecha}}</w:t>
+            </w:r>
+          </w:p>
+        </w:tc>
+        <w:tc>
+          <w:tcPr>
+            <w:tcW w:type="dxa" w:w="1585"/>
+            <w:tcBorders>
+              <w:top w:val="none" w:color="FFFFFF" w:sz="0"/>
+              <w:left w:val="none" w:color="FFFFFF" w:sz="0"/>
+              <w:bottom w:val="single" w:color="D9D8D3" w:sz="4"/>
+              <w:right w:val="none" w:color="FFFFFF" w:sz="0"/>
+            </w:tcBorders>
+            <w:tcMar>
+              <w:top w:type="dxa" w:w="50"/>
+              <w:left w:type="dxa" w:w="80"/>
+              <w:bottom w:type="dxa" w:w="50"/>
+              <w:right w:type="dxa" w:w="80"/>
+            </w:tcMar>
+          </w:tcPr>
+          <w:p>
+            <w:pPr>
+              <w:spacing w:after="0" w:before="0"/>
+              <w:jc w:val="left"/>
+            </w:pPr>
+            <w:r>
+              <w:rPr>
+                <w:rFonts w:ascii="Calibri" w:cs="Calibri" w:eastAsia="Calibri" w:hAnsi="Calibri"/>
+                <w:b w:val="false"/>
+                <w:bCs w:val="false"/>
+                <w:color w:val="1F2A3C"/>
+                <w:sz w:val="16"/>
+                <w:szCs w:val="16"/>
+              </w:rPr>
+              <w:t xml:space="preserve">{{bolsa.contexto.noticias[].tipo}}</w:t>
+            </w:r>
+          </w:p>
+        </w:tc>
+        <w:tc>
+          <w:tcPr>
+            <w:tcW w:type="dxa" w:w="3904"/>
+            <w:tcBorders>
+              <w:top w:val="none" w:color="FFFFFF" w:sz="0"/>
+              <w:left w:val="none" w:color="FFFFFF" w:sz="0"/>
+              <w:bottom w:val="single" w:color="D9D8D3" w:sz="4"/>
+              <w:right w:val="none" w:color="FFFFFF" w:sz="0"/>
+            </w:tcBorders>
+            <w:tcMar>
+              <w:top w:type="dxa" w:w="50"/>
+              <w:left w:type="dxa" w:w="80"/>
+              <w:bottom w:type="dxa" w:w="50"/>
+              <w:right w:type="dxa" w:w="80"/>
+            </w:tcMar>
+          </w:tcPr>
+          <w:p>
+            <w:pPr>
+              <w:spacing w:after="0" w:before="0"/>
+              <w:jc w:val="left"/>
+            </w:pPr>
+            <w:r>
+              <w:rPr>
+                <w:rFonts w:ascii="Calibri" w:cs="Calibri" w:eastAsia="Calibri" w:hAnsi="Calibri"/>
+                <w:b w:val="false"/>
+                <w:bCs w:val="false"/>
+                <w:color w:val="1F2A3C"/>
+                <w:sz w:val="16"/>
+                <w:szCs w:val="16"/>
+              </w:rPr>
+              <w:t xml:space="preserve">{{bolsa.contexto.noticias[].hecho}}</w:t>
+            </w:r>
+          </w:p>
+        </w:tc>
+        <w:tc>
+          <w:tcPr>
+            <w:tcW w:type="dxa" w:w="1220"/>
+            <w:tcBorders>
+              <w:top w:val="none" w:color="FFFFFF" w:sz="0"/>
+              <w:left w:val="none" w:color="FFFFFF" w:sz="0"/>
+              <w:bottom w:val="single" w:color="D9D8D3" w:sz="4"/>
+              <w:right w:val="none" w:color="FFFFFF" w:sz="0"/>
+            </w:tcBorders>
+            <w:tcMar>
+              <w:top w:type="dxa" w:w="50"/>
+              <w:left w:type="dxa" w:w="80"/>
+              <w:bottom w:type="dxa" w:w="50"/>
+              <w:right w:type="dxa" w:w="80"/>
+            </w:tcMar>
+          </w:tcPr>
+          <w:p>
+            <w:pPr>
+              <w:spacing w:after="0" w:before="0"/>
+              <w:jc w:val="left"/>
+            </w:pPr>
+            <w:r>
+              <w:rPr>
+                <w:rFonts w:ascii="Calibri" w:cs="Calibri" w:eastAsia="Calibri" w:hAnsi="Calibri"/>
+                <w:b w:val="false"/>
+                <w:bCs w:val="false"/>
+                <w:color w:val="1F2A3C"/>
+                <w:sz w:val="16"/>
+                <w:szCs w:val="16"/>
+              </w:rPr>
+              <w:t xml:space="preserve">{{bolsa.contexto.noticias[].veredicto}}</w:t>
+            </w:r>
+          </w:p>
+        </w:tc>
+        <w:tc>
+          <w:tcPr>
+            <w:tcW w:type="dxa" w:w="1831"/>
+            <w:tcBorders>
+              <w:top w:val="none" w:color="FFFFFF" w:sz="0"/>
+              <w:left w:val="none" w:color="FFFFFF" w:sz="0"/>
+              <w:bottom w:val="single" w:color="D9D8D3" w:sz="4"/>
+              <w:right w:val="none" w:color="FFFFFF" w:sz="0"/>
+            </w:tcBorders>
+            <w:tcMar>
+              <w:top w:type="dxa" w:w="50"/>
+              <w:left w:type="dxa" w:w="80"/>
+              <w:bottom w:type="dxa" w:w="50"/>
+              <w:right w:type="dxa" w:w="80"/>
+            </w:tcMar>
+          </w:tcPr>
+          <w:p>
+            <w:pPr>
+              <w:spacing w:after="0" w:before="0"/>
+              <w:jc w:val="left"/>
+            </w:pPr>
+            <w:r>
+              <w:rPr>
+                <w:rFonts w:ascii="Calibri" w:cs="Calibri" w:eastAsia="Calibri" w:hAnsi="Calibri"/>
+                <w:b w:val="false"/>
+                <w:bCs w:val="false"/>
+                <w:color w:val="1F2A3C"/>
+                <w:sz w:val="16"/>
+                <w:szCs w:val="16"/>
+              </w:rPr>
+              <w:t xml:space="preserve">{{bolsa.contexto.noticias[].condicion}}</w:t>
+            </w:r>
+          </w:p>
+        </w:tc>
+      </w:tr>
+    </w:tbl>
+    <w:p>
+      <w:pPr>
+        <w:spacing w:after="160" w:before="0"/>
+      </w:pPr>
+    </w:p>
+    <w:p>
+      <w:pPr>
+        <w:spacing w:after="100"/>
+      </w:pPr>
+      <w:r>
+        <w:t xml:space="preserve">{{texto:bolsa.contexto.comentario}}</w:t>
+      </w:r>
+    </w:p>
+    <w:p>
+      <w:pPr>
+        <w:spacing w:after="0" w:before="0"/>
+      </w:pPr>
+      <w:r>
+        <w:rPr>
+          <w:color w:val="8A8984"/>
+          <w:sz w:val="2"/>
+          <w:szCs w:val="2"/>
+        </w:rPr>
+        <w:t xml:space="preserve">{{fin:bolsa.contexto}}</w:t>
       </w:r>
     </w:p>
     <w:p>

</xml_diff>